<commit_message>
Launch TUVEES BuyHub Storefront
</commit_message>
<xml_diff>
--- a/TUVEES BuyHub Project.docx
+++ b/TUVEES BuyHub Project.docx
@@ -30223,13 +30223,3393 @@
         <w:br/>
       </w:r>
     </w:p>
+    <w:p>
+      <w:pPr>
+        <w:spacing w:line="240" w:lineRule="auto"/>
+        <w:rPr>
+          <w:rFonts w:ascii="Times New Roman" w:eastAsia="Times New Roman" w:hAnsi="Times New Roman" w:cs="Times New Roman"/>
+          <w:sz w:val="24"/>
+          <w:szCs w:val="24"/>
+        </w:rPr>
+      </w:pPr>
+      <w:r>
+        <w:rPr>
+          <w:rFonts w:ascii="Times New Roman" w:eastAsia="Times New Roman" w:hAnsi="Times New Roman" w:cs="Times New Roman"/>
+          <w:sz w:val="24"/>
+          <w:szCs w:val="24"/>
+        </w:rPr>
+        <w:t xml:space="preserve">To make your Progressive Web App installable on </w:t>
+      </w:r>
+      <w:proofErr w:type="spellStart"/>
+      <w:r>
+        <w:rPr>
+          <w:rFonts w:ascii="Times New Roman" w:eastAsia="Times New Roman" w:hAnsi="Times New Roman" w:cs="Times New Roman"/>
+          <w:sz w:val="24"/>
+          <w:szCs w:val="24"/>
+        </w:rPr>
+        <w:t>GitHub</w:t>
+      </w:r>
+      <w:proofErr w:type="spellEnd"/>
+      <w:r>
+        <w:rPr>
+          <w:rFonts w:ascii="Times New Roman" w:eastAsia="Times New Roman" w:hAnsi="Times New Roman" w:cs="Times New Roman"/>
+          <w:sz w:val="24"/>
+          <w:szCs w:val="24"/>
+        </w:rPr>
+        <w:t xml:space="preserve"> Pages' sub-folder path (</w:t>
+      </w:r>
+      <w:r>
+        <w:rPr>
+          <w:rFonts w:ascii="Courier New" w:eastAsia="Times New Roman" w:hAnsi="Courier New" w:cs="Courier New"/>
+          <w:sz w:val="20"/>
+          <w:szCs w:val="20"/>
+          <w:bdr w:val="single" w:sz="6" w:space="2" w:color="F4F6F7" w:frame="1"/>
+          <w:shd w:val="clear" w:color="auto" w:fill="F4F6F7"/>
+        </w:rPr>
+        <w:t>/</w:t>
+      </w:r>
+      <w:proofErr w:type="spellStart"/>
+      <w:r>
+        <w:rPr>
+          <w:rFonts w:ascii="Courier New" w:eastAsia="Times New Roman" w:hAnsi="Courier New" w:cs="Courier New"/>
+          <w:sz w:val="20"/>
+          <w:szCs w:val="20"/>
+          <w:bdr w:val="single" w:sz="6" w:space="2" w:color="F4F6F7" w:frame="1"/>
+          <w:shd w:val="clear" w:color="auto" w:fill="F4F6F7"/>
+        </w:rPr>
+        <w:t>tuvees-buyhub</w:t>
+      </w:r>
+      <w:proofErr w:type="spellEnd"/>
+      <w:r>
+        <w:rPr>
+          <w:rFonts w:ascii="Courier New" w:eastAsia="Times New Roman" w:hAnsi="Courier New" w:cs="Courier New"/>
+          <w:sz w:val="20"/>
+          <w:szCs w:val="20"/>
+          <w:bdr w:val="single" w:sz="6" w:space="2" w:color="F4F6F7" w:frame="1"/>
+          <w:shd w:val="clear" w:color="auto" w:fill="F4F6F7"/>
+        </w:rPr>
+        <w:t>/</w:t>
+      </w:r>
+      <w:r>
+        <w:rPr>
+          <w:rFonts w:ascii="Times New Roman" w:eastAsia="Times New Roman" w:hAnsi="Times New Roman" w:cs="Times New Roman"/>
+          <w:sz w:val="24"/>
+          <w:szCs w:val="24"/>
+        </w:rPr>
+        <w:t xml:space="preserve">), we need to update your </w:t>
+      </w:r>
+      <w:r>
+        <w:rPr>
+          <w:rFonts w:ascii="Courier New" w:eastAsia="Times New Roman" w:hAnsi="Courier New" w:cs="Courier New"/>
+          <w:b/>
+          <w:bCs/>
+          <w:sz w:val="20"/>
+          <w:szCs w:val="20"/>
+          <w:bdr w:val="single" w:sz="6" w:space="2" w:color="F4F6F7" w:frame="1"/>
+          <w:shd w:val="clear" w:color="auto" w:fill="F4F6F7"/>
+        </w:rPr>
+        <w:t>sw.js</w:t>
+      </w:r>
+      <w:r>
+        <w:rPr>
+          <w:rFonts w:ascii="Times New Roman" w:eastAsia="Times New Roman" w:hAnsi="Times New Roman" w:cs="Times New Roman"/>
+          <w:sz w:val="24"/>
+          <w:szCs w:val="24"/>
+        </w:rPr>
+        <w:t xml:space="preserve"> file.</w:t>
+      </w:r>
+    </w:p>
+    <w:p>
+      <w:pPr>
+        <w:spacing w:line="240" w:lineRule="auto"/>
+        <w:rPr>
+          <w:rFonts w:ascii="Times New Roman" w:eastAsia="Times New Roman" w:hAnsi="Times New Roman" w:cs="Times New Roman"/>
+          <w:sz w:val="24"/>
+          <w:szCs w:val="24"/>
+        </w:rPr>
+      </w:pPr>
+      <w:r>
+        <w:rPr>
+          <w:rFonts w:ascii="Times New Roman" w:eastAsia="Times New Roman" w:hAnsi="Times New Roman" w:cs="Times New Roman"/>
+          <w:sz w:val="24"/>
+          <w:szCs w:val="24"/>
+        </w:rPr>
+        <w:t>Right now, your service worker is looking for assets at the root domain (</w:t>
+      </w:r>
+      <w:r>
+        <w:rPr>
+          <w:rFonts w:ascii="Courier New" w:eastAsia="Times New Roman" w:hAnsi="Courier New" w:cs="Courier New"/>
+          <w:sz w:val="20"/>
+          <w:szCs w:val="20"/>
+          <w:bdr w:val="single" w:sz="6" w:space="2" w:color="F4F6F7" w:frame="1"/>
+          <w:shd w:val="clear" w:color="auto" w:fill="F4F6F7"/>
+        </w:rPr>
+        <w:t>/index.html</w:t>
+      </w:r>
+      <w:r>
+        <w:rPr>
+          <w:rFonts w:ascii="Times New Roman" w:eastAsia="Times New Roman" w:hAnsi="Times New Roman" w:cs="Times New Roman"/>
+          <w:sz w:val="24"/>
+          <w:szCs w:val="24"/>
+        </w:rPr>
+        <w:t xml:space="preserve">), which works on your local machine but causes a loading/caching failure on </w:t>
+      </w:r>
+      <w:proofErr w:type="spellStart"/>
+      <w:r>
+        <w:rPr>
+          <w:rFonts w:ascii="Times New Roman" w:eastAsia="Times New Roman" w:hAnsi="Times New Roman" w:cs="Times New Roman"/>
+          <w:sz w:val="24"/>
+          <w:szCs w:val="24"/>
+        </w:rPr>
+        <w:t>GitHub</w:t>
+      </w:r>
+      <w:proofErr w:type="spellEnd"/>
+      <w:r>
+        <w:rPr>
+          <w:rFonts w:ascii="Times New Roman" w:eastAsia="Times New Roman" w:hAnsi="Times New Roman" w:cs="Times New Roman"/>
+          <w:sz w:val="24"/>
+          <w:szCs w:val="24"/>
+        </w:rPr>
+        <w:t xml:space="preserve"> Pages [</w:t>
+      </w:r>
+      <w:proofErr w:type="spellStart"/>
+      <w:r>
+        <w:rPr>
+          <w:rFonts w:ascii="Times New Roman" w:eastAsia="Times New Roman" w:hAnsi="Times New Roman" w:cs="Times New Roman"/>
+          <w:sz w:val="24"/>
+          <w:szCs w:val="24"/>
+        </w:rPr>
+        <w:t>GitHub</w:t>
+      </w:r>
+      <w:proofErr w:type="spellEnd"/>
+      <w:r>
+        <w:rPr>
+          <w:rFonts w:ascii="Times New Roman" w:eastAsia="Times New Roman" w:hAnsi="Times New Roman" w:cs="Times New Roman"/>
+          <w:sz w:val="24"/>
+          <w:szCs w:val="24"/>
+        </w:rPr>
+        <w:t>, 2026]. Adding the sub-folder prefix fixes this instantly.</w:t>
+      </w:r>
+    </w:p>
+    <w:p>
+      <w:pPr>
+        <w:spacing w:after="0" w:line="240" w:lineRule="auto"/>
+        <w:rPr>
+          <w:rFonts w:ascii="Times New Roman" w:eastAsia="Times New Roman" w:hAnsi="Times New Roman" w:cs="Times New Roman"/>
+          <w:sz w:val="24"/>
+          <w:szCs w:val="24"/>
+        </w:rPr>
+      </w:pPr>
+      <w:r>
+        <w:rPr>
+          <w:rFonts w:ascii="Times New Roman" w:eastAsia="Times New Roman" w:hAnsi="Times New Roman" w:cs="Times New Roman"/>
+          <w:sz w:val="24"/>
+          <w:szCs w:val="24"/>
+        </w:rPr>
+        <w:pict>
+          <v:rect id="_x0000_i1041" style="width:0;height:.75pt" o:hralign="center" o:hrstd="t" o:hr="t" fillcolor="#a0a0a0" stroked="f"/>
+        </w:pict>
+      </w:r>
+    </w:p>
+    <w:p>
+      <w:pPr>
+        <w:spacing w:line="240" w:lineRule="auto"/>
+        <w:rPr>
+          <w:rFonts w:ascii="Times New Roman" w:eastAsia="Times New Roman" w:hAnsi="Times New Roman" w:cs="Times New Roman"/>
+          <w:sz w:val="24"/>
+          <w:szCs w:val="24"/>
+        </w:rPr>
+      </w:pPr>
+      <w:r>
+        <w:rPr>
+          <w:rFonts w:ascii="Times New Roman" w:eastAsia="Times New Roman" w:hAnsi="Times New Roman" w:cs="Times New Roman"/>
+          <w:sz w:val="24"/>
+          <w:szCs w:val="24"/>
+        </w:rPr>
+        <w:t xml:space="preserve">Open your </w:t>
+      </w:r>
+      <w:r>
+        <w:rPr>
+          <w:rFonts w:ascii="Courier New" w:eastAsia="Times New Roman" w:hAnsi="Courier New" w:cs="Courier New"/>
+          <w:sz w:val="20"/>
+          <w:szCs w:val="20"/>
+          <w:bdr w:val="single" w:sz="6" w:space="2" w:color="F4F6F7" w:frame="1"/>
+          <w:shd w:val="clear" w:color="auto" w:fill="F4F6F7"/>
+        </w:rPr>
+        <w:t>sw.js</w:t>
+      </w:r>
+      <w:r>
+        <w:rPr>
+          <w:rFonts w:ascii="Times New Roman" w:eastAsia="Times New Roman" w:hAnsi="Times New Roman" w:cs="Times New Roman"/>
+          <w:sz w:val="24"/>
+          <w:szCs w:val="24"/>
+        </w:rPr>
+        <w:t xml:space="preserve"> file in VS Code and replace its entire contents with this updated code block:</w:t>
+      </w:r>
+    </w:p>
+    <w:p>
+      <w:pPr>
+        <w:shd w:val="clear" w:color="auto" w:fill="F4F6F7"/>
+        <w:tabs>
+          <w:tab w:val="left" w:pos="916"/>
+          <w:tab w:val="left" w:pos="1832"/>
+          <w:tab w:val="left" w:pos="2748"/>
+          <w:tab w:val="left" w:pos="3664"/>
+          <w:tab w:val="left" w:pos="4580"/>
+          <w:tab w:val="left" w:pos="5496"/>
+          <w:tab w:val="left" w:pos="6412"/>
+          <w:tab w:val="left" w:pos="7328"/>
+          <w:tab w:val="left" w:pos="8244"/>
+          <w:tab w:val="left" w:pos="9160"/>
+          <w:tab w:val="left" w:pos="10076"/>
+          <w:tab w:val="left" w:pos="10992"/>
+          <w:tab w:val="left" w:pos="11908"/>
+          <w:tab w:val="left" w:pos="12824"/>
+          <w:tab w:val="left" w:pos="13740"/>
+          <w:tab w:val="left" w:pos="14656"/>
+        </w:tabs>
+        <w:spacing w:after="0" w:line="240" w:lineRule="auto"/>
+        <w:rPr>
+          <w:rFonts w:ascii="Courier New" w:eastAsia="Times New Roman" w:hAnsi="Courier New" w:cs="Courier New"/>
+          <w:i/>
+          <w:iCs/>
+          <w:color w:val="80868B"/>
+          <w:sz w:val="20"/>
+          <w:szCs w:val="20"/>
+        </w:rPr>
+      </w:pPr>
+      <w:r>
+        <w:rPr>
+          <w:rFonts w:ascii="Courier New" w:eastAsia="Times New Roman" w:hAnsi="Courier New" w:cs="Courier New"/>
+          <w:i/>
+          <w:iCs/>
+          <w:color w:val="80868B"/>
+          <w:sz w:val="20"/>
+          <w:szCs w:val="20"/>
+        </w:rPr>
+        <w:t>/* ====================================================</w:t>
+      </w:r>
+    </w:p>
+    <w:p>
+      <w:pPr>
+        <w:shd w:val="clear" w:color="auto" w:fill="F4F6F7"/>
+        <w:tabs>
+          <w:tab w:val="left" w:pos="916"/>
+          <w:tab w:val="left" w:pos="1832"/>
+          <w:tab w:val="left" w:pos="2748"/>
+          <w:tab w:val="left" w:pos="3664"/>
+          <w:tab w:val="left" w:pos="4580"/>
+          <w:tab w:val="left" w:pos="5496"/>
+          <w:tab w:val="left" w:pos="6412"/>
+          <w:tab w:val="left" w:pos="7328"/>
+          <w:tab w:val="left" w:pos="8244"/>
+          <w:tab w:val="left" w:pos="9160"/>
+          <w:tab w:val="left" w:pos="10076"/>
+          <w:tab w:val="left" w:pos="10992"/>
+          <w:tab w:val="left" w:pos="11908"/>
+          <w:tab w:val="left" w:pos="12824"/>
+          <w:tab w:val="left" w:pos="13740"/>
+          <w:tab w:val="left" w:pos="14656"/>
+        </w:tabs>
+        <w:spacing w:after="0" w:line="240" w:lineRule="auto"/>
+        <w:rPr>
+          <w:rFonts w:ascii="Courier New" w:eastAsia="Times New Roman" w:hAnsi="Courier New" w:cs="Courier New"/>
+          <w:i/>
+          <w:iCs/>
+          <w:color w:val="80868B"/>
+          <w:sz w:val="20"/>
+          <w:szCs w:val="20"/>
+        </w:rPr>
+      </w:pPr>
+      <w:r>
+        <w:rPr>
+          <w:rFonts w:ascii="Courier New" w:eastAsia="Times New Roman" w:hAnsi="Courier New" w:cs="Courier New"/>
+          <w:i/>
+          <w:iCs/>
+          <w:color w:val="80868B"/>
+          <w:sz w:val="20"/>
+          <w:szCs w:val="20"/>
+        </w:rPr>
+        <w:t xml:space="preserve">   TUVEES BUYHUB PRODUCTION SERVICE WORKER (</w:t>
+      </w:r>
+      <w:proofErr w:type="spellStart"/>
+      <w:r>
+        <w:rPr>
+          <w:rFonts w:ascii="Courier New" w:eastAsia="Times New Roman" w:hAnsi="Courier New" w:cs="Courier New"/>
+          <w:i/>
+          <w:iCs/>
+          <w:color w:val="80868B"/>
+          <w:sz w:val="20"/>
+          <w:szCs w:val="20"/>
+        </w:rPr>
+        <w:t>GitHub</w:t>
+      </w:r>
+      <w:proofErr w:type="spellEnd"/>
+      <w:r>
+        <w:rPr>
+          <w:rFonts w:ascii="Courier New" w:eastAsia="Times New Roman" w:hAnsi="Courier New" w:cs="Courier New"/>
+          <w:i/>
+          <w:iCs/>
+          <w:color w:val="80868B"/>
+          <w:sz w:val="20"/>
+          <w:szCs w:val="20"/>
+        </w:rPr>
+        <w:t xml:space="preserve"> Pages)</w:t>
+      </w:r>
+    </w:p>
+    <w:p>
+      <w:pPr>
+        <w:shd w:val="clear" w:color="auto" w:fill="F4F6F7"/>
+        <w:tabs>
+          <w:tab w:val="left" w:pos="916"/>
+          <w:tab w:val="left" w:pos="1832"/>
+          <w:tab w:val="left" w:pos="2748"/>
+          <w:tab w:val="left" w:pos="3664"/>
+          <w:tab w:val="left" w:pos="4580"/>
+          <w:tab w:val="left" w:pos="5496"/>
+          <w:tab w:val="left" w:pos="6412"/>
+          <w:tab w:val="left" w:pos="7328"/>
+          <w:tab w:val="left" w:pos="8244"/>
+          <w:tab w:val="left" w:pos="9160"/>
+          <w:tab w:val="left" w:pos="10076"/>
+          <w:tab w:val="left" w:pos="10992"/>
+          <w:tab w:val="left" w:pos="11908"/>
+          <w:tab w:val="left" w:pos="12824"/>
+          <w:tab w:val="left" w:pos="13740"/>
+          <w:tab w:val="left" w:pos="14656"/>
+        </w:tabs>
+        <w:spacing w:after="0" w:line="240" w:lineRule="auto"/>
+        <w:rPr>
+          <w:rFonts w:ascii="Courier New" w:eastAsia="Times New Roman" w:hAnsi="Courier New" w:cs="Courier New"/>
+          <w:sz w:val="20"/>
+          <w:szCs w:val="20"/>
+        </w:rPr>
+      </w:pPr>
+      <w:r>
+        <w:rPr>
+          <w:rFonts w:ascii="Courier New" w:eastAsia="Times New Roman" w:hAnsi="Courier New" w:cs="Courier New"/>
+          <w:i/>
+          <w:iCs/>
+          <w:color w:val="80868B"/>
+          <w:sz w:val="20"/>
+          <w:szCs w:val="20"/>
+        </w:rPr>
+        <w:t xml:space="preserve">   ==================================================== */</w:t>
+      </w:r>
+    </w:p>
+    <w:p>
+      <w:pPr>
+        <w:shd w:val="clear" w:color="auto" w:fill="F4F6F7"/>
+        <w:tabs>
+          <w:tab w:val="left" w:pos="916"/>
+          <w:tab w:val="left" w:pos="1832"/>
+          <w:tab w:val="left" w:pos="2748"/>
+          <w:tab w:val="left" w:pos="3664"/>
+          <w:tab w:val="left" w:pos="4580"/>
+          <w:tab w:val="left" w:pos="5496"/>
+          <w:tab w:val="left" w:pos="6412"/>
+          <w:tab w:val="left" w:pos="7328"/>
+          <w:tab w:val="left" w:pos="8244"/>
+          <w:tab w:val="left" w:pos="9160"/>
+          <w:tab w:val="left" w:pos="10076"/>
+          <w:tab w:val="left" w:pos="10992"/>
+          <w:tab w:val="left" w:pos="11908"/>
+          <w:tab w:val="left" w:pos="12824"/>
+          <w:tab w:val="left" w:pos="13740"/>
+          <w:tab w:val="left" w:pos="14656"/>
+        </w:tabs>
+        <w:spacing w:after="0" w:line="240" w:lineRule="auto"/>
+        <w:rPr>
+          <w:rFonts w:ascii="Courier New" w:eastAsia="Times New Roman" w:hAnsi="Courier New" w:cs="Courier New"/>
+          <w:sz w:val="20"/>
+          <w:szCs w:val="20"/>
+        </w:rPr>
+      </w:pPr>
+    </w:p>
+    <w:p>
+      <w:pPr>
+        <w:shd w:val="clear" w:color="auto" w:fill="F4F6F7"/>
+        <w:tabs>
+          <w:tab w:val="left" w:pos="916"/>
+          <w:tab w:val="left" w:pos="1832"/>
+          <w:tab w:val="left" w:pos="2748"/>
+          <w:tab w:val="left" w:pos="3664"/>
+          <w:tab w:val="left" w:pos="4580"/>
+          <w:tab w:val="left" w:pos="5496"/>
+          <w:tab w:val="left" w:pos="6412"/>
+          <w:tab w:val="left" w:pos="7328"/>
+          <w:tab w:val="left" w:pos="8244"/>
+          <w:tab w:val="left" w:pos="9160"/>
+          <w:tab w:val="left" w:pos="10076"/>
+          <w:tab w:val="left" w:pos="10992"/>
+          <w:tab w:val="left" w:pos="11908"/>
+          <w:tab w:val="left" w:pos="12824"/>
+          <w:tab w:val="left" w:pos="13740"/>
+          <w:tab w:val="left" w:pos="14656"/>
+        </w:tabs>
+        <w:spacing w:after="0" w:line="240" w:lineRule="auto"/>
+        <w:rPr>
+          <w:rFonts w:ascii="Courier New" w:eastAsia="Times New Roman" w:hAnsi="Courier New" w:cs="Courier New"/>
+          <w:sz w:val="20"/>
+          <w:szCs w:val="20"/>
+        </w:rPr>
+      </w:pPr>
+      <w:proofErr w:type="spellStart"/>
+      <w:proofErr w:type="gramStart"/>
+      <w:r>
+        <w:rPr>
+          <w:rFonts w:ascii="Courier New" w:eastAsia="Times New Roman" w:hAnsi="Courier New" w:cs="Courier New"/>
+          <w:color w:val="9334E6"/>
+          <w:sz w:val="20"/>
+          <w:szCs w:val="20"/>
+        </w:rPr>
+        <w:t>const</w:t>
+      </w:r>
+      <w:proofErr w:type="spellEnd"/>
+      <w:proofErr w:type="gramEnd"/>
+      <w:r>
+        <w:rPr>
+          <w:rFonts w:ascii="Courier New" w:eastAsia="Times New Roman" w:hAnsi="Courier New" w:cs="Courier New"/>
+          <w:sz w:val="20"/>
+          <w:szCs w:val="20"/>
+        </w:rPr>
+        <w:t xml:space="preserve"> </w:t>
+      </w:r>
+      <w:r>
+        <w:rPr>
+          <w:rFonts w:ascii="Courier New" w:eastAsia="Times New Roman" w:hAnsi="Courier New" w:cs="Courier New"/>
+          <w:color w:val="B45908"/>
+          <w:sz w:val="20"/>
+          <w:szCs w:val="20"/>
+        </w:rPr>
+        <w:t>CACHE_NAME</w:t>
+      </w:r>
+      <w:r>
+        <w:rPr>
+          <w:rFonts w:ascii="Courier New" w:eastAsia="Times New Roman" w:hAnsi="Courier New" w:cs="Courier New"/>
+          <w:sz w:val="20"/>
+          <w:szCs w:val="20"/>
+        </w:rPr>
+        <w:t xml:space="preserve"> = </w:t>
+      </w:r>
+      <w:r>
+        <w:rPr>
+          <w:rFonts w:ascii="Courier New" w:eastAsia="Times New Roman" w:hAnsi="Courier New" w:cs="Courier New"/>
+          <w:color w:val="188038"/>
+          <w:sz w:val="20"/>
+          <w:szCs w:val="20"/>
+        </w:rPr>
+        <w:t>'tuvees-v2'</w:t>
+      </w:r>
+      <w:r>
+        <w:rPr>
+          <w:rFonts w:ascii="Courier New" w:eastAsia="Times New Roman" w:hAnsi="Courier New" w:cs="Courier New"/>
+          <w:sz w:val="20"/>
+          <w:szCs w:val="20"/>
+        </w:rPr>
+        <w:t xml:space="preserve">; </w:t>
+      </w:r>
+      <w:r>
+        <w:rPr>
+          <w:rFonts w:ascii="Courier New" w:eastAsia="Times New Roman" w:hAnsi="Courier New" w:cs="Courier New"/>
+          <w:i/>
+          <w:iCs/>
+          <w:color w:val="80868B"/>
+          <w:sz w:val="20"/>
+          <w:szCs w:val="20"/>
+        </w:rPr>
+        <w:t>// Incremented version to clear old cache</w:t>
+      </w:r>
+    </w:p>
+    <w:p>
+      <w:pPr>
+        <w:shd w:val="clear" w:color="auto" w:fill="F4F6F7"/>
+        <w:tabs>
+          <w:tab w:val="left" w:pos="916"/>
+          <w:tab w:val="left" w:pos="1832"/>
+          <w:tab w:val="left" w:pos="2748"/>
+          <w:tab w:val="left" w:pos="3664"/>
+          <w:tab w:val="left" w:pos="4580"/>
+          <w:tab w:val="left" w:pos="5496"/>
+          <w:tab w:val="left" w:pos="6412"/>
+          <w:tab w:val="left" w:pos="7328"/>
+          <w:tab w:val="left" w:pos="8244"/>
+          <w:tab w:val="left" w:pos="9160"/>
+          <w:tab w:val="left" w:pos="10076"/>
+          <w:tab w:val="left" w:pos="10992"/>
+          <w:tab w:val="left" w:pos="11908"/>
+          <w:tab w:val="left" w:pos="12824"/>
+          <w:tab w:val="left" w:pos="13740"/>
+          <w:tab w:val="left" w:pos="14656"/>
+        </w:tabs>
+        <w:spacing w:after="0" w:line="240" w:lineRule="auto"/>
+        <w:rPr>
+          <w:rFonts w:ascii="Courier New" w:eastAsia="Times New Roman" w:hAnsi="Courier New" w:cs="Courier New"/>
+          <w:sz w:val="20"/>
+          <w:szCs w:val="20"/>
+        </w:rPr>
+      </w:pPr>
+    </w:p>
+    <w:p>
+      <w:pPr>
+        <w:shd w:val="clear" w:color="auto" w:fill="F4F6F7"/>
+        <w:tabs>
+          <w:tab w:val="left" w:pos="916"/>
+          <w:tab w:val="left" w:pos="1832"/>
+          <w:tab w:val="left" w:pos="2748"/>
+          <w:tab w:val="left" w:pos="3664"/>
+          <w:tab w:val="left" w:pos="4580"/>
+          <w:tab w:val="left" w:pos="5496"/>
+          <w:tab w:val="left" w:pos="6412"/>
+          <w:tab w:val="left" w:pos="7328"/>
+          <w:tab w:val="left" w:pos="8244"/>
+          <w:tab w:val="left" w:pos="9160"/>
+          <w:tab w:val="left" w:pos="10076"/>
+          <w:tab w:val="left" w:pos="10992"/>
+          <w:tab w:val="left" w:pos="11908"/>
+          <w:tab w:val="left" w:pos="12824"/>
+          <w:tab w:val="left" w:pos="13740"/>
+          <w:tab w:val="left" w:pos="14656"/>
+        </w:tabs>
+        <w:spacing w:after="0" w:line="240" w:lineRule="auto"/>
+        <w:rPr>
+          <w:rFonts w:ascii="Courier New" w:eastAsia="Times New Roman" w:hAnsi="Courier New" w:cs="Courier New"/>
+          <w:sz w:val="20"/>
+          <w:szCs w:val="20"/>
+        </w:rPr>
+      </w:pPr>
+      <w:r>
+        <w:rPr>
+          <w:rFonts w:ascii="Courier New" w:eastAsia="Times New Roman" w:hAnsi="Courier New" w:cs="Courier New"/>
+          <w:i/>
+          <w:iCs/>
+          <w:color w:val="80868B"/>
+          <w:sz w:val="20"/>
+          <w:szCs w:val="20"/>
+        </w:rPr>
+        <w:t>// Prefix assets with your repository sub-folder name</w:t>
+      </w:r>
+    </w:p>
+    <w:p>
+      <w:pPr>
+        <w:shd w:val="clear" w:color="auto" w:fill="F4F6F7"/>
+        <w:tabs>
+          <w:tab w:val="left" w:pos="916"/>
+          <w:tab w:val="left" w:pos="1832"/>
+          <w:tab w:val="left" w:pos="2748"/>
+          <w:tab w:val="left" w:pos="3664"/>
+          <w:tab w:val="left" w:pos="4580"/>
+          <w:tab w:val="left" w:pos="5496"/>
+          <w:tab w:val="left" w:pos="6412"/>
+          <w:tab w:val="left" w:pos="7328"/>
+          <w:tab w:val="left" w:pos="8244"/>
+          <w:tab w:val="left" w:pos="9160"/>
+          <w:tab w:val="left" w:pos="10076"/>
+          <w:tab w:val="left" w:pos="10992"/>
+          <w:tab w:val="left" w:pos="11908"/>
+          <w:tab w:val="left" w:pos="12824"/>
+          <w:tab w:val="left" w:pos="13740"/>
+          <w:tab w:val="left" w:pos="14656"/>
+        </w:tabs>
+        <w:spacing w:after="0" w:line="240" w:lineRule="auto"/>
+        <w:rPr>
+          <w:rFonts w:ascii="Courier New" w:eastAsia="Times New Roman" w:hAnsi="Courier New" w:cs="Courier New"/>
+          <w:sz w:val="20"/>
+          <w:szCs w:val="20"/>
+        </w:rPr>
+      </w:pPr>
+      <w:proofErr w:type="spellStart"/>
+      <w:proofErr w:type="gramStart"/>
+      <w:r>
+        <w:rPr>
+          <w:rFonts w:ascii="Courier New" w:eastAsia="Times New Roman" w:hAnsi="Courier New" w:cs="Courier New"/>
+          <w:color w:val="9334E6"/>
+          <w:sz w:val="20"/>
+          <w:szCs w:val="20"/>
+        </w:rPr>
+        <w:t>const</w:t>
+      </w:r>
+      <w:proofErr w:type="spellEnd"/>
+      <w:proofErr w:type="gramEnd"/>
+      <w:r>
+        <w:rPr>
+          <w:rFonts w:ascii="Courier New" w:eastAsia="Times New Roman" w:hAnsi="Courier New" w:cs="Courier New"/>
+          <w:sz w:val="20"/>
+          <w:szCs w:val="20"/>
+        </w:rPr>
+        <w:t xml:space="preserve"> </w:t>
+      </w:r>
+      <w:r>
+        <w:rPr>
+          <w:rFonts w:ascii="Courier New" w:eastAsia="Times New Roman" w:hAnsi="Courier New" w:cs="Courier New"/>
+          <w:color w:val="B45908"/>
+          <w:sz w:val="20"/>
+          <w:szCs w:val="20"/>
+        </w:rPr>
+        <w:t>ASSETS</w:t>
+      </w:r>
+      <w:r>
+        <w:rPr>
+          <w:rFonts w:ascii="Courier New" w:eastAsia="Times New Roman" w:hAnsi="Courier New" w:cs="Courier New"/>
+          <w:sz w:val="20"/>
+          <w:szCs w:val="20"/>
+        </w:rPr>
+        <w:t xml:space="preserve"> = [</w:t>
+      </w:r>
+    </w:p>
+    <w:p>
+      <w:pPr>
+        <w:shd w:val="clear" w:color="auto" w:fill="F4F6F7"/>
+        <w:tabs>
+          <w:tab w:val="left" w:pos="916"/>
+          <w:tab w:val="left" w:pos="1832"/>
+          <w:tab w:val="left" w:pos="2748"/>
+          <w:tab w:val="left" w:pos="3664"/>
+          <w:tab w:val="left" w:pos="4580"/>
+          <w:tab w:val="left" w:pos="5496"/>
+          <w:tab w:val="left" w:pos="6412"/>
+          <w:tab w:val="left" w:pos="7328"/>
+          <w:tab w:val="left" w:pos="8244"/>
+          <w:tab w:val="left" w:pos="9160"/>
+          <w:tab w:val="left" w:pos="10076"/>
+          <w:tab w:val="left" w:pos="10992"/>
+          <w:tab w:val="left" w:pos="11908"/>
+          <w:tab w:val="left" w:pos="12824"/>
+          <w:tab w:val="left" w:pos="13740"/>
+          <w:tab w:val="left" w:pos="14656"/>
+        </w:tabs>
+        <w:spacing w:after="0" w:line="240" w:lineRule="auto"/>
+        <w:rPr>
+          <w:rFonts w:ascii="Courier New" w:eastAsia="Times New Roman" w:hAnsi="Courier New" w:cs="Courier New"/>
+          <w:sz w:val="20"/>
+          <w:szCs w:val="20"/>
+        </w:rPr>
+      </w:pPr>
+      <w:r>
+        <w:rPr>
+          <w:rFonts w:ascii="Courier New" w:eastAsia="Times New Roman" w:hAnsi="Courier New" w:cs="Courier New"/>
+          <w:sz w:val="20"/>
+          <w:szCs w:val="20"/>
+        </w:rPr>
+        <w:t xml:space="preserve">  </w:t>
+      </w:r>
+      <w:r>
+        <w:rPr>
+          <w:rFonts w:ascii="Courier New" w:eastAsia="Times New Roman" w:hAnsi="Courier New" w:cs="Courier New"/>
+          <w:color w:val="188038"/>
+          <w:sz w:val="20"/>
+          <w:szCs w:val="20"/>
+        </w:rPr>
+        <w:t>'/</w:t>
+      </w:r>
+      <w:proofErr w:type="spellStart"/>
+      <w:r>
+        <w:rPr>
+          <w:rFonts w:ascii="Courier New" w:eastAsia="Times New Roman" w:hAnsi="Courier New" w:cs="Courier New"/>
+          <w:color w:val="188038"/>
+          <w:sz w:val="20"/>
+          <w:szCs w:val="20"/>
+        </w:rPr>
+        <w:t>tuvees-buyhub</w:t>
+      </w:r>
+      <w:proofErr w:type="spellEnd"/>
+      <w:r>
+        <w:rPr>
+          <w:rFonts w:ascii="Courier New" w:eastAsia="Times New Roman" w:hAnsi="Courier New" w:cs="Courier New"/>
+          <w:color w:val="188038"/>
+          <w:sz w:val="20"/>
+          <w:szCs w:val="20"/>
+        </w:rPr>
+        <w:t>/'</w:t>
+      </w:r>
+      <w:r>
+        <w:rPr>
+          <w:rFonts w:ascii="Courier New" w:eastAsia="Times New Roman" w:hAnsi="Courier New" w:cs="Courier New"/>
+          <w:sz w:val="20"/>
+          <w:szCs w:val="20"/>
+        </w:rPr>
+        <w:t>,</w:t>
+      </w:r>
+    </w:p>
+    <w:p>
+      <w:pPr>
+        <w:shd w:val="clear" w:color="auto" w:fill="F4F6F7"/>
+        <w:tabs>
+          <w:tab w:val="left" w:pos="916"/>
+          <w:tab w:val="left" w:pos="1832"/>
+          <w:tab w:val="left" w:pos="2748"/>
+          <w:tab w:val="left" w:pos="3664"/>
+          <w:tab w:val="left" w:pos="4580"/>
+          <w:tab w:val="left" w:pos="5496"/>
+          <w:tab w:val="left" w:pos="6412"/>
+          <w:tab w:val="left" w:pos="7328"/>
+          <w:tab w:val="left" w:pos="8244"/>
+          <w:tab w:val="left" w:pos="9160"/>
+          <w:tab w:val="left" w:pos="10076"/>
+          <w:tab w:val="left" w:pos="10992"/>
+          <w:tab w:val="left" w:pos="11908"/>
+          <w:tab w:val="left" w:pos="12824"/>
+          <w:tab w:val="left" w:pos="13740"/>
+          <w:tab w:val="left" w:pos="14656"/>
+        </w:tabs>
+        <w:spacing w:after="0" w:line="240" w:lineRule="auto"/>
+        <w:rPr>
+          <w:rFonts w:ascii="Courier New" w:eastAsia="Times New Roman" w:hAnsi="Courier New" w:cs="Courier New"/>
+          <w:sz w:val="20"/>
+          <w:szCs w:val="20"/>
+        </w:rPr>
+      </w:pPr>
+      <w:r>
+        <w:rPr>
+          <w:rFonts w:ascii="Courier New" w:eastAsia="Times New Roman" w:hAnsi="Courier New" w:cs="Courier New"/>
+          <w:sz w:val="20"/>
+          <w:szCs w:val="20"/>
+        </w:rPr>
+        <w:t xml:space="preserve">  </w:t>
+      </w:r>
+      <w:r>
+        <w:rPr>
+          <w:rFonts w:ascii="Courier New" w:eastAsia="Times New Roman" w:hAnsi="Courier New" w:cs="Courier New"/>
+          <w:color w:val="188038"/>
+          <w:sz w:val="20"/>
+          <w:szCs w:val="20"/>
+        </w:rPr>
+        <w:t>'/</w:t>
+      </w:r>
+      <w:proofErr w:type="spellStart"/>
+      <w:r>
+        <w:rPr>
+          <w:rFonts w:ascii="Courier New" w:eastAsia="Times New Roman" w:hAnsi="Courier New" w:cs="Courier New"/>
+          <w:color w:val="188038"/>
+          <w:sz w:val="20"/>
+          <w:szCs w:val="20"/>
+        </w:rPr>
+        <w:t>tuvees-buyhub</w:t>
+      </w:r>
+      <w:proofErr w:type="spellEnd"/>
+      <w:r>
+        <w:rPr>
+          <w:rFonts w:ascii="Courier New" w:eastAsia="Times New Roman" w:hAnsi="Courier New" w:cs="Courier New"/>
+          <w:color w:val="188038"/>
+          <w:sz w:val="20"/>
+          <w:szCs w:val="20"/>
+        </w:rPr>
+        <w:t>/index.html'</w:t>
+      </w:r>
+      <w:r>
+        <w:rPr>
+          <w:rFonts w:ascii="Courier New" w:eastAsia="Times New Roman" w:hAnsi="Courier New" w:cs="Courier New"/>
+          <w:sz w:val="20"/>
+          <w:szCs w:val="20"/>
+        </w:rPr>
+        <w:t>,</w:t>
+      </w:r>
+    </w:p>
+    <w:p>
+      <w:pPr>
+        <w:shd w:val="clear" w:color="auto" w:fill="F4F6F7"/>
+        <w:tabs>
+          <w:tab w:val="left" w:pos="916"/>
+          <w:tab w:val="left" w:pos="1832"/>
+          <w:tab w:val="left" w:pos="2748"/>
+          <w:tab w:val="left" w:pos="3664"/>
+          <w:tab w:val="left" w:pos="4580"/>
+          <w:tab w:val="left" w:pos="5496"/>
+          <w:tab w:val="left" w:pos="6412"/>
+          <w:tab w:val="left" w:pos="7328"/>
+          <w:tab w:val="left" w:pos="8244"/>
+          <w:tab w:val="left" w:pos="9160"/>
+          <w:tab w:val="left" w:pos="10076"/>
+          <w:tab w:val="left" w:pos="10992"/>
+          <w:tab w:val="left" w:pos="11908"/>
+          <w:tab w:val="left" w:pos="12824"/>
+          <w:tab w:val="left" w:pos="13740"/>
+          <w:tab w:val="left" w:pos="14656"/>
+        </w:tabs>
+        <w:spacing w:after="0" w:line="240" w:lineRule="auto"/>
+        <w:rPr>
+          <w:rFonts w:ascii="Courier New" w:eastAsia="Times New Roman" w:hAnsi="Courier New" w:cs="Courier New"/>
+          <w:sz w:val="20"/>
+          <w:szCs w:val="20"/>
+        </w:rPr>
+      </w:pPr>
+      <w:r>
+        <w:rPr>
+          <w:rFonts w:ascii="Courier New" w:eastAsia="Times New Roman" w:hAnsi="Courier New" w:cs="Courier New"/>
+          <w:sz w:val="20"/>
+          <w:szCs w:val="20"/>
+        </w:rPr>
+        <w:t xml:space="preserve">  </w:t>
+      </w:r>
+      <w:r>
+        <w:rPr>
+          <w:rFonts w:ascii="Courier New" w:eastAsia="Times New Roman" w:hAnsi="Courier New" w:cs="Courier New"/>
+          <w:color w:val="188038"/>
+          <w:sz w:val="20"/>
+          <w:szCs w:val="20"/>
+        </w:rPr>
+        <w:t>'/</w:t>
+      </w:r>
+      <w:proofErr w:type="spellStart"/>
+      <w:r>
+        <w:rPr>
+          <w:rFonts w:ascii="Courier New" w:eastAsia="Times New Roman" w:hAnsi="Courier New" w:cs="Courier New"/>
+          <w:color w:val="188038"/>
+          <w:sz w:val="20"/>
+          <w:szCs w:val="20"/>
+        </w:rPr>
+        <w:t>tuvees-buyhub</w:t>
+      </w:r>
+      <w:proofErr w:type="spellEnd"/>
+      <w:r>
+        <w:rPr>
+          <w:rFonts w:ascii="Courier New" w:eastAsia="Times New Roman" w:hAnsi="Courier New" w:cs="Courier New"/>
+          <w:color w:val="188038"/>
+          <w:sz w:val="20"/>
+          <w:szCs w:val="20"/>
+        </w:rPr>
+        <w:t>/styles.css'</w:t>
+      </w:r>
+      <w:r>
+        <w:rPr>
+          <w:rFonts w:ascii="Courier New" w:eastAsia="Times New Roman" w:hAnsi="Courier New" w:cs="Courier New"/>
+          <w:sz w:val="20"/>
+          <w:szCs w:val="20"/>
+        </w:rPr>
+        <w:t>,</w:t>
+      </w:r>
+    </w:p>
+    <w:p>
+      <w:pPr>
+        <w:shd w:val="clear" w:color="auto" w:fill="F4F6F7"/>
+        <w:tabs>
+          <w:tab w:val="left" w:pos="916"/>
+          <w:tab w:val="left" w:pos="1832"/>
+          <w:tab w:val="left" w:pos="2748"/>
+          <w:tab w:val="left" w:pos="3664"/>
+          <w:tab w:val="left" w:pos="4580"/>
+          <w:tab w:val="left" w:pos="5496"/>
+          <w:tab w:val="left" w:pos="6412"/>
+          <w:tab w:val="left" w:pos="7328"/>
+          <w:tab w:val="left" w:pos="8244"/>
+          <w:tab w:val="left" w:pos="9160"/>
+          <w:tab w:val="left" w:pos="10076"/>
+          <w:tab w:val="left" w:pos="10992"/>
+          <w:tab w:val="left" w:pos="11908"/>
+          <w:tab w:val="left" w:pos="12824"/>
+          <w:tab w:val="left" w:pos="13740"/>
+          <w:tab w:val="left" w:pos="14656"/>
+        </w:tabs>
+        <w:spacing w:after="0" w:line="240" w:lineRule="auto"/>
+        <w:rPr>
+          <w:rFonts w:ascii="Courier New" w:eastAsia="Times New Roman" w:hAnsi="Courier New" w:cs="Courier New"/>
+          <w:sz w:val="20"/>
+          <w:szCs w:val="20"/>
+        </w:rPr>
+      </w:pPr>
+      <w:r>
+        <w:rPr>
+          <w:rFonts w:ascii="Courier New" w:eastAsia="Times New Roman" w:hAnsi="Courier New" w:cs="Courier New"/>
+          <w:sz w:val="20"/>
+          <w:szCs w:val="20"/>
+        </w:rPr>
+        <w:t xml:space="preserve">  </w:t>
+      </w:r>
+      <w:r>
+        <w:rPr>
+          <w:rFonts w:ascii="Courier New" w:eastAsia="Times New Roman" w:hAnsi="Courier New" w:cs="Courier New"/>
+          <w:color w:val="188038"/>
+          <w:sz w:val="20"/>
+          <w:szCs w:val="20"/>
+        </w:rPr>
+        <w:t>'/</w:t>
+      </w:r>
+      <w:proofErr w:type="spellStart"/>
+      <w:r>
+        <w:rPr>
+          <w:rFonts w:ascii="Courier New" w:eastAsia="Times New Roman" w:hAnsi="Courier New" w:cs="Courier New"/>
+          <w:color w:val="188038"/>
+          <w:sz w:val="20"/>
+          <w:szCs w:val="20"/>
+        </w:rPr>
+        <w:t>tuvees-buyhub</w:t>
+      </w:r>
+      <w:proofErr w:type="spellEnd"/>
+      <w:r>
+        <w:rPr>
+          <w:rFonts w:ascii="Courier New" w:eastAsia="Times New Roman" w:hAnsi="Courier New" w:cs="Courier New"/>
+          <w:color w:val="188038"/>
+          <w:sz w:val="20"/>
+          <w:szCs w:val="20"/>
+        </w:rPr>
+        <w:t>/app.js'</w:t>
+      </w:r>
+      <w:r>
+        <w:rPr>
+          <w:rFonts w:ascii="Courier New" w:eastAsia="Times New Roman" w:hAnsi="Courier New" w:cs="Courier New"/>
+          <w:sz w:val="20"/>
+          <w:szCs w:val="20"/>
+        </w:rPr>
+        <w:t>,</w:t>
+      </w:r>
+    </w:p>
+    <w:p>
+      <w:pPr>
+        <w:shd w:val="clear" w:color="auto" w:fill="F4F6F7"/>
+        <w:tabs>
+          <w:tab w:val="left" w:pos="916"/>
+          <w:tab w:val="left" w:pos="1832"/>
+          <w:tab w:val="left" w:pos="2748"/>
+          <w:tab w:val="left" w:pos="3664"/>
+          <w:tab w:val="left" w:pos="4580"/>
+          <w:tab w:val="left" w:pos="5496"/>
+          <w:tab w:val="left" w:pos="6412"/>
+          <w:tab w:val="left" w:pos="7328"/>
+          <w:tab w:val="left" w:pos="8244"/>
+          <w:tab w:val="left" w:pos="9160"/>
+          <w:tab w:val="left" w:pos="10076"/>
+          <w:tab w:val="left" w:pos="10992"/>
+          <w:tab w:val="left" w:pos="11908"/>
+          <w:tab w:val="left" w:pos="12824"/>
+          <w:tab w:val="left" w:pos="13740"/>
+          <w:tab w:val="left" w:pos="14656"/>
+        </w:tabs>
+        <w:spacing w:after="0" w:line="240" w:lineRule="auto"/>
+        <w:rPr>
+          <w:rFonts w:ascii="Courier New" w:eastAsia="Times New Roman" w:hAnsi="Courier New" w:cs="Courier New"/>
+          <w:sz w:val="20"/>
+          <w:szCs w:val="20"/>
+        </w:rPr>
+      </w:pPr>
+      <w:r>
+        <w:rPr>
+          <w:rFonts w:ascii="Courier New" w:eastAsia="Times New Roman" w:hAnsi="Courier New" w:cs="Courier New"/>
+          <w:sz w:val="20"/>
+          <w:szCs w:val="20"/>
+        </w:rPr>
+        <w:t xml:space="preserve">  </w:t>
+      </w:r>
+      <w:r>
+        <w:rPr>
+          <w:rFonts w:ascii="Courier New" w:eastAsia="Times New Roman" w:hAnsi="Courier New" w:cs="Courier New"/>
+          <w:color w:val="188038"/>
+          <w:sz w:val="20"/>
+          <w:szCs w:val="20"/>
+        </w:rPr>
+        <w:t>'/</w:t>
+      </w:r>
+      <w:proofErr w:type="spellStart"/>
+      <w:r>
+        <w:rPr>
+          <w:rFonts w:ascii="Courier New" w:eastAsia="Times New Roman" w:hAnsi="Courier New" w:cs="Courier New"/>
+          <w:color w:val="188038"/>
+          <w:sz w:val="20"/>
+          <w:szCs w:val="20"/>
+        </w:rPr>
+        <w:t>tuvees-buyhub</w:t>
+      </w:r>
+      <w:proofErr w:type="spellEnd"/>
+      <w:r>
+        <w:rPr>
+          <w:rFonts w:ascii="Courier New" w:eastAsia="Times New Roman" w:hAnsi="Courier New" w:cs="Courier New"/>
+          <w:color w:val="188038"/>
+          <w:sz w:val="20"/>
+          <w:szCs w:val="20"/>
+        </w:rPr>
+        <w:t>/</w:t>
+      </w:r>
+      <w:proofErr w:type="spellStart"/>
+      <w:r>
+        <w:rPr>
+          <w:rFonts w:ascii="Courier New" w:eastAsia="Times New Roman" w:hAnsi="Courier New" w:cs="Courier New"/>
+          <w:color w:val="188038"/>
+          <w:sz w:val="20"/>
+          <w:szCs w:val="20"/>
+        </w:rPr>
+        <w:t>manifest.json</w:t>
+      </w:r>
+      <w:proofErr w:type="spellEnd"/>
+      <w:r>
+        <w:rPr>
+          <w:rFonts w:ascii="Courier New" w:eastAsia="Times New Roman" w:hAnsi="Courier New" w:cs="Courier New"/>
+          <w:color w:val="188038"/>
+          <w:sz w:val="20"/>
+          <w:szCs w:val="20"/>
+        </w:rPr>
+        <w:t>'</w:t>
+      </w:r>
+    </w:p>
+    <w:p>
+      <w:pPr>
+        <w:shd w:val="clear" w:color="auto" w:fill="F4F6F7"/>
+        <w:tabs>
+          <w:tab w:val="left" w:pos="916"/>
+          <w:tab w:val="left" w:pos="1832"/>
+          <w:tab w:val="left" w:pos="2748"/>
+          <w:tab w:val="left" w:pos="3664"/>
+          <w:tab w:val="left" w:pos="4580"/>
+          <w:tab w:val="left" w:pos="5496"/>
+          <w:tab w:val="left" w:pos="6412"/>
+          <w:tab w:val="left" w:pos="7328"/>
+          <w:tab w:val="left" w:pos="8244"/>
+          <w:tab w:val="left" w:pos="9160"/>
+          <w:tab w:val="left" w:pos="10076"/>
+          <w:tab w:val="left" w:pos="10992"/>
+          <w:tab w:val="left" w:pos="11908"/>
+          <w:tab w:val="left" w:pos="12824"/>
+          <w:tab w:val="left" w:pos="13740"/>
+          <w:tab w:val="left" w:pos="14656"/>
+        </w:tabs>
+        <w:spacing w:after="0" w:line="240" w:lineRule="auto"/>
+        <w:rPr>
+          <w:rFonts w:ascii="Courier New" w:eastAsia="Times New Roman" w:hAnsi="Courier New" w:cs="Courier New"/>
+          <w:sz w:val="20"/>
+          <w:szCs w:val="20"/>
+        </w:rPr>
+      </w:pPr>
+      <w:r>
+        <w:rPr>
+          <w:rFonts w:ascii="Courier New" w:eastAsia="Times New Roman" w:hAnsi="Courier New" w:cs="Courier New"/>
+          <w:sz w:val="20"/>
+          <w:szCs w:val="20"/>
+        </w:rPr>
+        <w:t>];</w:t>
+      </w:r>
+    </w:p>
+    <w:p>
+      <w:pPr>
+        <w:shd w:val="clear" w:color="auto" w:fill="F4F6F7"/>
+        <w:tabs>
+          <w:tab w:val="left" w:pos="916"/>
+          <w:tab w:val="left" w:pos="1832"/>
+          <w:tab w:val="left" w:pos="2748"/>
+          <w:tab w:val="left" w:pos="3664"/>
+          <w:tab w:val="left" w:pos="4580"/>
+          <w:tab w:val="left" w:pos="5496"/>
+          <w:tab w:val="left" w:pos="6412"/>
+          <w:tab w:val="left" w:pos="7328"/>
+          <w:tab w:val="left" w:pos="8244"/>
+          <w:tab w:val="left" w:pos="9160"/>
+          <w:tab w:val="left" w:pos="10076"/>
+          <w:tab w:val="left" w:pos="10992"/>
+          <w:tab w:val="left" w:pos="11908"/>
+          <w:tab w:val="left" w:pos="12824"/>
+          <w:tab w:val="left" w:pos="13740"/>
+          <w:tab w:val="left" w:pos="14656"/>
+        </w:tabs>
+        <w:spacing w:after="0" w:line="240" w:lineRule="auto"/>
+        <w:rPr>
+          <w:rFonts w:ascii="Courier New" w:eastAsia="Times New Roman" w:hAnsi="Courier New" w:cs="Courier New"/>
+          <w:sz w:val="20"/>
+          <w:szCs w:val="20"/>
+        </w:rPr>
+      </w:pPr>
+    </w:p>
+    <w:p>
+      <w:pPr>
+        <w:shd w:val="clear" w:color="auto" w:fill="F4F6F7"/>
+        <w:tabs>
+          <w:tab w:val="left" w:pos="916"/>
+          <w:tab w:val="left" w:pos="1832"/>
+          <w:tab w:val="left" w:pos="2748"/>
+          <w:tab w:val="left" w:pos="3664"/>
+          <w:tab w:val="left" w:pos="4580"/>
+          <w:tab w:val="left" w:pos="5496"/>
+          <w:tab w:val="left" w:pos="6412"/>
+          <w:tab w:val="left" w:pos="7328"/>
+          <w:tab w:val="left" w:pos="8244"/>
+          <w:tab w:val="left" w:pos="9160"/>
+          <w:tab w:val="left" w:pos="10076"/>
+          <w:tab w:val="left" w:pos="10992"/>
+          <w:tab w:val="left" w:pos="11908"/>
+          <w:tab w:val="left" w:pos="12824"/>
+          <w:tab w:val="left" w:pos="13740"/>
+          <w:tab w:val="left" w:pos="14656"/>
+        </w:tabs>
+        <w:spacing w:after="0" w:line="240" w:lineRule="auto"/>
+        <w:rPr>
+          <w:rFonts w:ascii="Courier New" w:eastAsia="Times New Roman" w:hAnsi="Courier New" w:cs="Courier New"/>
+          <w:sz w:val="20"/>
+          <w:szCs w:val="20"/>
+        </w:rPr>
+      </w:pPr>
+      <w:proofErr w:type="spellStart"/>
+      <w:proofErr w:type="gramStart"/>
+      <w:r>
+        <w:rPr>
+          <w:rFonts w:ascii="Courier New" w:eastAsia="Times New Roman" w:hAnsi="Courier New" w:cs="Courier New"/>
+          <w:sz w:val="20"/>
+          <w:szCs w:val="20"/>
+        </w:rPr>
+        <w:t>self.addEventListener</w:t>
+      </w:r>
+      <w:proofErr w:type="spellEnd"/>
+      <w:r>
+        <w:rPr>
+          <w:rFonts w:ascii="Courier New" w:eastAsia="Times New Roman" w:hAnsi="Courier New" w:cs="Courier New"/>
+          <w:sz w:val="20"/>
+          <w:szCs w:val="20"/>
+        </w:rPr>
+        <w:t>(</w:t>
+      </w:r>
+      <w:proofErr w:type="gramEnd"/>
+      <w:r>
+        <w:rPr>
+          <w:rFonts w:ascii="Courier New" w:eastAsia="Times New Roman" w:hAnsi="Courier New" w:cs="Courier New"/>
+          <w:color w:val="188038"/>
+          <w:sz w:val="20"/>
+          <w:szCs w:val="20"/>
+        </w:rPr>
+        <w:t>'install'</w:t>
+      </w:r>
+      <w:r>
+        <w:rPr>
+          <w:rFonts w:ascii="Courier New" w:eastAsia="Times New Roman" w:hAnsi="Courier New" w:cs="Courier New"/>
+          <w:sz w:val="20"/>
+          <w:szCs w:val="20"/>
+        </w:rPr>
+        <w:t>, e =&gt; {</w:t>
+      </w:r>
+    </w:p>
+    <w:p>
+      <w:pPr>
+        <w:shd w:val="clear" w:color="auto" w:fill="F4F6F7"/>
+        <w:tabs>
+          <w:tab w:val="left" w:pos="916"/>
+          <w:tab w:val="left" w:pos="1832"/>
+          <w:tab w:val="left" w:pos="2748"/>
+          <w:tab w:val="left" w:pos="3664"/>
+          <w:tab w:val="left" w:pos="4580"/>
+          <w:tab w:val="left" w:pos="5496"/>
+          <w:tab w:val="left" w:pos="6412"/>
+          <w:tab w:val="left" w:pos="7328"/>
+          <w:tab w:val="left" w:pos="8244"/>
+          <w:tab w:val="left" w:pos="9160"/>
+          <w:tab w:val="left" w:pos="10076"/>
+          <w:tab w:val="left" w:pos="10992"/>
+          <w:tab w:val="left" w:pos="11908"/>
+          <w:tab w:val="left" w:pos="12824"/>
+          <w:tab w:val="left" w:pos="13740"/>
+          <w:tab w:val="left" w:pos="14656"/>
+        </w:tabs>
+        <w:spacing w:after="0" w:line="240" w:lineRule="auto"/>
+        <w:rPr>
+          <w:rFonts w:ascii="Courier New" w:eastAsia="Times New Roman" w:hAnsi="Courier New" w:cs="Courier New"/>
+          <w:sz w:val="20"/>
+          <w:szCs w:val="20"/>
+        </w:rPr>
+      </w:pPr>
+      <w:r>
+        <w:rPr>
+          <w:rFonts w:ascii="Courier New" w:eastAsia="Times New Roman" w:hAnsi="Courier New" w:cs="Courier New"/>
+          <w:sz w:val="20"/>
+          <w:szCs w:val="20"/>
+        </w:rPr>
+        <w:t xml:space="preserve">  </w:t>
+      </w:r>
+      <w:proofErr w:type="spellStart"/>
+      <w:proofErr w:type="gramStart"/>
+      <w:r>
+        <w:rPr>
+          <w:rFonts w:ascii="Courier New" w:eastAsia="Times New Roman" w:hAnsi="Courier New" w:cs="Courier New"/>
+          <w:sz w:val="20"/>
+          <w:szCs w:val="20"/>
+        </w:rPr>
+        <w:t>e.waitUntil</w:t>
+      </w:r>
+      <w:proofErr w:type="spellEnd"/>
+      <w:r>
+        <w:rPr>
+          <w:rFonts w:ascii="Courier New" w:eastAsia="Times New Roman" w:hAnsi="Courier New" w:cs="Courier New"/>
+          <w:sz w:val="20"/>
+          <w:szCs w:val="20"/>
+        </w:rPr>
+        <w:t>(</w:t>
+      </w:r>
+      <w:proofErr w:type="gramEnd"/>
+    </w:p>
+    <w:p>
+      <w:pPr>
+        <w:shd w:val="clear" w:color="auto" w:fill="F4F6F7"/>
+        <w:tabs>
+          <w:tab w:val="left" w:pos="916"/>
+          <w:tab w:val="left" w:pos="1832"/>
+          <w:tab w:val="left" w:pos="2748"/>
+          <w:tab w:val="left" w:pos="3664"/>
+          <w:tab w:val="left" w:pos="4580"/>
+          <w:tab w:val="left" w:pos="5496"/>
+          <w:tab w:val="left" w:pos="6412"/>
+          <w:tab w:val="left" w:pos="7328"/>
+          <w:tab w:val="left" w:pos="8244"/>
+          <w:tab w:val="left" w:pos="9160"/>
+          <w:tab w:val="left" w:pos="10076"/>
+          <w:tab w:val="left" w:pos="10992"/>
+          <w:tab w:val="left" w:pos="11908"/>
+          <w:tab w:val="left" w:pos="12824"/>
+          <w:tab w:val="left" w:pos="13740"/>
+          <w:tab w:val="left" w:pos="14656"/>
+        </w:tabs>
+        <w:spacing w:after="0" w:line="240" w:lineRule="auto"/>
+        <w:rPr>
+          <w:rFonts w:ascii="Courier New" w:eastAsia="Times New Roman" w:hAnsi="Courier New" w:cs="Courier New"/>
+          <w:sz w:val="20"/>
+          <w:szCs w:val="20"/>
+        </w:rPr>
+      </w:pPr>
+      <w:r>
+        <w:rPr>
+          <w:rFonts w:ascii="Courier New" w:eastAsia="Times New Roman" w:hAnsi="Courier New" w:cs="Courier New"/>
+          <w:sz w:val="20"/>
+          <w:szCs w:val="20"/>
+        </w:rPr>
+        <w:t xml:space="preserve">    </w:t>
+      </w:r>
+      <w:proofErr w:type="spellStart"/>
+      <w:proofErr w:type="gramStart"/>
+      <w:r>
+        <w:rPr>
+          <w:rFonts w:ascii="Courier New" w:eastAsia="Times New Roman" w:hAnsi="Courier New" w:cs="Courier New"/>
+          <w:sz w:val="20"/>
+          <w:szCs w:val="20"/>
+        </w:rPr>
+        <w:t>caches.open</w:t>
+      </w:r>
+      <w:proofErr w:type="spellEnd"/>
+      <w:r>
+        <w:rPr>
+          <w:rFonts w:ascii="Courier New" w:eastAsia="Times New Roman" w:hAnsi="Courier New" w:cs="Courier New"/>
+          <w:sz w:val="20"/>
+          <w:szCs w:val="20"/>
+        </w:rPr>
+        <w:t>(</w:t>
+      </w:r>
+      <w:proofErr w:type="gramEnd"/>
+      <w:r>
+        <w:rPr>
+          <w:rFonts w:ascii="Courier New" w:eastAsia="Times New Roman" w:hAnsi="Courier New" w:cs="Courier New"/>
+          <w:sz w:val="20"/>
+          <w:szCs w:val="20"/>
+        </w:rPr>
+        <w:t>CACHE_NAME).then(cache =&gt; {</w:t>
+      </w:r>
+    </w:p>
+    <w:p>
+      <w:pPr>
+        <w:shd w:val="clear" w:color="auto" w:fill="F4F6F7"/>
+        <w:tabs>
+          <w:tab w:val="left" w:pos="916"/>
+          <w:tab w:val="left" w:pos="1832"/>
+          <w:tab w:val="left" w:pos="2748"/>
+          <w:tab w:val="left" w:pos="3664"/>
+          <w:tab w:val="left" w:pos="4580"/>
+          <w:tab w:val="left" w:pos="5496"/>
+          <w:tab w:val="left" w:pos="6412"/>
+          <w:tab w:val="left" w:pos="7328"/>
+          <w:tab w:val="left" w:pos="8244"/>
+          <w:tab w:val="left" w:pos="9160"/>
+          <w:tab w:val="left" w:pos="10076"/>
+          <w:tab w:val="left" w:pos="10992"/>
+          <w:tab w:val="left" w:pos="11908"/>
+          <w:tab w:val="left" w:pos="12824"/>
+          <w:tab w:val="left" w:pos="13740"/>
+          <w:tab w:val="left" w:pos="14656"/>
+        </w:tabs>
+        <w:spacing w:after="0" w:line="240" w:lineRule="auto"/>
+        <w:rPr>
+          <w:rFonts w:ascii="Courier New" w:eastAsia="Times New Roman" w:hAnsi="Courier New" w:cs="Courier New"/>
+          <w:sz w:val="20"/>
+          <w:szCs w:val="20"/>
+        </w:rPr>
+      </w:pPr>
+      <w:r>
+        <w:rPr>
+          <w:rFonts w:ascii="Courier New" w:eastAsia="Times New Roman" w:hAnsi="Courier New" w:cs="Courier New"/>
+          <w:sz w:val="20"/>
+          <w:szCs w:val="20"/>
+        </w:rPr>
+        <w:t xml:space="preserve">      </w:t>
+      </w:r>
+      <w:proofErr w:type="gramStart"/>
+      <w:r>
+        <w:rPr>
+          <w:rFonts w:ascii="Courier New" w:eastAsia="Times New Roman" w:hAnsi="Courier New" w:cs="Courier New"/>
+          <w:color w:val="9334E6"/>
+          <w:sz w:val="20"/>
+          <w:szCs w:val="20"/>
+        </w:rPr>
+        <w:t>return</w:t>
+      </w:r>
+      <w:proofErr w:type="gramEnd"/>
+      <w:r>
+        <w:rPr>
+          <w:rFonts w:ascii="Courier New" w:eastAsia="Times New Roman" w:hAnsi="Courier New" w:cs="Courier New"/>
+          <w:sz w:val="20"/>
+          <w:szCs w:val="20"/>
+        </w:rPr>
+        <w:t xml:space="preserve"> </w:t>
+      </w:r>
+      <w:proofErr w:type="spellStart"/>
+      <w:r>
+        <w:rPr>
+          <w:rFonts w:ascii="Courier New" w:eastAsia="Times New Roman" w:hAnsi="Courier New" w:cs="Courier New"/>
+          <w:sz w:val="20"/>
+          <w:szCs w:val="20"/>
+        </w:rPr>
+        <w:t>cache.addAll</w:t>
+      </w:r>
+      <w:proofErr w:type="spellEnd"/>
+      <w:r>
+        <w:rPr>
+          <w:rFonts w:ascii="Courier New" w:eastAsia="Times New Roman" w:hAnsi="Courier New" w:cs="Courier New"/>
+          <w:sz w:val="20"/>
+          <w:szCs w:val="20"/>
+        </w:rPr>
+        <w:t>(ASSETS);</w:t>
+      </w:r>
+    </w:p>
+    <w:p>
+      <w:pPr>
+        <w:shd w:val="clear" w:color="auto" w:fill="F4F6F7"/>
+        <w:tabs>
+          <w:tab w:val="left" w:pos="916"/>
+          <w:tab w:val="left" w:pos="1832"/>
+          <w:tab w:val="left" w:pos="2748"/>
+          <w:tab w:val="left" w:pos="3664"/>
+          <w:tab w:val="left" w:pos="4580"/>
+          <w:tab w:val="left" w:pos="5496"/>
+          <w:tab w:val="left" w:pos="6412"/>
+          <w:tab w:val="left" w:pos="7328"/>
+          <w:tab w:val="left" w:pos="8244"/>
+          <w:tab w:val="left" w:pos="9160"/>
+          <w:tab w:val="left" w:pos="10076"/>
+          <w:tab w:val="left" w:pos="10992"/>
+          <w:tab w:val="left" w:pos="11908"/>
+          <w:tab w:val="left" w:pos="12824"/>
+          <w:tab w:val="left" w:pos="13740"/>
+          <w:tab w:val="left" w:pos="14656"/>
+        </w:tabs>
+        <w:spacing w:after="0" w:line="240" w:lineRule="auto"/>
+        <w:rPr>
+          <w:rFonts w:ascii="Courier New" w:eastAsia="Times New Roman" w:hAnsi="Courier New" w:cs="Courier New"/>
+          <w:sz w:val="20"/>
+          <w:szCs w:val="20"/>
+        </w:rPr>
+      </w:pPr>
+      <w:r>
+        <w:rPr>
+          <w:rFonts w:ascii="Courier New" w:eastAsia="Times New Roman" w:hAnsi="Courier New" w:cs="Courier New"/>
+          <w:sz w:val="20"/>
+          <w:szCs w:val="20"/>
+        </w:rPr>
+        <w:t xml:space="preserve">    }).</w:t>
+      </w:r>
+      <w:proofErr w:type="gramStart"/>
+      <w:r>
+        <w:rPr>
+          <w:rFonts w:ascii="Courier New" w:eastAsia="Times New Roman" w:hAnsi="Courier New" w:cs="Courier New"/>
+          <w:sz w:val="20"/>
+          <w:szCs w:val="20"/>
+        </w:rPr>
+        <w:t>then(</w:t>
+      </w:r>
+      <w:proofErr w:type="gramEnd"/>
+      <w:r>
+        <w:rPr>
+          <w:rFonts w:ascii="Courier New" w:eastAsia="Times New Roman" w:hAnsi="Courier New" w:cs="Courier New"/>
+          <w:sz w:val="20"/>
+          <w:szCs w:val="20"/>
+        </w:rPr>
+        <w:t xml:space="preserve">() =&gt; </w:t>
+      </w:r>
+      <w:proofErr w:type="spellStart"/>
+      <w:r>
+        <w:rPr>
+          <w:rFonts w:ascii="Courier New" w:eastAsia="Times New Roman" w:hAnsi="Courier New" w:cs="Courier New"/>
+          <w:sz w:val="20"/>
+          <w:szCs w:val="20"/>
+        </w:rPr>
+        <w:t>self.skipWaiting</w:t>
+      </w:r>
+      <w:proofErr w:type="spellEnd"/>
+      <w:r>
+        <w:rPr>
+          <w:rFonts w:ascii="Courier New" w:eastAsia="Times New Roman" w:hAnsi="Courier New" w:cs="Courier New"/>
+          <w:sz w:val="20"/>
+          <w:szCs w:val="20"/>
+        </w:rPr>
+        <w:t xml:space="preserve">()) </w:t>
+      </w:r>
+      <w:r>
+        <w:rPr>
+          <w:rFonts w:ascii="Courier New" w:eastAsia="Times New Roman" w:hAnsi="Courier New" w:cs="Courier New"/>
+          <w:i/>
+          <w:iCs/>
+          <w:color w:val="80868B"/>
+          <w:sz w:val="20"/>
+          <w:szCs w:val="20"/>
+        </w:rPr>
+        <w:t>// Force immediate activation</w:t>
+      </w:r>
+    </w:p>
+    <w:p>
+      <w:pPr>
+        <w:shd w:val="clear" w:color="auto" w:fill="F4F6F7"/>
+        <w:tabs>
+          <w:tab w:val="left" w:pos="916"/>
+          <w:tab w:val="left" w:pos="1832"/>
+          <w:tab w:val="left" w:pos="2748"/>
+          <w:tab w:val="left" w:pos="3664"/>
+          <w:tab w:val="left" w:pos="4580"/>
+          <w:tab w:val="left" w:pos="5496"/>
+          <w:tab w:val="left" w:pos="6412"/>
+          <w:tab w:val="left" w:pos="7328"/>
+          <w:tab w:val="left" w:pos="8244"/>
+          <w:tab w:val="left" w:pos="9160"/>
+          <w:tab w:val="left" w:pos="10076"/>
+          <w:tab w:val="left" w:pos="10992"/>
+          <w:tab w:val="left" w:pos="11908"/>
+          <w:tab w:val="left" w:pos="12824"/>
+          <w:tab w:val="left" w:pos="13740"/>
+          <w:tab w:val="left" w:pos="14656"/>
+        </w:tabs>
+        <w:spacing w:after="0" w:line="240" w:lineRule="auto"/>
+        <w:rPr>
+          <w:rFonts w:ascii="Courier New" w:eastAsia="Times New Roman" w:hAnsi="Courier New" w:cs="Courier New"/>
+          <w:sz w:val="20"/>
+          <w:szCs w:val="20"/>
+        </w:rPr>
+      </w:pPr>
+      <w:r>
+        <w:rPr>
+          <w:rFonts w:ascii="Courier New" w:eastAsia="Times New Roman" w:hAnsi="Courier New" w:cs="Courier New"/>
+          <w:sz w:val="20"/>
+          <w:szCs w:val="20"/>
+        </w:rPr>
+        <w:t xml:space="preserve">  );</w:t>
+      </w:r>
+    </w:p>
+    <w:p>
+      <w:pPr>
+        <w:shd w:val="clear" w:color="auto" w:fill="F4F6F7"/>
+        <w:tabs>
+          <w:tab w:val="left" w:pos="916"/>
+          <w:tab w:val="left" w:pos="1832"/>
+          <w:tab w:val="left" w:pos="2748"/>
+          <w:tab w:val="left" w:pos="3664"/>
+          <w:tab w:val="left" w:pos="4580"/>
+          <w:tab w:val="left" w:pos="5496"/>
+          <w:tab w:val="left" w:pos="6412"/>
+          <w:tab w:val="left" w:pos="7328"/>
+          <w:tab w:val="left" w:pos="8244"/>
+          <w:tab w:val="left" w:pos="9160"/>
+          <w:tab w:val="left" w:pos="10076"/>
+          <w:tab w:val="left" w:pos="10992"/>
+          <w:tab w:val="left" w:pos="11908"/>
+          <w:tab w:val="left" w:pos="12824"/>
+          <w:tab w:val="left" w:pos="13740"/>
+          <w:tab w:val="left" w:pos="14656"/>
+        </w:tabs>
+        <w:spacing w:after="0" w:line="240" w:lineRule="auto"/>
+        <w:rPr>
+          <w:rFonts w:ascii="Courier New" w:eastAsia="Times New Roman" w:hAnsi="Courier New" w:cs="Courier New"/>
+          <w:sz w:val="20"/>
+          <w:szCs w:val="20"/>
+        </w:rPr>
+      </w:pPr>
+      <w:r>
+        <w:rPr>
+          <w:rFonts w:ascii="Courier New" w:eastAsia="Times New Roman" w:hAnsi="Courier New" w:cs="Courier New"/>
+          <w:sz w:val="20"/>
+          <w:szCs w:val="20"/>
+        </w:rPr>
+        <w:t>});</w:t>
+      </w:r>
+    </w:p>
+    <w:p>
+      <w:pPr>
+        <w:shd w:val="clear" w:color="auto" w:fill="F4F6F7"/>
+        <w:tabs>
+          <w:tab w:val="left" w:pos="916"/>
+          <w:tab w:val="left" w:pos="1832"/>
+          <w:tab w:val="left" w:pos="2748"/>
+          <w:tab w:val="left" w:pos="3664"/>
+          <w:tab w:val="left" w:pos="4580"/>
+          <w:tab w:val="left" w:pos="5496"/>
+          <w:tab w:val="left" w:pos="6412"/>
+          <w:tab w:val="left" w:pos="7328"/>
+          <w:tab w:val="left" w:pos="8244"/>
+          <w:tab w:val="left" w:pos="9160"/>
+          <w:tab w:val="left" w:pos="10076"/>
+          <w:tab w:val="left" w:pos="10992"/>
+          <w:tab w:val="left" w:pos="11908"/>
+          <w:tab w:val="left" w:pos="12824"/>
+          <w:tab w:val="left" w:pos="13740"/>
+          <w:tab w:val="left" w:pos="14656"/>
+        </w:tabs>
+        <w:spacing w:after="0" w:line="240" w:lineRule="auto"/>
+        <w:rPr>
+          <w:rFonts w:ascii="Courier New" w:eastAsia="Times New Roman" w:hAnsi="Courier New" w:cs="Courier New"/>
+          <w:sz w:val="20"/>
+          <w:szCs w:val="20"/>
+        </w:rPr>
+      </w:pPr>
+    </w:p>
+    <w:p>
+      <w:pPr>
+        <w:shd w:val="clear" w:color="auto" w:fill="F4F6F7"/>
+        <w:tabs>
+          <w:tab w:val="left" w:pos="916"/>
+          <w:tab w:val="left" w:pos="1832"/>
+          <w:tab w:val="left" w:pos="2748"/>
+          <w:tab w:val="left" w:pos="3664"/>
+          <w:tab w:val="left" w:pos="4580"/>
+          <w:tab w:val="left" w:pos="5496"/>
+          <w:tab w:val="left" w:pos="6412"/>
+          <w:tab w:val="left" w:pos="7328"/>
+          <w:tab w:val="left" w:pos="8244"/>
+          <w:tab w:val="left" w:pos="9160"/>
+          <w:tab w:val="left" w:pos="10076"/>
+          <w:tab w:val="left" w:pos="10992"/>
+          <w:tab w:val="left" w:pos="11908"/>
+          <w:tab w:val="left" w:pos="12824"/>
+          <w:tab w:val="left" w:pos="13740"/>
+          <w:tab w:val="left" w:pos="14656"/>
+        </w:tabs>
+        <w:spacing w:after="0" w:line="240" w:lineRule="auto"/>
+        <w:rPr>
+          <w:rFonts w:ascii="Courier New" w:eastAsia="Times New Roman" w:hAnsi="Courier New" w:cs="Courier New"/>
+          <w:sz w:val="20"/>
+          <w:szCs w:val="20"/>
+        </w:rPr>
+      </w:pPr>
+      <w:proofErr w:type="spellStart"/>
+      <w:proofErr w:type="gramStart"/>
+      <w:r>
+        <w:rPr>
+          <w:rFonts w:ascii="Courier New" w:eastAsia="Times New Roman" w:hAnsi="Courier New" w:cs="Courier New"/>
+          <w:sz w:val="20"/>
+          <w:szCs w:val="20"/>
+        </w:rPr>
+        <w:t>self.addEventListener</w:t>
+      </w:r>
+      <w:proofErr w:type="spellEnd"/>
+      <w:r>
+        <w:rPr>
+          <w:rFonts w:ascii="Courier New" w:eastAsia="Times New Roman" w:hAnsi="Courier New" w:cs="Courier New"/>
+          <w:sz w:val="20"/>
+          <w:szCs w:val="20"/>
+        </w:rPr>
+        <w:t>(</w:t>
+      </w:r>
+      <w:proofErr w:type="gramEnd"/>
+      <w:r>
+        <w:rPr>
+          <w:rFonts w:ascii="Courier New" w:eastAsia="Times New Roman" w:hAnsi="Courier New" w:cs="Courier New"/>
+          <w:color w:val="188038"/>
+          <w:sz w:val="20"/>
+          <w:szCs w:val="20"/>
+        </w:rPr>
+        <w:t>'activate'</w:t>
+      </w:r>
+      <w:r>
+        <w:rPr>
+          <w:rFonts w:ascii="Courier New" w:eastAsia="Times New Roman" w:hAnsi="Courier New" w:cs="Courier New"/>
+          <w:sz w:val="20"/>
+          <w:szCs w:val="20"/>
+        </w:rPr>
+        <w:t>, e =&gt; {</w:t>
+      </w:r>
+    </w:p>
+    <w:p>
+      <w:pPr>
+        <w:shd w:val="clear" w:color="auto" w:fill="F4F6F7"/>
+        <w:tabs>
+          <w:tab w:val="left" w:pos="916"/>
+          <w:tab w:val="left" w:pos="1832"/>
+          <w:tab w:val="left" w:pos="2748"/>
+          <w:tab w:val="left" w:pos="3664"/>
+          <w:tab w:val="left" w:pos="4580"/>
+          <w:tab w:val="left" w:pos="5496"/>
+          <w:tab w:val="left" w:pos="6412"/>
+          <w:tab w:val="left" w:pos="7328"/>
+          <w:tab w:val="left" w:pos="8244"/>
+          <w:tab w:val="left" w:pos="9160"/>
+          <w:tab w:val="left" w:pos="10076"/>
+          <w:tab w:val="left" w:pos="10992"/>
+          <w:tab w:val="left" w:pos="11908"/>
+          <w:tab w:val="left" w:pos="12824"/>
+          <w:tab w:val="left" w:pos="13740"/>
+          <w:tab w:val="left" w:pos="14656"/>
+        </w:tabs>
+        <w:spacing w:after="0" w:line="240" w:lineRule="auto"/>
+        <w:rPr>
+          <w:rFonts w:ascii="Courier New" w:eastAsia="Times New Roman" w:hAnsi="Courier New" w:cs="Courier New"/>
+          <w:sz w:val="20"/>
+          <w:szCs w:val="20"/>
+        </w:rPr>
+      </w:pPr>
+      <w:r>
+        <w:rPr>
+          <w:rFonts w:ascii="Courier New" w:eastAsia="Times New Roman" w:hAnsi="Courier New" w:cs="Courier New"/>
+          <w:sz w:val="20"/>
+          <w:szCs w:val="20"/>
+        </w:rPr>
+        <w:t xml:space="preserve">  </w:t>
+      </w:r>
+      <w:proofErr w:type="spellStart"/>
+      <w:proofErr w:type="gramStart"/>
+      <w:r>
+        <w:rPr>
+          <w:rFonts w:ascii="Courier New" w:eastAsia="Times New Roman" w:hAnsi="Courier New" w:cs="Courier New"/>
+          <w:sz w:val="20"/>
+          <w:szCs w:val="20"/>
+        </w:rPr>
+        <w:t>e.waitUntil</w:t>
+      </w:r>
+      <w:proofErr w:type="spellEnd"/>
+      <w:r>
+        <w:rPr>
+          <w:rFonts w:ascii="Courier New" w:eastAsia="Times New Roman" w:hAnsi="Courier New" w:cs="Courier New"/>
+          <w:sz w:val="20"/>
+          <w:szCs w:val="20"/>
+        </w:rPr>
+        <w:t>(</w:t>
+      </w:r>
+      <w:proofErr w:type="gramEnd"/>
+    </w:p>
+    <w:p>
+      <w:pPr>
+        <w:shd w:val="clear" w:color="auto" w:fill="F4F6F7"/>
+        <w:tabs>
+          <w:tab w:val="left" w:pos="916"/>
+          <w:tab w:val="left" w:pos="1832"/>
+          <w:tab w:val="left" w:pos="2748"/>
+          <w:tab w:val="left" w:pos="3664"/>
+          <w:tab w:val="left" w:pos="4580"/>
+          <w:tab w:val="left" w:pos="5496"/>
+          <w:tab w:val="left" w:pos="6412"/>
+          <w:tab w:val="left" w:pos="7328"/>
+          <w:tab w:val="left" w:pos="8244"/>
+          <w:tab w:val="left" w:pos="9160"/>
+          <w:tab w:val="left" w:pos="10076"/>
+          <w:tab w:val="left" w:pos="10992"/>
+          <w:tab w:val="left" w:pos="11908"/>
+          <w:tab w:val="left" w:pos="12824"/>
+          <w:tab w:val="left" w:pos="13740"/>
+          <w:tab w:val="left" w:pos="14656"/>
+        </w:tabs>
+        <w:spacing w:after="0" w:line="240" w:lineRule="auto"/>
+        <w:rPr>
+          <w:rFonts w:ascii="Courier New" w:eastAsia="Times New Roman" w:hAnsi="Courier New" w:cs="Courier New"/>
+          <w:sz w:val="20"/>
+          <w:szCs w:val="20"/>
+        </w:rPr>
+      </w:pPr>
+      <w:r>
+        <w:rPr>
+          <w:rFonts w:ascii="Courier New" w:eastAsia="Times New Roman" w:hAnsi="Courier New" w:cs="Courier New"/>
+          <w:sz w:val="20"/>
+          <w:szCs w:val="20"/>
+        </w:rPr>
+        <w:t xml:space="preserve">    </w:t>
+      </w:r>
+      <w:proofErr w:type="spellStart"/>
+      <w:proofErr w:type="gramStart"/>
+      <w:r>
+        <w:rPr>
+          <w:rFonts w:ascii="Courier New" w:eastAsia="Times New Roman" w:hAnsi="Courier New" w:cs="Courier New"/>
+          <w:sz w:val="20"/>
+          <w:szCs w:val="20"/>
+        </w:rPr>
+        <w:t>caches.keys</w:t>
+      </w:r>
+      <w:proofErr w:type="spellEnd"/>
+      <w:r>
+        <w:rPr>
+          <w:rFonts w:ascii="Courier New" w:eastAsia="Times New Roman" w:hAnsi="Courier New" w:cs="Courier New"/>
+          <w:sz w:val="20"/>
+          <w:szCs w:val="20"/>
+        </w:rPr>
+        <w:t>(</w:t>
+      </w:r>
+      <w:proofErr w:type="gramEnd"/>
+      <w:r>
+        <w:rPr>
+          <w:rFonts w:ascii="Courier New" w:eastAsia="Times New Roman" w:hAnsi="Courier New" w:cs="Courier New"/>
+          <w:sz w:val="20"/>
+          <w:szCs w:val="20"/>
+        </w:rPr>
+        <w:t>).then(keys =&gt; {</w:t>
+      </w:r>
+    </w:p>
+    <w:p>
+      <w:pPr>
+        <w:shd w:val="clear" w:color="auto" w:fill="F4F6F7"/>
+        <w:tabs>
+          <w:tab w:val="left" w:pos="916"/>
+          <w:tab w:val="left" w:pos="1832"/>
+          <w:tab w:val="left" w:pos="2748"/>
+          <w:tab w:val="left" w:pos="3664"/>
+          <w:tab w:val="left" w:pos="4580"/>
+          <w:tab w:val="left" w:pos="5496"/>
+          <w:tab w:val="left" w:pos="6412"/>
+          <w:tab w:val="left" w:pos="7328"/>
+          <w:tab w:val="left" w:pos="8244"/>
+          <w:tab w:val="left" w:pos="9160"/>
+          <w:tab w:val="left" w:pos="10076"/>
+          <w:tab w:val="left" w:pos="10992"/>
+          <w:tab w:val="left" w:pos="11908"/>
+          <w:tab w:val="left" w:pos="12824"/>
+          <w:tab w:val="left" w:pos="13740"/>
+          <w:tab w:val="left" w:pos="14656"/>
+        </w:tabs>
+        <w:spacing w:after="0" w:line="240" w:lineRule="auto"/>
+        <w:rPr>
+          <w:rFonts w:ascii="Courier New" w:eastAsia="Times New Roman" w:hAnsi="Courier New" w:cs="Courier New"/>
+          <w:sz w:val="20"/>
+          <w:szCs w:val="20"/>
+        </w:rPr>
+      </w:pPr>
+      <w:r>
+        <w:rPr>
+          <w:rFonts w:ascii="Courier New" w:eastAsia="Times New Roman" w:hAnsi="Courier New" w:cs="Courier New"/>
+          <w:sz w:val="20"/>
+          <w:szCs w:val="20"/>
+        </w:rPr>
+        <w:t xml:space="preserve">      </w:t>
+      </w:r>
+      <w:proofErr w:type="gramStart"/>
+      <w:r>
+        <w:rPr>
+          <w:rFonts w:ascii="Courier New" w:eastAsia="Times New Roman" w:hAnsi="Courier New" w:cs="Courier New"/>
+          <w:color w:val="9334E6"/>
+          <w:sz w:val="20"/>
+          <w:szCs w:val="20"/>
+        </w:rPr>
+        <w:t>return</w:t>
+      </w:r>
+      <w:proofErr w:type="gramEnd"/>
+      <w:r>
+        <w:rPr>
+          <w:rFonts w:ascii="Courier New" w:eastAsia="Times New Roman" w:hAnsi="Courier New" w:cs="Courier New"/>
+          <w:sz w:val="20"/>
+          <w:szCs w:val="20"/>
+        </w:rPr>
+        <w:t xml:space="preserve"> </w:t>
+      </w:r>
+      <w:proofErr w:type="spellStart"/>
+      <w:r>
+        <w:rPr>
+          <w:rFonts w:ascii="Courier New" w:eastAsia="Times New Roman" w:hAnsi="Courier New" w:cs="Courier New"/>
+          <w:sz w:val="20"/>
+          <w:szCs w:val="20"/>
+        </w:rPr>
+        <w:t>Promise.all</w:t>
+      </w:r>
+      <w:proofErr w:type="spellEnd"/>
+      <w:r>
+        <w:rPr>
+          <w:rFonts w:ascii="Courier New" w:eastAsia="Times New Roman" w:hAnsi="Courier New" w:cs="Courier New"/>
+          <w:sz w:val="20"/>
+          <w:szCs w:val="20"/>
+        </w:rPr>
+        <w:t>(</w:t>
+      </w:r>
+    </w:p>
+    <w:p>
+      <w:pPr>
+        <w:shd w:val="clear" w:color="auto" w:fill="F4F6F7"/>
+        <w:tabs>
+          <w:tab w:val="left" w:pos="916"/>
+          <w:tab w:val="left" w:pos="1832"/>
+          <w:tab w:val="left" w:pos="2748"/>
+          <w:tab w:val="left" w:pos="3664"/>
+          <w:tab w:val="left" w:pos="4580"/>
+          <w:tab w:val="left" w:pos="5496"/>
+          <w:tab w:val="left" w:pos="6412"/>
+          <w:tab w:val="left" w:pos="7328"/>
+          <w:tab w:val="left" w:pos="8244"/>
+          <w:tab w:val="left" w:pos="9160"/>
+          <w:tab w:val="left" w:pos="10076"/>
+          <w:tab w:val="left" w:pos="10992"/>
+          <w:tab w:val="left" w:pos="11908"/>
+          <w:tab w:val="left" w:pos="12824"/>
+          <w:tab w:val="left" w:pos="13740"/>
+          <w:tab w:val="left" w:pos="14656"/>
+        </w:tabs>
+        <w:spacing w:after="0" w:line="240" w:lineRule="auto"/>
+        <w:rPr>
+          <w:rFonts w:ascii="Courier New" w:eastAsia="Times New Roman" w:hAnsi="Courier New" w:cs="Courier New"/>
+          <w:sz w:val="20"/>
+          <w:szCs w:val="20"/>
+        </w:rPr>
+      </w:pPr>
+      <w:r>
+        <w:rPr>
+          <w:rFonts w:ascii="Courier New" w:eastAsia="Times New Roman" w:hAnsi="Courier New" w:cs="Courier New"/>
+          <w:sz w:val="20"/>
+          <w:szCs w:val="20"/>
+        </w:rPr>
+        <w:t xml:space="preserve">        </w:t>
+      </w:r>
+      <w:proofErr w:type="spellStart"/>
+      <w:proofErr w:type="gramStart"/>
+      <w:r>
+        <w:rPr>
+          <w:rFonts w:ascii="Courier New" w:eastAsia="Times New Roman" w:hAnsi="Courier New" w:cs="Courier New"/>
+          <w:sz w:val="20"/>
+          <w:szCs w:val="20"/>
+        </w:rPr>
+        <w:t>keys.map</w:t>
+      </w:r>
+      <w:proofErr w:type="spellEnd"/>
+      <w:r>
+        <w:rPr>
+          <w:rFonts w:ascii="Courier New" w:eastAsia="Times New Roman" w:hAnsi="Courier New" w:cs="Courier New"/>
+          <w:sz w:val="20"/>
+          <w:szCs w:val="20"/>
+        </w:rPr>
+        <w:t>(</w:t>
+      </w:r>
+      <w:proofErr w:type="gramEnd"/>
+      <w:r>
+        <w:rPr>
+          <w:rFonts w:ascii="Courier New" w:eastAsia="Times New Roman" w:hAnsi="Courier New" w:cs="Courier New"/>
+          <w:sz w:val="20"/>
+          <w:szCs w:val="20"/>
+        </w:rPr>
+        <w:t>key =&gt; {</w:t>
+      </w:r>
+    </w:p>
+    <w:p>
+      <w:pPr>
+        <w:shd w:val="clear" w:color="auto" w:fill="F4F6F7"/>
+        <w:tabs>
+          <w:tab w:val="left" w:pos="916"/>
+          <w:tab w:val="left" w:pos="1832"/>
+          <w:tab w:val="left" w:pos="2748"/>
+          <w:tab w:val="left" w:pos="3664"/>
+          <w:tab w:val="left" w:pos="4580"/>
+          <w:tab w:val="left" w:pos="5496"/>
+          <w:tab w:val="left" w:pos="6412"/>
+          <w:tab w:val="left" w:pos="7328"/>
+          <w:tab w:val="left" w:pos="8244"/>
+          <w:tab w:val="left" w:pos="9160"/>
+          <w:tab w:val="left" w:pos="10076"/>
+          <w:tab w:val="left" w:pos="10992"/>
+          <w:tab w:val="left" w:pos="11908"/>
+          <w:tab w:val="left" w:pos="12824"/>
+          <w:tab w:val="left" w:pos="13740"/>
+          <w:tab w:val="left" w:pos="14656"/>
+        </w:tabs>
+        <w:spacing w:after="0" w:line="240" w:lineRule="auto"/>
+        <w:rPr>
+          <w:rFonts w:ascii="Courier New" w:eastAsia="Times New Roman" w:hAnsi="Courier New" w:cs="Courier New"/>
+          <w:sz w:val="20"/>
+          <w:szCs w:val="20"/>
+        </w:rPr>
+      </w:pPr>
+      <w:r>
+        <w:rPr>
+          <w:rFonts w:ascii="Courier New" w:eastAsia="Times New Roman" w:hAnsi="Courier New" w:cs="Courier New"/>
+          <w:sz w:val="20"/>
+          <w:szCs w:val="20"/>
+        </w:rPr>
+        <w:t xml:space="preserve">          </w:t>
+      </w:r>
+      <w:proofErr w:type="gramStart"/>
+      <w:r>
+        <w:rPr>
+          <w:rFonts w:ascii="Courier New" w:eastAsia="Times New Roman" w:hAnsi="Courier New" w:cs="Courier New"/>
+          <w:color w:val="9334E6"/>
+          <w:sz w:val="20"/>
+          <w:szCs w:val="20"/>
+        </w:rPr>
+        <w:t>if</w:t>
+      </w:r>
+      <w:proofErr w:type="gramEnd"/>
+      <w:r>
+        <w:rPr>
+          <w:rFonts w:ascii="Courier New" w:eastAsia="Times New Roman" w:hAnsi="Courier New" w:cs="Courier New"/>
+          <w:sz w:val="20"/>
+          <w:szCs w:val="20"/>
+        </w:rPr>
+        <w:t xml:space="preserve"> (key !== CACHE_NAME) {</w:t>
+      </w:r>
+    </w:p>
+    <w:p>
+      <w:pPr>
+        <w:shd w:val="clear" w:color="auto" w:fill="F4F6F7"/>
+        <w:tabs>
+          <w:tab w:val="left" w:pos="916"/>
+          <w:tab w:val="left" w:pos="1832"/>
+          <w:tab w:val="left" w:pos="2748"/>
+          <w:tab w:val="left" w:pos="3664"/>
+          <w:tab w:val="left" w:pos="4580"/>
+          <w:tab w:val="left" w:pos="5496"/>
+          <w:tab w:val="left" w:pos="6412"/>
+          <w:tab w:val="left" w:pos="7328"/>
+          <w:tab w:val="left" w:pos="8244"/>
+          <w:tab w:val="left" w:pos="9160"/>
+          <w:tab w:val="left" w:pos="10076"/>
+          <w:tab w:val="left" w:pos="10992"/>
+          <w:tab w:val="left" w:pos="11908"/>
+          <w:tab w:val="left" w:pos="12824"/>
+          <w:tab w:val="left" w:pos="13740"/>
+          <w:tab w:val="left" w:pos="14656"/>
+        </w:tabs>
+        <w:spacing w:after="0" w:line="240" w:lineRule="auto"/>
+        <w:rPr>
+          <w:rFonts w:ascii="Courier New" w:eastAsia="Times New Roman" w:hAnsi="Courier New" w:cs="Courier New"/>
+          <w:sz w:val="20"/>
+          <w:szCs w:val="20"/>
+        </w:rPr>
+      </w:pPr>
+      <w:r>
+        <w:rPr>
+          <w:rFonts w:ascii="Courier New" w:eastAsia="Times New Roman" w:hAnsi="Courier New" w:cs="Courier New"/>
+          <w:sz w:val="20"/>
+          <w:szCs w:val="20"/>
+        </w:rPr>
+        <w:t xml:space="preserve">            </w:t>
+      </w:r>
+      <w:proofErr w:type="gramStart"/>
+      <w:r>
+        <w:rPr>
+          <w:rFonts w:ascii="Courier New" w:eastAsia="Times New Roman" w:hAnsi="Courier New" w:cs="Courier New"/>
+          <w:color w:val="9334E6"/>
+          <w:sz w:val="20"/>
+          <w:szCs w:val="20"/>
+        </w:rPr>
+        <w:t>return</w:t>
+      </w:r>
+      <w:proofErr w:type="gramEnd"/>
+      <w:r>
+        <w:rPr>
+          <w:rFonts w:ascii="Courier New" w:eastAsia="Times New Roman" w:hAnsi="Courier New" w:cs="Courier New"/>
+          <w:sz w:val="20"/>
+          <w:szCs w:val="20"/>
+        </w:rPr>
+        <w:t xml:space="preserve"> </w:t>
+      </w:r>
+      <w:proofErr w:type="spellStart"/>
+      <w:r>
+        <w:rPr>
+          <w:rFonts w:ascii="Courier New" w:eastAsia="Times New Roman" w:hAnsi="Courier New" w:cs="Courier New"/>
+          <w:sz w:val="20"/>
+          <w:szCs w:val="20"/>
+        </w:rPr>
+        <w:t>caches.delete</w:t>
+      </w:r>
+      <w:proofErr w:type="spellEnd"/>
+      <w:r>
+        <w:rPr>
+          <w:rFonts w:ascii="Courier New" w:eastAsia="Times New Roman" w:hAnsi="Courier New" w:cs="Courier New"/>
+          <w:sz w:val="20"/>
+          <w:szCs w:val="20"/>
+        </w:rPr>
+        <w:t xml:space="preserve">(key); </w:t>
+      </w:r>
+      <w:r>
+        <w:rPr>
+          <w:rFonts w:ascii="Courier New" w:eastAsia="Times New Roman" w:hAnsi="Courier New" w:cs="Courier New"/>
+          <w:i/>
+          <w:iCs/>
+          <w:color w:val="80868B"/>
+          <w:sz w:val="20"/>
+          <w:szCs w:val="20"/>
+        </w:rPr>
+        <w:t>// Automatically purge the old v1 cache</w:t>
+      </w:r>
+    </w:p>
+    <w:p>
+      <w:pPr>
+        <w:shd w:val="clear" w:color="auto" w:fill="F4F6F7"/>
+        <w:tabs>
+          <w:tab w:val="left" w:pos="916"/>
+          <w:tab w:val="left" w:pos="1832"/>
+          <w:tab w:val="left" w:pos="2748"/>
+          <w:tab w:val="left" w:pos="3664"/>
+          <w:tab w:val="left" w:pos="4580"/>
+          <w:tab w:val="left" w:pos="5496"/>
+          <w:tab w:val="left" w:pos="6412"/>
+          <w:tab w:val="left" w:pos="7328"/>
+          <w:tab w:val="left" w:pos="8244"/>
+          <w:tab w:val="left" w:pos="9160"/>
+          <w:tab w:val="left" w:pos="10076"/>
+          <w:tab w:val="left" w:pos="10992"/>
+          <w:tab w:val="left" w:pos="11908"/>
+          <w:tab w:val="left" w:pos="12824"/>
+          <w:tab w:val="left" w:pos="13740"/>
+          <w:tab w:val="left" w:pos="14656"/>
+        </w:tabs>
+        <w:spacing w:after="0" w:line="240" w:lineRule="auto"/>
+        <w:rPr>
+          <w:rFonts w:ascii="Courier New" w:eastAsia="Times New Roman" w:hAnsi="Courier New" w:cs="Courier New"/>
+          <w:sz w:val="20"/>
+          <w:szCs w:val="20"/>
+        </w:rPr>
+      </w:pPr>
+      <w:r>
+        <w:rPr>
+          <w:rFonts w:ascii="Courier New" w:eastAsia="Times New Roman" w:hAnsi="Courier New" w:cs="Courier New"/>
+          <w:sz w:val="20"/>
+          <w:szCs w:val="20"/>
+        </w:rPr>
+        <w:t xml:space="preserve">          }</w:t>
+      </w:r>
+    </w:p>
+    <w:p>
+      <w:pPr>
+        <w:shd w:val="clear" w:color="auto" w:fill="F4F6F7"/>
+        <w:tabs>
+          <w:tab w:val="left" w:pos="916"/>
+          <w:tab w:val="left" w:pos="1832"/>
+          <w:tab w:val="left" w:pos="2748"/>
+          <w:tab w:val="left" w:pos="3664"/>
+          <w:tab w:val="left" w:pos="4580"/>
+          <w:tab w:val="left" w:pos="5496"/>
+          <w:tab w:val="left" w:pos="6412"/>
+          <w:tab w:val="left" w:pos="7328"/>
+          <w:tab w:val="left" w:pos="8244"/>
+          <w:tab w:val="left" w:pos="9160"/>
+          <w:tab w:val="left" w:pos="10076"/>
+          <w:tab w:val="left" w:pos="10992"/>
+          <w:tab w:val="left" w:pos="11908"/>
+          <w:tab w:val="left" w:pos="12824"/>
+          <w:tab w:val="left" w:pos="13740"/>
+          <w:tab w:val="left" w:pos="14656"/>
+        </w:tabs>
+        <w:spacing w:after="0" w:line="240" w:lineRule="auto"/>
+        <w:rPr>
+          <w:rFonts w:ascii="Courier New" w:eastAsia="Times New Roman" w:hAnsi="Courier New" w:cs="Courier New"/>
+          <w:sz w:val="20"/>
+          <w:szCs w:val="20"/>
+        </w:rPr>
+      </w:pPr>
+      <w:r>
+        <w:rPr>
+          <w:rFonts w:ascii="Courier New" w:eastAsia="Times New Roman" w:hAnsi="Courier New" w:cs="Courier New"/>
+          <w:sz w:val="20"/>
+          <w:szCs w:val="20"/>
+        </w:rPr>
+        <w:t xml:space="preserve">        })</w:t>
+      </w:r>
+    </w:p>
+    <w:p>
+      <w:pPr>
+        <w:shd w:val="clear" w:color="auto" w:fill="F4F6F7"/>
+        <w:tabs>
+          <w:tab w:val="left" w:pos="916"/>
+          <w:tab w:val="left" w:pos="1832"/>
+          <w:tab w:val="left" w:pos="2748"/>
+          <w:tab w:val="left" w:pos="3664"/>
+          <w:tab w:val="left" w:pos="4580"/>
+          <w:tab w:val="left" w:pos="5496"/>
+          <w:tab w:val="left" w:pos="6412"/>
+          <w:tab w:val="left" w:pos="7328"/>
+          <w:tab w:val="left" w:pos="8244"/>
+          <w:tab w:val="left" w:pos="9160"/>
+          <w:tab w:val="left" w:pos="10076"/>
+          <w:tab w:val="left" w:pos="10992"/>
+          <w:tab w:val="left" w:pos="11908"/>
+          <w:tab w:val="left" w:pos="12824"/>
+          <w:tab w:val="left" w:pos="13740"/>
+          <w:tab w:val="left" w:pos="14656"/>
+        </w:tabs>
+        <w:spacing w:after="0" w:line="240" w:lineRule="auto"/>
+        <w:rPr>
+          <w:rFonts w:ascii="Courier New" w:eastAsia="Times New Roman" w:hAnsi="Courier New" w:cs="Courier New"/>
+          <w:sz w:val="20"/>
+          <w:szCs w:val="20"/>
+        </w:rPr>
+      </w:pPr>
+      <w:r>
+        <w:rPr>
+          <w:rFonts w:ascii="Courier New" w:eastAsia="Times New Roman" w:hAnsi="Courier New" w:cs="Courier New"/>
+          <w:sz w:val="20"/>
+          <w:szCs w:val="20"/>
+        </w:rPr>
+        <w:t xml:space="preserve">      );</w:t>
+      </w:r>
+    </w:p>
+    <w:p>
+      <w:pPr>
+        <w:shd w:val="clear" w:color="auto" w:fill="F4F6F7"/>
+        <w:tabs>
+          <w:tab w:val="left" w:pos="916"/>
+          <w:tab w:val="left" w:pos="1832"/>
+          <w:tab w:val="left" w:pos="2748"/>
+          <w:tab w:val="left" w:pos="3664"/>
+          <w:tab w:val="left" w:pos="4580"/>
+          <w:tab w:val="left" w:pos="5496"/>
+          <w:tab w:val="left" w:pos="6412"/>
+          <w:tab w:val="left" w:pos="7328"/>
+          <w:tab w:val="left" w:pos="8244"/>
+          <w:tab w:val="left" w:pos="9160"/>
+          <w:tab w:val="left" w:pos="10076"/>
+          <w:tab w:val="left" w:pos="10992"/>
+          <w:tab w:val="left" w:pos="11908"/>
+          <w:tab w:val="left" w:pos="12824"/>
+          <w:tab w:val="left" w:pos="13740"/>
+          <w:tab w:val="left" w:pos="14656"/>
+        </w:tabs>
+        <w:spacing w:after="0" w:line="240" w:lineRule="auto"/>
+        <w:rPr>
+          <w:rFonts w:ascii="Courier New" w:eastAsia="Times New Roman" w:hAnsi="Courier New" w:cs="Courier New"/>
+          <w:sz w:val="20"/>
+          <w:szCs w:val="20"/>
+        </w:rPr>
+      </w:pPr>
+      <w:r>
+        <w:rPr>
+          <w:rFonts w:ascii="Courier New" w:eastAsia="Times New Roman" w:hAnsi="Courier New" w:cs="Courier New"/>
+          <w:sz w:val="20"/>
+          <w:szCs w:val="20"/>
+        </w:rPr>
+        <w:t xml:space="preserve">    }).</w:t>
+      </w:r>
+      <w:proofErr w:type="gramStart"/>
+      <w:r>
+        <w:rPr>
+          <w:rFonts w:ascii="Courier New" w:eastAsia="Times New Roman" w:hAnsi="Courier New" w:cs="Courier New"/>
+          <w:sz w:val="20"/>
+          <w:szCs w:val="20"/>
+        </w:rPr>
+        <w:t>then(</w:t>
+      </w:r>
+      <w:proofErr w:type="gramEnd"/>
+      <w:r>
+        <w:rPr>
+          <w:rFonts w:ascii="Courier New" w:eastAsia="Times New Roman" w:hAnsi="Courier New" w:cs="Courier New"/>
+          <w:sz w:val="20"/>
+          <w:szCs w:val="20"/>
+        </w:rPr>
+        <w:t xml:space="preserve">() =&gt; </w:t>
+      </w:r>
+      <w:proofErr w:type="spellStart"/>
+      <w:r>
+        <w:rPr>
+          <w:rFonts w:ascii="Courier New" w:eastAsia="Times New Roman" w:hAnsi="Courier New" w:cs="Courier New"/>
+          <w:sz w:val="20"/>
+          <w:szCs w:val="20"/>
+        </w:rPr>
+        <w:t>self.clients.claim</w:t>
+      </w:r>
+      <w:proofErr w:type="spellEnd"/>
+      <w:r>
+        <w:rPr>
+          <w:rFonts w:ascii="Courier New" w:eastAsia="Times New Roman" w:hAnsi="Courier New" w:cs="Courier New"/>
+          <w:sz w:val="20"/>
+          <w:szCs w:val="20"/>
+        </w:rPr>
+        <w:t>())</w:t>
+      </w:r>
+    </w:p>
+    <w:p>
+      <w:pPr>
+        <w:shd w:val="clear" w:color="auto" w:fill="F4F6F7"/>
+        <w:tabs>
+          <w:tab w:val="left" w:pos="916"/>
+          <w:tab w:val="left" w:pos="1832"/>
+          <w:tab w:val="left" w:pos="2748"/>
+          <w:tab w:val="left" w:pos="3664"/>
+          <w:tab w:val="left" w:pos="4580"/>
+          <w:tab w:val="left" w:pos="5496"/>
+          <w:tab w:val="left" w:pos="6412"/>
+          <w:tab w:val="left" w:pos="7328"/>
+          <w:tab w:val="left" w:pos="8244"/>
+          <w:tab w:val="left" w:pos="9160"/>
+          <w:tab w:val="left" w:pos="10076"/>
+          <w:tab w:val="left" w:pos="10992"/>
+          <w:tab w:val="left" w:pos="11908"/>
+          <w:tab w:val="left" w:pos="12824"/>
+          <w:tab w:val="left" w:pos="13740"/>
+          <w:tab w:val="left" w:pos="14656"/>
+        </w:tabs>
+        <w:spacing w:after="0" w:line="240" w:lineRule="auto"/>
+        <w:rPr>
+          <w:rFonts w:ascii="Courier New" w:eastAsia="Times New Roman" w:hAnsi="Courier New" w:cs="Courier New"/>
+          <w:sz w:val="20"/>
+          <w:szCs w:val="20"/>
+        </w:rPr>
+      </w:pPr>
+      <w:r>
+        <w:rPr>
+          <w:rFonts w:ascii="Courier New" w:eastAsia="Times New Roman" w:hAnsi="Courier New" w:cs="Courier New"/>
+          <w:sz w:val="20"/>
+          <w:szCs w:val="20"/>
+        </w:rPr>
+        <w:t xml:space="preserve">  );</w:t>
+      </w:r>
+    </w:p>
+    <w:p>
+      <w:pPr>
+        <w:shd w:val="clear" w:color="auto" w:fill="F4F6F7"/>
+        <w:tabs>
+          <w:tab w:val="left" w:pos="916"/>
+          <w:tab w:val="left" w:pos="1832"/>
+          <w:tab w:val="left" w:pos="2748"/>
+          <w:tab w:val="left" w:pos="3664"/>
+          <w:tab w:val="left" w:pos="4580"/>
+          <w:tab w:val="left" w:pos="5496"/>
+          <w:tab w:val="left" w:pos="6412"/>
+          <w:tab w:val="left" w:pos="7328"/>
+          <w:tab w:val="left" w:pos="8244"/>
+          <w:tab w:val="left" w:pos="9160"/>
+          <w:tab w:val="left" w:pos="10076"/>
+          <w:tab w:val="left" w:pos="10992"/>
+          <w:tab w:val="left" w:pos="11908"/>
+          <w:tab w:val="left" w:pos="12824"/>
+          <w:tab w:val="left" w:pos="13740"/>
+          <w:tab w:val="left" w:pos="14656"/>
+        </w:tabs>
+        <w:spacing w:after="0" w:line="240" w:lineRule="auto"/>
+        <w:rPr>
+          <w:rFonts w:ascii="Courier New" w:eastAsia="Times New Roman" w:hAnsi="Courier New" w:cs="Courier New"/>
+          <w:sz w:val="20"/>
+          <w:szCs w:val="20"/>
+        </w:rPr>
+      </w:pPr>
+      <w:r>
+        <w:rPr>
+          <w:rFonts w:ascii="Courier New" w:eastAsia="Times New Roman" w:hAnsi="Courier New" w:cs="Courier New"/>
+          <w:sz w:val="20"/>
+          <w:szCs w:val="20"/>
+        </w:rPr>
+        <w:t>});</w:t>
+      </w:r>
+    </w:p>
+    <w:p>
+      <w:pPr>
+        <w:shd w:val="clear" w:color="auto" w:fill="F4F6F7"/>
+        <w:tabs>
+          <w:tab w:val="left" w:pos="916"/>
+          <w:tab w:val="left" w:pos="1832"/>
+          <w:tab w:val="left" w:pos="2748"/>
+          <w:tab w:val="left" w:pos="3664"/>
+          <w:tab w:val="left" w:pos="4580"/>
+          <w:tab w:val="left" w:pos="5496"/>
+          <w:tab w:val="left" w:pos="6412"/>
+          <w:tab w:val="left" w:pos="7328"/>
+          <w:tab w:val="left" w:pos="8244"/>
+          <w:tab w:val="left" w:pos="9160"/>
+          <w:tab w:val="left" w:pos="10076"/>
+          <w:tab w:val="left" w:pos="10992"/>
+          <w:tab w:val="left" w:pos="11908"/>
+          <w:tab w:val="left" w:pos="12824"/>
+          <w:tab w:val="left" w:pos="13740"/>
+          <w:tab w:val="left" w:pos="14656"/>
+        </w:tabs>
+        <w:spacing w:after="0" w:line="240" w:lineRule="auto"/>
+        <w:rPr>
+          <w:rFonts w:ascii="Courier New" w:eastAsia="Times New Roman" w:hAnsi="Courier New" w:cs="Courier New"/>
+          <w:sz w:val="20"/>
+          <w:szCs w:val="20"/>
+        </w:rPr>
+      </w:pPr>
+    </w:p>
+    <w:p>
+      <w:pPr>
+        <w:shd w:val="clear" w:color="auto" w:fill="F4F6F7"/>
+        <w:tabs>
+          <w:tab w:val="left" w:pos="916"/>
+          <w:tab w:val="left" w:pos="1832"/>
+          <w:tab w:val="left" w:pos="2748"/>
+          <w:tab w:val="left" w:pos="3664"/>
+          <w:tab w:val="left" w:pos="4580"/>
+          <w:tab w:val="left" w:pos="5496"/>
+          <w:tab w:val="left" w:pos="6412"/>
+          <w:tab w:val="left" w:pos="7328"/>
+          <w:tab w:val="left" w:pos="8244"/>
+          <w:tab w:val="left" w:pos="9160"/>
+          <w:tab w:val="left" w:pos="10076"/>
+          <w:tab w:val="left" w:pos="10992"/>
+          <w:tab w:val="left" w:pos="11908"/>
+          <w:tab w:val="left" w:pos="12824"/>
+          <w:tab w:val="left" w:pos="13740"/>
+          <w:tab w:val="left" w:pos="14656"/>
+        </w:tabs>
+        <w:spacing w:after="0" w:line="240" w:lineRule="auto"/>
+        <w:rPr>
+          <w:rFonts w:ascii="Courier New" w:eastAsia="Times New Roman" w:hAnsi="Courier New" w:cs="Courier New"/>
+          <w:sz w:val="20"/>
+          <w:szCs w:val="20"/>
+        </w:rPr>
+      </w:pPr>
+      <w:proofErr w:type="spellStart"/>
+      <w:proofErr w:type="gramStart"/>
+      <w:r>
+        <w:rPr>
+          <w:rFonts w:ascii="Courier New" w:eastAsia="Times New Roman" w:hAnsi="Courier New" w:cs="Courier New"/>
+          <w:sz w:val="20"/>
+          <w:szCs w:val="20"/>
+        </w:rPr>
+        <w:t>self.addEventListener</w:t>
+      </w:r>
+      <w:proofErr w:type="spellEnd"/>
+      <w:r>
+        <w:rPr>
+          <w:rFonts w:ascii="Courier New" w:eastAsia="Times New Roman" w:hAnsi="Courier New" w:cs="Courier New"/>
+          <w:sz w:val="20"/>
+          <w:szCs w:val="20"/>
+        </w:rPr>
+        <w:t>(</w:t>
+      </w:r>
+      <w:proofErr w:type="gramEnd"/>
+      <w:r>
+        <w:rPr>
+          <w:rFonts w:ascii="Courier New" w:eastAsia="Times New Roman" w:hAnsi="Courier New" w:cs="Courier New"/>
+          <w:color w:val="188038"/>
+          <w:sz w:val="20"/>
+          <w:szCs w:val="20"/>
+        </w:rPr>
+        <w:t>'fetch'</w:t>
+      </w:r>
+      <w:r>
+        <w:rPr>
+          <w:rFonts w:ascii="Courier New" w:eastAsia="Times New Roman" w:hAnsi="Courier New" w:cs="Courier New"/>
+          <w:sz w:val="20"/>
+          <w:szCs w:val="20"/>
+        </w:rPr>
+        <w:t>, e =&gt; {</w:t>
+      </w:r>
+    </w:p>
+    <w:p>
+      <w:pPr>
+        <w:shd w:val="clear" w:color="auto" w:fill="F4F6F7"/>
+        <w:tabs>
+          <w:tab w:val="left" w:pos="916"/>
+          <w:tab w:val="left" w:pos="1832"/>
+          <w:tab w:val="left" w:pos="2748"/>
+          <w:tab w:val="left" w:pos="3664"/>
+          <w:tab w:val="left" w:pos="4580"/>
+          <w:tab w:val="left" w:pos="5496"/>
+          <w:tab w:val="left" w:pos="6412"/>
+          <w:tab w:val="left" w:pos="7328"/>
+          <w:tab w:val="left" w:pos="8244"/>
+          <w:tab w:val="left" w:pos="9160"/>
+          <w:tab w:val="left" w:pos="10076"/>
+          <w:tab w:val="left" w:pos="10992"/>
+          <w:tab w:val="left" w:pos="11908"/>
+          <w:tab w:val="left" w:pos="12824"/>
+          <w:tab w:val="left" w:pos="13740"/>
+          <w:tab w:val="left" w:pos="14656"/>
+        </w:tabs>
+        <w:spacing w:after="0" w:line="240" w:lineRule="auto"/>
+        <w:rPr>
+          <w:rFonts w:ascii="Courier New" w:eastAsia="Times New Roman" w:hAnsi="Courier New" w:cs="Courier New"/>
+          <w:sz w:val="20"/>
+          <w:szCs w:val="20"/>
+        </w:rPr>
+      </w:pPr>
+      <w:r>
+        <w:rPr>
+          <w:rFonts w:ascii="Courier New" w:eastAsia="Times New Roman" w:hAnsi="Courier New" w:cs="Courier New"/>
+          <w:sz w:val="20"/>
+          <w:szCs w:val="20"/>
+        </w:rPr>
+        <w:t xml:space="preserve">  </w:t>
+      </w:r>
+      <w:proofErr w:type="spellStart"/>
+      <w:proofErr w:type="gramStart"/>
+      <w:r>
+        <w:rPr>
+          <w:rFonts w:ascii="Courier New" w:eastAsia="Times New Roman" w:hAnsi="Courier New" w:cs="Courier New"/>
+          <w:sz w:val="20"/>
+          <w:szCs w:val="20"/>
+        </w:rPr>
+        <w:t>e.respondWith</w:t>
+      </w:r>
+      <w:proofErr w:type="spellEnd"/>
+      <w:r>
+        <w:rPr>
+          <w:rFonts w:ascii="Courier New" w:eastAsia="Times New Roman" w:hAnsi="Courier New" w:cs="Courier New"/>
+          <w:sz w:val="20"/>
+          <w:szCs w:val="20"/>
+        </w:rPr>
+        <w:t>(</w:t>
+      </w:r>
+      <w:proofErr w:type="gramEnd"/>
+    </w:p>
+    <w:p>
+      <w:pPr>
+        <w:shd w:val="clear" w:color="auto" w:fill="F4F6F7"/>
+        <w:tabs>
+          <w:tab w:val="left" w:pos="916"/>
+          <w:tab w:val="left" w:pos="1832"/>
+          <w:tab w:val="left" w:pos="2748"/>
+          <w:tab w:val="left" w:pos="3664"/>
+          <w:tab w:val="left" w:pos="4580"/>
+          <w:tab w:val="left" w:pos="5496"/>
+          <w:tab w:val="left" w:pos="6412"/>
+          <w:tab w:val="left" w:pos="7328"/>
+          <w:tab w:val="left" w:pos="8244"/>
+          <w:tab w:val="left" w:pos="9160"/>
+          <w:tab w:val="left" w:pos="10076"/>
+          <w:tab w:val="left" w:pos="10992"/>
+          <w:tab w:val="left" w:pos="11908"/>
+          <w:tab w:val="left" w:pos="12824"/>
+          <w:tab w:val="left" w:pos="13740"/>
+          <w:tab w:val="left" w:pos="14656"/>
+        </w:tabs>
+        <w:spacing w:after="0" w:line="240" w:lineRule="auto"/>
+        <w:rPr>
+          <w:rFonts w:ascii="Courier New" w:eastAsia="Times New Roman" w:hAnsi="Courier New" w:cs="Courier New"/>
+          <w:sz w:val="20"/>
+          <w:szCs w:val="20"/>
+        </w:rPr>
+      </w:pPr>
+      <w:r>
+        <w:rPr>
+          <w:rFonts w:ascii="Courier New" w:eastAsia="Times New Roman" w:hAnsi="Courier New" w:cs="Courier New"/>
+          <w:sz w:val="20"/>
+          <w:szCs w:val="20"/>
+        </w:rPr>
+        <w:t xml:space="preserve">    </w:t>
+      </w:r>
+      <w:proofErr w:type="spellStart"/>
+      <w:proofErr w:type="gramStart"/>
+      <w:r>
+        <w:rPr>
+          <w:rFonts w:ascii="Courier New" w:eastAsia="Times New Roman" w:hAnsi="Courier New" w:cs="Courier New"/>
+          <w:sz w:val="20"/>
+          <w:szCs w:val="20"/>
+        </w:rPr>
+        <w:t>caches.match</w:t>
+      </w:r>
+      <w:proofErr w:type="spellEnd"/>
+      <w:r>
+        <w:rPr>
+          <w:rFonts w:ascii="Courier New" w:eastAsia="Times New Roman" w:hAnsi="Courier New" w:cs="Courier New"/>
+          <w:sz w:val="20"/>
+          <w:szCs w:val="20"/>
+        </w:rPr>
+        <w:t>(</w:t>
+      </w:r>
+      <w:proofErr w:type="spellStart"/>
+      <w:proofErr w:type="gramEnd"/>
+      <w:r>
+        <w:rPr>
+          <w:rFonts w:ascii="Courier New" w:eastAsia="Times New Roman" w:hAnsi="Courier New" w:cs="Courier New"/>
+          <w:sz w:val="20"/>
+          <w:szCs w:val="20"/>
+        </w:rPr>
+        <w:t>e.request</w:t>
+      </w:r>
+      <w:proofErr w:type="spellEnd"/>
+      <w:r>
+        <w:rPr>
+          <w:rFonts w:ascii="Courier New" w:eastAsia="Times New Roman" w:hAnsi="Courier New" w:cs="Courier New"/>
+          <w:sz w:val="20"/>
+          <w:szCs w:val="20"/>
+        </w:rPr>
+        <w:t>).then(response =&gt; {</w:t>
+      </w:r>
+    </w:p>
+    <w:p>
+      <w:pPr>
+        <w:shd w:val="clear" w:color="auto" w:fill="F4F6F7"/>
+        <w:tabs>
+          <w:tab w:val="left" w:pos="916"/>
+          <w:tab w:val="left" w:pos="1832"/>
+          <w:tab w:val="left" w:pos="2748"/>
+          <w:tab w:val="left" w:pos="3664"/>
+          <w:tab w:val="left" w:pos="4580"/>
+          <w:tab w:val="left" w:pos="5496"/>
+          <w:tab w:val="left" w:pos="6412"/>
+          <w:tab w:val="left" w:pos="7328"/>
+          <w:tab w:val="left" w:pos="8244"/>
+          <w:tab w:val="left" w:pos="9160"/>
+          <w:tab w:val="left" w:pos="10076"/>
+          <w:tab w:val="left" w:pos="10992"/>
+          <w:tab w:val="left" w:pos="11908"/>
+          <w:tab w:val="left" w:pos="12824"/>
+          <w:tab w:val="left" w:pos="13740"/>
+          <w:tab w:val="left" w:pos="14656"/>
+        </w:tabs>
+        <w:spacing w:after="0" w:line="240" w:lineRule="auto"/>
+        <w:rPr>
+          <w:rFonts w:ascii="Courier New" w:eastAsia="Times New Roman" w:hAnsi="Courier New" w:cs="Courier New"/>
+          <w:sz w:val="20"/>
+          <w:szCs w:val="20"/>
+        </w:rPr>
+      </w:pPr>
+      <w:r>
+        <w:rPr>
+          <w:rFonts w:ascii="Courier New" w:eastAsia="Times New Roman" w:hAnsi="Courier New" w:cs="Courier New"/>
+          <w:sz w:val="20"/>
+          <w:szCs w:val="20"/>
+        </w:rPr>
+        <w:t xml:space="preserve">      </w:t>
+      </w:r>
+      <w:proofErr w:type="gramStart"/>
+      <w:r>
+        <w:rPr>
+          <w:rFonts w:ascii="Courier New" w:eastAsia="Times New Roman" w:hAnsi="Courier New" w:cs="Courier New"/>
+          <w:color w:val="9334E6"/>
+          <w:sz w:val="20"/>
+          <w:szCs w:val="20"/>
+        </w:rPr>
+        <w:t>return</w:t>
+      </w:r>
+      <w:proofErr w:type="gramEnd"/>
+      <w:r>
+        <w:rPr>
+          <w:rFonts w:ascii="Courier New" w:eastAsia="Times New Roman" w:hAnsi="Courier New" w:cs="Courier New"/>
+          <w:sz w:val="20"/>
+          <w:szCs w:val="20"/>
+        </w:rPr>
+        <w:t xml:space="preserve"> response || fetch(</w:t>
+      </w:r>
+      <w:proofErr w:type="spellStart"/>
+      <w:r>
+        <w:rPr>
+          <w:rFonts w:ascii="Courier New" w:eastAsia="Times New Roman" w:hAnsi="Courier New" w:cs="Courier New"/>
+          <w:sz w:val="20"/>
+          <w:szCs w:val="20"/>
+        </w:rPr>
+        <w:t>e.request</w:t>
+      </w:r>
+      <w:proofErr w:type="spellEnd"/>
+      <w:r>
+        <w:rPr>
+          <w:rFonts w:ascii="Courier New" w:eastAsia="Times New Roman" w:hAnsi="Courier New" w:cs="Courier New"/>
+          <w:sz w:val="20"/>
+          <w:szCs w:val="20"/>
+        </w:rPr>
+        <w:t>);</w:t>
+      </w:r>
+    </w:p>
+    <w:p>
+      <w:pPr>
+        <w:shd w:val="clear" w:color="auto" w:fill="F4F6F7"/>
+        <w:tabs>
+          <w:tab w:val="left" w:pos="916"/>
+          <w:tab w:val="left" w:pos="1832"/>
+          <w:tab w:val="left" w:pos="2748"/>
+          <w:tab w:val="left" w:pos="3664"/>
+          <w:tab w:val="left" w:pos="4580"/>
+          <w:tab w:val="left" w:pos="5496"/>
+          <w:tab w:val="left" w:pos="6412"/>
+          <w:tab w:val="left" w:pos="7328"/>
+          <w:tab w:val="left" w:pos="8244"/>
+          <w:tab w:val="left" w:pos="9160"/>
+          <w:tab w:val="left" w:pos="10076"/>
+          <w:tab w:val="left" w:pos="10992"/>
+          <w:tab w:val="left" w:pos="11908"/>
+          <w:tab w:val="left" w:pos="12824"/>
+          <w:tab w:val="left" w:pos="13740"/>
+          <w:tab w:val="left" w:pos="14656"/>
+        </w:tabs>
+        <w:spacing w:after="0" w:line="240" w:lineRule="auto"/>
+        <w:rPr>
+          <w:rFonts w:ascii="Courier New" w:eastAsia="Times New Roman" w:hAnsi="Courier New" w:cs="Courier New"/>
+          <w:sz w:val="20"/>
+          <w:szCs w:val="20"/>
+        </w:rPr>
+      </w:pPr>
+      <w:r>
+        <w:rPr>
+          <w:rFonts w:ascii="Courier New" w:eastAsia="Times New Roman" w:hAnsi="Courier New" w:cs="Courier New"/>
+          <w:sz w:val="20"/>
+          <w:szCs w:val="20"/>
+        </w:rPr>
+        <w:t xml:space="preserve">    })</w:t>
+      </w:r>
+    </w:p>
+    <w:p>
+      <w:pPr>
+        <w:shd w:val="clear" w:color="auto" w:fill="F4F6F7"/>
+        <w:tabs>
+          <w:tab w:val="left" w:pos="916"/>
+          <w:tab w:val="left" w:pos="1832"/>
+          <w:tab w:val="left" w:pos="2748"/>
+          <w:tab w:val="left" w:pos="3664"/>
+          <w:tab w:val="left" w:pos="4580"/>
+          <w:tab w:val="left" w:pos="5496"/>
+          <w:tab w:val="left" w:pos="6412"/>
+          <w:tab w:val="left" w:pos="7328"/>
+          <w:tab w:val="left" w:pos="8244"/>
+          <w:tab w:val="left" w:pos="9160"/>
+          <w:tab w:val="left" w:pos="10076"/>
+          <w:tab w:val="left" w:pos="10992"/>
+          <w:tab w:val="left" w:pos="11908"/>
+          <w:tab w:val="left" w:pos="12824"/>
+          <w:tab w:val="left" w:pos="13740"/>
+          <w:tab w:val="left" w:pos="14656"/>
+        </w:tabs>
+        <w:spacing w:after="0" w:line="240" w:lineRule="auto"/>
+        <w:rPr>
+          <w:rFonts w:ascii="Courier New" w:eastAsia="Times New Roman" w:hAnsi="Courier New" w:cs="Courier New"/>
+          <w:sz w:val="20"/>
+          <w:szCs w:val="20"/>
+        </w:rPr>
+      </w:pPr>
+      <w:r>
+        <w:rPr>
+          <w:rFonts w:ascii="Courier New" w:eastAsia="Times New Roman" w:hAnsi="Courier New" w:cs="Courier New"/>
+          <w:sz w:val="20"/>
+          <w:szCs w:val="20"/>
+        </w:rPr>
+        <w:t xml:space="preserve">  );</w:t>
+      </w:r>
+    </w:p>
+    <w:p>
+      <w:pPr>
+        <w:shd w:val="clear" w:color="auto" w:fill="F4F6F7"/>
+        <w:tabs>
+          <w:tab w:val="left" w:pos="916"/>
+          <w:tab w:val="left" w:pos="1832"/>
+          <w:tab w:val="left" w:pos="2748"/>
+          <w:tab w:val="left" w:pos="3664"/>
+          <w:tab w:val="left" w:pos="4580"/>
+          <w:tab w:val="left" w:pos="5496"/>
+          <w:tab w:val="left" w:pos="6412"/>
+          <w:tab w:val="left" w:pos="7328"/>
+          <w:tab w:val="left" w:pos="8244"/>
+          <w:tab w:val="left" w:pos="9160"/>
+          <w:tab w:val="left" w:pos="10076"/>
+          <w:tab w:val="left" w:pos="10992"/>
+          <w:tab w:val="left" w:pos="11908"/>
+          <w:tab w:val="left" w:pos="12824"/>
+          <w:tab w:val="left" w:pos="13740"/>
+          <w:tab w:val="left" w:pos="14656"/>
+        </w:tabs>
+        <w:spacing w:after="0" w:line="240" w:lineRule="auto"/>
+        <w:rPr>
+          <w:rFonts w:ascii="Courier New" w:eastAsia="Times New Roman" w:hAnsi="Courier New" w:cs="Courier New"/>
+          <w:sz w:val="20"/>
+          <w:szCs w:val="20"/>
+        </w:rPr>
+      </w:pPr>
+      <w:r>
+        <w:rPr>
+          <w:rFonts w:ascii="Courier New" w:eastAsia="Times New Roman" w:hAnsi="Courier New" w:cs="Courier New"/>
+          <w:sz w:val="20"/>
+          <w:szCs w:val="20"/>
+        </w:rPr>
+        <w:t>});</w:t>
+      </w:r>
+    </w:p>
+    <w:p>
+      <w:pPr>
+        <w:spacing w:after="0" w:line="240" w:lineRule="auto"/>
+        <w:rPr>
+          <w:rFonts w:ascii="Times New Roman" w:eastAsia="Times New Roman" w:hAnsi="Times New Roman" w:cs="Times New Roman"/>
+          <w:sz w:val="24"/>
+          <w:szCs w:val="24"/>
+        </w:rPr>
+      </w:pPr>
+      <w:r>
+        <w:rPr>
+          <w:rFonts w:ascii="Times New Roman" w:eastAsia="Times New Roman" w:hAnsi="Times New Roman" w:cs="Times New Roman"/>
+          <w:sz w:val="24"/>
+          <w:szCs w:val="24"/>
+        </w:rPr>
+        <w:pict>
+          <v:rect id="_x0000_i1042" style="width:0;height:.75pt" o:hralign="center" o:hrstd="t" o:hr="t" fillcolor="#a0a0a0" stroked="f"/>
+        </w:pict>
+      </w:r>
+    </w:p>
+    <w:p>
+      <w:pPr>
+        <w:spacing w:line="240" w:lineRule="auto"/>
+        <w:rPr>
+          <w:rFonts w:ascii="Times New Roman" w:eastAsia="Times New Roman" w:hAnsi="Times New Roman" w:cs="Times New Roman"/>
+          <w:sz w:val="24"/>
+          <w:szCs w:val="24"/>
+        </w:rPr>
+      </w:pPr>
+      <w:r>
+        <w:rPr>
+          <w:rFonts w:ascii="Times New Roman" w:eastAsia="Times New Roman" w:hAnsi="Times New Roman" w:cs="Times New Roman"/>
+          <w:sz w:val="24"/>
+          <w:szCs w:val="24"/>
+        </w:rPr>
+        <w:t>Once you have saved your file (</w:t>
+      </w:r>
+      <w:r>
+        <w:rPr>
+          <w:rFonts w:ascii="Courier New" w:eastAsia="Times New Roman" w:hAnsi="Courier New" w:cs="Courier New"/>
+          <w:sz w:val="20"/>
+          <w:szCs w:val="20"/>
+          <w:bdr w:val="single" w:sz="6" w:space="2" w:color="F4F6F7" w:frame="1"/>
+          <w:shd w:val="clear" w:color="auto" w:fill="F4F6F7"/>
+        </w:rPr>
+        <w:t>Ctrl + S</w:t>
+      </w:r>
+      <w:r>
+        <w:rPr>
+          <w:rFonts w:ascii="Times New Roman" w:eastAsia="Times New Roman" w:hAnsi="Times New Roman" w:cs="Times New Roman"/>
+          <w:sz w:val="24"/>
+          <w:szCs w:val="24"/>
+        </w:rPr>
+        <w:t xml:space="preserve"> or </w:t>
+      </w:r>
+      <w:proofErr w:type="spellStart"/>
+      <w:r>
+        <w:rPr>
+          <w:rFonts w:ascii="Courier New" w:eastAsia="Times New Roman" w:hAnsi="Courier New" w:cs="Courier New"/>
+          <w:sz w:val="20"/>
+          <w:szCs w:val="20"/>
+          <w:bdr w:val="single" w:sz="6" w:space="2" w:color="F4F6F7" w:frame="1"/>
+          <w:shd w:val="clear" w:color="auto" w:fill="F4F6F7"/>
+        </w:rPr>
+        <w:t>Cmd</w:t>
+      </w:r>
+      <w:proofErr w:type="spellEnd"/>
+      <w:r>
+        <w:rPr>
+          <w:rFonts w:ascii="Courier New" w:eastAsia="Times New Roman" w:hAnsi="Courier New" w:cs="Courier New"/>
+          <w:sz w:val="20"/>
+          <w:szCs w:val="20"/>
+          <w:bdr w:val="single" w:sz="6" w:space="2" w:color="F4F6F7" w:frame="1"/>
+          <w:shd w:val="clear" w:color="auto" w:fill="F4F6F7"/>
+        </w:rPr>
+        <w:t xml:space="preserve"> + S</w:t>
+      </w:r>
+      <w:r>
+        <w:rPr>
+          <w:rFonts w:ascii="Times New Roman" w:eastAsia="Times New Roman" w:hAnsi="Times New Roman" w:cs="Times New Roman"/>
+          <w:sz w:val="24"/>
+          <w:szCs w:val="24"/>
+        </w:rPr>
+        <w:t>), open your VS Code terminal panel (`Ctrl + ``) and run these three quick commands to deploy the update live to your website:</w:t>
+      </w:r>
+    </w:p>
+    <w:p>
+      <w:pPr>
+        <w:shd w:val="clear" w:color="auto" w:fill="F4F6F7"/>
+        <w:tabs>
+          <w:tab w:val="left" w:pos="916"/>
+          <w:tab w:val="left" w:pos="1832"/>
+          <w:tab w:val="left" w:pos="2748"/>
+          <w:tab w:val="left" w:pos="3664"/>
+          <w:tab w:val="left" w:pos="4580"/>
+          <w:tab w:val="left" w:pos="5496"/>
+          <w:tab w:val="left" w:pos="6412"/>
+          <w:tab w:val="left" w:pos="7328"/>
+          <w:tab w:val="left" w:pos="8244"/>
+          <w:tab w:val="left" w:pos="9160"/>
+          <w:tab w:val="left" w:pos="10076"/>
+          <w:tab w:val="left" w:pos="10992"/>
+          <w:tab w:val="left" w:pos="11908"/>
+          <w:tab w:val="left" w:pos="12824"/>
+          <w:tab w:val="left" w:pos="13740"/>
+          <w:tab w:val="left" w:pos="14656"/>
+        </w:tabs>
+        <w:spacing w:after="0" w:line="240" w:lineRule="auto"/>
+        <w:rPr>
+          <w:rFonts w:ascii="Courier New" w:eastAsia="Times New Roman" w:hAnsi="Courier New" w:cs="Courier New"/>
+          <w:sz w:val="20"/>
+          <w:szCs w:val="20"/>
+        </w:rPr>
+      </w:pPr>
+      <w:proofErr w:type="spellStart"/>
+      <w:proofErr w:type="gramStart"/>
+      <w:r>
+        <w:rPr>
+          <w:rFonts w:ascii="Courier New" w:eastAsia="Times New Roman" w:hAnsi="Courier New" w:cs="Courier New"/>
+          <w:sz w:val="20"/>
+          <w:szCs w:val="20"/>
+        </w:rPr>
+        <w:t>git</w:t>
+      </w:r>
+      <w:proofErr w:type="spellEnd"/>
+      <w:proofErr w:type="gramEnd"/>
+      <w:r>
+        <w:rPr>
+          <w:rFonts w:ascii="Courier New" w:eastAsia="Times New Roman" w:hAnsi="Courier New" w:cs="Courier New"/>
+          <w:sz w:val="20"/>
+          <w:szCs w:val="20"/>
+        </w:rPr>
+        <w:t xml:space="preserve"> add sw.js</w:t>
+      </w:r>
+    </w:p>
+    <w:p>
+      <w:pPr>
+        <w:shd w:val="clear" w:color="auto" w:fill="F4F6F7"/>
+        <w:tabs>
+          <w:tab w:val="left" w:pos="916"/>
+          <w:tab w:val="left" w:pos="1832"/>
+          <w:tab w:val="left" w:pos="2748"/>
+          <w:tab w:val="left" w:pos="3664"/>
+          <w:tab w:val="left" w:pos="4580"/>
+          <w:tab w:val="left" w:pos="5496"/>
+          <w:tab w:val="left" w:pos="6412"/>
+          <w:tab w:val="left" w:pos="7328"/>
+          <w:tab w:val="left" w:pos="8244"/>
+          <w:tab w:val="left" w:pos="9160"/>
+          <w:tab w:val="left" w:pos="10076"/>
+          <w:tab w:val="left" w:pos="10992"/>
+          <w:tab w:val="left" w:pos="11908"/>
+          <w:tab w:val="left" w:pos="12824"/>
+          <w:tab w:val="left" w:pos="13740"/>
+          <w:tab w:val="left" w:pos="14656"/>
+        </w:tabs>
+        <w:spacing w:after="0" w:line="240" w:lineRule="auto"/>
+        <w:rPr>
+          <w:rFonts w:ascii="Courier New" w:eastAsia="Times New Roman" w:hAnsi="Courier New" w:cs="Courier New"/>
+          <w:sz w:val="20"/>
+          <w:szCs w:val="20"/>
+        </w:rPr>
+      </w:pPr>
+      <w:proofErr w:type="spellStart"/>
+      <w:proofErr w:type="gramStart"/>
+      <w:r>
+        <w:rPr>
+          <w:rFonts w:ascii="Courier New" w:eastAsia="Times New Roman" w:hAnsi="Courier New" w:cs="Courier New"/>
+          <w:sz w:val="20"/>
+          <w:szCs w:val="20"/>
+        </w:rPr>
+        <w:t>git</w:t>
+      </w:r>
+      <w:proofErr w:type="spellEnd"/>
+      <w:proofErr w:type="gramEnd"/>
+      <w:r>
+        <w:rPr>
+          <w:rFonts w:ascii="Courier New" w:eastAsia="Times New Roman" w:hAnsi="Courier New" w:cs="Courier New"/>
+          <w:sz w:val="20"/>
+          <w:szCs w:val="20"/>
+        </w:rPr>
+        <w:t xml:space="preserve"> commit -m </w:t>
+      </w:r>
+      <w:r>
+        <w:rPr>
+          <w:rFonts w:ascii="Courier New" w:eastAsia="Times New Roman" w:hAnsi="Courier New" w:cs="Courier New"/>
+          <w:color w:val="188038"/>
+          <w:sz w:val="20"/>
+          <w:szCs w:val="20"/>
+        </w:rPr>
+        <w:t xml:space="preserve">"Fix service worker paths for </w:t>
+      </w:r>
+      <w:proofErr w:type="spellStart"/>
+      <w:r>
+        <w:rPr>
+          <w:rFonts w:ascii="Courier New" w:eastAsia="Times New Roman" w:hAnsi="Courier New" w:cs="Courier New"/>
+          <w:color w:val="188038"/>
+          <w:sz w:val="20"/>
+          <w:szCs w:val="20"/>
+        </w:rPr>
+        <w:t>GitHub</w:t>
+      </w:r>
+      <w:proofErr w:type="spellEnd"/>
+      <w:r>
+        <w:rPr>
+          <w:rFonts w:ascii="Courier New" w:eastAsia="Times New Roman" w:hAnsi="Courier New" w:cs="Courier New"/>
+          <w:color w:val="188038"/>
+          <w:sz w:val="20"/>
+          <w:szCs w:val="20"/>
+        </w:rPr>
+        <w:t xml:space="preserve"> Pages subfolder"</w:t>
+      </w:r>
+    </w:p>
+    <w:p>
+      <w:pPr>
+        <w:shd w:val="clear" w:color="auto" w:fill="F4F6F7"/>
+        <w:tabs>
+          <w:tab w:val="left" w:pos="916"/>
+          <w:tab w:val="left" w:pos="1832"/>
+          <w:tab w:val="left" w:pos="2748"/>
+          <w:tab w:val="left" w:pos="3664"/>
+          <w:tab w:val="left" w:pos="4580"/>
+          <w:tab w:val="left" w:pos="5496"/>
+          <w:tab w:val="left" w:pos="6412"/>
+          <w:tab w:val="left" w:pos="7328"/>
+          <w:tab w:val="left" w:pos="8244"/>
+          <w:tab w:val="left" w:pos="9160"/>
+          <w:tab w:val="left" w:pos="10076"/>
+          <w:tab w:val="left" w:pos="10992"/>
+          <w:tab w:val="left" w:pos="11908"/>
+          <w:tab w:val="left" w:pos="12824"/>
+          <w:tab w:val="left" w:pos="13740"/>
+          <w:tab w:val="left" w:pos="14656"/>
+        </w:tabs>
+        <w:spacing w:after="0" w:line="240" w:lineRule="auto"/>
+        <w:rPr>
+          <w:rFonts w:ascii="Courier New" w:eastAsia="Times New Roman" w:hAnsi="Courier New" w:cs="Courier New"/>
+          <w:sz w:val="20"/>
+          <w:szCs w:val="20"/>
+        </w:rPr>
+      </w:pPr>
+      <w:proofErr w:type="spellStart"/>
+      <w:proofErr w:type="gramStart"/>
+      <w:r>
+        <w:rPr>
+          <w:rFonts w:ascii="Courier New" w:eastAsia="Times New Roman" w:hAnsi="Courier New" w:cs="Courier New"/>
+          <w:sz w:val="20"/>
+          <w:szCs w:val="20"/>
+        </w:rPr>
+        <w:t>git</w:t>
+      </w:r>
+      <w:proofErr w:type="spellEnd"/>
+      <w:proofErr w:type="gramEnd"/>
+      <w:r>
+        <w:rPr>
+          <w:rFonts w:ascii="Courier New" w:eastAsia="Times New Roman" w:hAnsi="Courier New" w:cs="Courier New"/>
+          <w:sz w:val="20"/>
+          <w:szCs w:val="20"/>
+        </w:rPr>
+        <w:t xml:space="preserve"> push origin main</w:t>
+      </w:r>
+    </w:p>
+    <w:p>
+      <w:pPr>
+        <w:spacing w:after="0" w:line="240" w:lineRule="auto"/>
+        <w:rPr>
+          <w:rFonts w:ascii="Times New Roman" w:eastAsia="Times New Roman" w:hAnsi="Times New Roman" w:cs="Times New Roman"/>
+          <w:sz w:val="24"/>
+          <w:szCs w:val="24"/>
+        </w:rPr>
+      </w:pPr>
+      <w:r>
+        <w:rPr>
+          <w:rFonts w:ascii="Times New Roman" w:eastAsia="Times New Roman" w:hAnsi="Times New Roman" w:cs="Times New Roman"/>
+          <w:sz w:val="24"/>
+          <w:szCs w:val="24"/>
+        </w:rPr>
+        <w:pict>
+          <v:rect id="_x0000_i1043" style="width:0;height:.75pt" o:hralign="center" o:hrstd="t" o:hr="t" fillcolor="#a0a0a0" stroked="f"/>
+        </w:pict>
+      </w:r>
+    </w:p>
+    <w:p>
+      <w:pPr>
+        <w:spacing w:before="100" w:beforeAutospacing="1" w:after="100" w:afterAutospacing="1" w:line="240" w:lineRule="auto"/>
+        <w:outlineLvl w:val="1"/>
+        <w:rPr>
+          <w:rFonts w:ascii="Times New Roman" w:eastAsia="Times New Roman" w:hAnsi="Times New Roman" w:cs="Times New Roman"/>
+          <w:b/>
+          <w:bCs/>
+          <w:sz w:val="30"/>
+          <w:szCs w:val="30"/>
+        </w:rPr>
+      </w:pPr>
+      <w:r>
+        <w:rPr>
+          <w:rFonts w:ascii="Segoe UI Symbol" w:eastAsia="Times New Roman" w:hAnsi="Segoe UI Symbol" w:cs="Segoe UI Symbol"/>
+          <w:b/>
+          <w:bCs/>
+          <w:sz w:val="30"/>
+          <w:szCs w:val="30"/>
+        </w:rPr>
+        <w:t>📲</w:t>
+      </w:r>
+      <w:r>
+        <w:rPr>
+          <w:rFonts w:ascii="Times New Roman" w:eastAsia="Times New Roman" w:hAnsi="Times New Roman" w:cs="Times New Roman"/>
+          <w:b/>
+          <w:bCs/>
+          <w:sz w:val="30"/>
+          <w:szCs w:val="30"/>
+        </w:rPr>
+        <w:t xml:space="preserve"> How to </w:t>
+      </w:r>
+      <w:proofErr w:type="gramStart"/>
+      <w:r>
+        <w:rPr>
+          <w:rFonts w:ascii="Times New Roman" w:eastAsia="Times New Roman" w:hAnsi="Times New Roman" w:cs="Times New Roman"/>
+          <w:b/>
+          <w:bCs/>
+          <w:sz w:val="30"/>
+          <w:szCs w:val="30"/>
+        </w:rPr>
+        <w:t>Install</w:t>
+      </w:r>
+      <w:proofErr w:type="gramEnd"/>
+      <w:r>
+        <w:rPr>
+          <w:rFonts w:ascii="Times New Roman" w:eastAsia="Times New Roman" w:hAnsi="Times New Roman" w:cs="Times New Roman"/>
+          <w:b/>
+          <w:bCs/>
+          <w:sz w:val="30"/>
+          <w:szCs w:val="30"/>
+        </w:rPr>
+        <w:t xml:space="preserve"> it on Your Phone Now</w:t>
+      </w:r>
+    </w:p>
+    <w:p>
+      <w:pPr>
+        <w:spacing w:line="240" w:lineRule="auto"/>
+        <w:rPr>
+          <w:rFonts w:ascii="Times New Roman" w:eastAsia="Times New Roman" w:hAnsi="Times New Roman" w:cs="Times New Roman"/>
+          <w:sz w:val="24"/>
+          <w:szCs w:val="24"/>
+        </w:rPr>
+      </w:pPr>
+      <w:r>
+        <w:rPr>
+          <w:rFonts w:ascii="Times New Roman" w:eastAsia="Times New Roman" w:hAnsi="Times New Roman" w:cs="Times New Roman"/>
+          <w:sz w:val="24"/>
+          <w:szCs w:val="24"/>
+        </w:rPr>
+        <w:t xml:space="preserve">Give </w:t>
+      </w:r>
+      <w:proofErr w:type="spellStart"/>
+      <w:r>
+        <w:rPr>
+          <w:rFonts w:ascii="Times New Roman" w:eastAsia="Times New Roman" w:hAnsi="Times New Roman" w:cs="Times New Roman"/>
+          <w:sz w:val="24"/>
+          <w:szCs w:val="24"/>
+        </w:rPr>
+        <w:t>GitHub</w:t>
+      </w:r>
+      <w:proofErr w:type="spellEnd"/>
+      <w:r>
+        <w:rPr>
+          <w:rFonts w:ascii="Times New Roman" w:eastAsia="Times New Roman" w:hAnsi="Times New Roman" w:cs="Times New Roman"/>
+          <w:sz w:val="24"/>
+          <w:szCs w:val="24"/>
+        </w:rPr>
+        <w:t xml:space="preserve"> Pages about 30 seconds to rebuild your site, </w:t>
+      </w:r>
+      <w:proofErr w:type="gramStart"/>
+      <w:r>
+        <w:rPr>
+          <w:rFonts w:ascii="Times New Roman" w:eastAsia="Times New Roman" w:hAnsi="Times New Roman" w:cs="Times New Roman"/>
+          <w:sz w:val="24"/>
+          <w:szCs w:val="24"/>
+        </w:rPr>
+        <w:t>then</w:t>
+      </w:r>
+      <w:proofErr w:type="gramEnd"/>
+      <w:r>
+        <w:rPr>
+          <w:rFonts w:ascii="Times New Roman" w:eastAsia="Times New Roman" w:hAnsi="Times New Roman" w:cs="Times New Roman"/>
+          <w:sz w:val="24"/>
+          <w:szCs w:val="24"/>
+        </w:rPr>
+        <w:t xml:space="preserve"> open the link on your smartphone:</w:t>
+      </w:r>
+    </w:p>
+    <w:p>
+      <w:pPr>
+        <w:numPr>
+          <w:ilvl w:val="0"/>
+          <w:numId w:val="39"/>
+        </w:numPr>
+        <w:spacing w:before="100" w:beforeAutospacing="1" w:after="100" w:afterAutospacing="1" w:line="240" w:lineRule="auto"/>
+        <w:rPr>
+          <w:rFonts w:ascii="Times New Roman" w:eastAsia="Times New Roman" w:hAnsi="Times New Roman" w:cs="Times New Roman"/>
+          <w:sz w:val="24"/>
+          <w:szCs w:val="24"/>
+        </w:rPr>
+      </w:pPr>
+      <w:r>
+        <w:rPr>
+          <w:rFonts w:ascii="Times New Roman" w:eastAsia="Times New Roman" w:hAnsi="Times New Roman" w:cs="Times New Roman"/>
+          <w:b/>
+          <w:bCs/>
+          <w:sz w:val="24"/>
+          <w:szCs w:val="24"/>
+        </w:rPr>
+        <w:lastRenderedPageBreak/>
+        <w:t>On Android (Chrome):</w:t>
+      </w:r>
+      <w:r>
+        <w:rPr>
+          <w:rFonts w:ascii="Times New Roman" w:eastAsia="Times New Roman" w:hAnsi="Times New Roman" w:cs="Times New Roman"/>
+          <w:sz w:val="24"/>
+          <w:szCs w:val="24"/>
+        </w:rPr>
+        <w:t xml:space="preserve"> A banner reading </w:t>
+      </w:r>
+      <w:r>
+        <w:rPr>
+          <w:rFonts w:ascii="Times New Roman" w:eastAsia="Times New Roman" w:hAnsi="Times New Roman" w:cs="Times New Roman"/>
+          <w:b/>
+          <w:bCs/>
+          <w:sz w:val="24"/>
+          <w:szCs w:val="24"/>
+        </w:rPr>
+        <w:t xml:space="preserve">"Add TUVEES </w:t>
+      </w:r>
+      <w:proofErr w:type="spellStart"/>
+      <w:r>
+        <w:rPr>
+          <w:rFonts w:ascii="Times New Roman" w:eastAsia="Times New Roman" w:hAnsi="Times New Roman" w:cs="Times New Roman"/>
+          <w:b/>
+          <w:bCs/>
+          <w:sz w:val="24"/>
+          <w:szCs w:val="24"/>
+        </w:rPr>
+        <w:t>BuyHub</w:t>
+      </w:r>
+      <w:proofErr w:type="spellEnd"/>
+      <w:r>
+        <w:rPr>
+          <w:rFonts w:ascii="Times New Roman" w:eastAsia="Times New Roman" w:hAnsi="Times New Roman" w:cs="Times New Roman"/>
+          <w:b/>
+          <w:bCs/>
+          <w:sz w:val="24"/>
+          <w:szCs w:val="24"/>
+        </w:rPr>
+        <w:t xml:space="preserve"> to Home Screen"</w:t>
+      </w:r>
+      <w:r>
+        <w:rPr>
+          <w:rFonts w:ascii="Times New Roman" w:eastAsia="Times New Roman" w:hAnsi="Times New Roman" w:cs="Times New Roman"/>
+          <w:sz w:val="24"/>
+          <w:szCs w:val="24"/>
+        </w:rPr>
+        <w:t xml:space="preserve"> or a prompt to </w:t>
+      </w:r>
+      <w:r>
+        <w:rPr>
+          <w:rFonts w:ascii="Times New Roman" w:eastAsia="Times New Roman" w:hAnsi="Times New Roman" w:cs="Times New Roman"/>
+          <w:b/>
+          <w:bCs/>
+          <w:sz w:val="24"/>
+          <w:szCs w:val="24"/>
+        </w:rPr>
+        <w:t>"Install App"</w:t>
+      </w:r>
+      <w:r>
+        <w:rPr>
+          <w:rFonts w:ascii="Times New Roman" w:eastAsia="Times New Roman" w:hAnsi="Times New Roman" w:cs="Times New Roman"/>
+          <w:sz w:val="24"/>
+          <w:szCs w:val="24"/>
+        </w:rPr>
+        <w:t xml:space="preserve"> will pop up automatically at the bottom of your screen.</w:t>
+      </w:r>
+    </w:p>
+    <w:p>
+      <w:pPr>
+        <w:numPr>
+          <w:ilvl w:val="0"/>
+          <w:numId w:val="39"/>
+        </w:numPr>
+        <w:spacing w:before="100" w:beforeAutospacing="1" w:after="100" w:afterAutospacing="1" w:line="240" w:lineRule="auto"/>
+        <w:rPr>
+          <w:rFonts w:ascii="Times New Roman" w:eastAsia="Times New Roman" w:hAnsi="Times New Roman" w:cs="Times New Roman"/>
+          <w:sz w:val="24"/>
+          <w:szCs w:val="24"/>
+        </w:rPr>
+      </w:pPr>
+      <w:r>
+        <w:rPr>
+          <w:rFonts w:ascii="Times New Roman" w:eastAsia="Times New Roman" w:hAnsi="Times New Roman" w:cs="Times New Roman"/>
+          <w:b/>
+          <w:bCs/>
+          <w:sz w:val="24"/>
+          <w:szCs w:val="24"/>
+        </w:rPr>
+        <w:t xml:space="preserve">On </w:t>
+      </w:r>
+      <w:proofErr w:type="spellStart"/>
+      <w:r>
+        <w:rPr>
+          <w:rFonts w:ascii="Times New Roman" w:eastAsia="Times New Roman" w:hAnsi="Times New Roman" w:cs="Times New Roman"/>
+          <w:b/>
+          <w:bCs/>
+          <w:sz w:val="24"/>
+          <w:szCs w:val="24"/>
+        </w:rPr>
+        <w:t>iOS</w:t>
+      </w:r>
+      <w:proofErr w:type="spellEnd"/>
+      <w:r>
+        <w:rPr>
+          <w:rFonts w:ascii="Times New Roman" w:eastAsia="Times New Roman" w:hAnsi="Times New Roman" w:cs="Times New Roman"/>
+          <w:b/>
+          <w:bCs/>
+          <w:sz w:val="24"/>
+          <w:szCs w:val="24"/>
+        </w:rPr>
+        <w:t xml:space="preserve"> / iPhone (Safari):</w:t>
+      </w:r>
+      <w:r>
+        <w:rPr>
+          <w:rFonts w:ascii="Times New Roman" w:eastAsia="Times New Roman" w:hAnsi="Times New Roman" w:cs="Times New Roman"/>
+          <w:sz w:val="24"/>
+          <w:szCs w:val="24"/>
+        </w:rPr>
+        <w:t xml:space="preserve"> Tap the browser's </w:t>
+      </w:r>
+      <w:r>
+        <w:rPr>
+          <w:rFonts w:ascii="Times New Roman" w:eastAsia="Times New Roman" w:hAnsi="Times New Roman" w:cs="Times New Roman"/>
+          <w:b/>
+          <w:bCs/>
+          <w:sz w:val="24"/>
+          <w:szCs w:val="24"/>
+        </w:rPr>
+        <w:t>Share</w:t>
+      </w:r>
+      <w:r>
+        <w:rPr>
+          <w:rFonts w:ascii="Times New Roman" w:eastAsia="Times New Roman" w:hAnsi="Times New Roman" w:cs="Times New Roman"/>
+          <w:sz w:val="24"/>
+          <w:szCs w:val="24"/>
+        </w:rPr>
+        <w:t xml:space="preserve"> button (the square icon with an up arrow at the bottom menu bar), scroll down the options list, and select </w:t>
+      </w:r>
+      <w:r>
+        <w:rPr>
+          <w:rFonts w:ascii="Times New Roman" w:eastAsia="Times New Roman" w:hAnsi="Times New Roman" w:cs="Times New Roman"/>
+          <w:b/>
+          <w:bCs/>
+          <w:sz w:val="24"/>
+          <w:szCs w:val="24"/>
+        </w:rPr>
+        <w:t>"Add to Home Screen"</w:t>
+      </w:r>
+      <w:r>
+        <w:rPr>
+          <w:rFonts w:ascii="Times New Roman" w:eastAsia="Times New Roman" w:hAnsi="Times New Roman" w:cs="Times New Roman"/>
+          <w:sz w:val="24"/>
+          <w:szCs w:val="24"/>
+        </w:rPr>
+        <w:t>.</w:t>
+      </w:r>
+    </w:p>
+    <w:p>
+      <w:pPr>
+        <w:spacing w:line="240" w:lineRule="auto"/>
+        <w:rPr>
+          <w:rFonts w:ascii="Times New Roman" w:eastAsia="Times New Roman" w:hAnsi="Times New Roman" w:cs="Times New Roman"/>
+          <w:sz w:val="24"/>
+          <w:szCs w:val="24"/>
+        </w:rPr>
+      </w:pPr>
+      <w:r>
+        <w:rPr>
+          <w:rFonts w:ascii="Times New Roman" w:eastAsia="Times New Roman" w:hAnsi="Times New Roman" w:cs="Times New Roman"/>
+          <w:sz w:val="24"/>
+          <w:szCs w:val="24"/>
+        </w:rPr>
+        <w:t>Now that your core application architecture and deployment framework are complete, let me know if you would like me to:</w:t>
+      </w:r>
+    </w:p>
+    <w:p>
+      <w:pPr>
+        <w:numPr>
+          <w:ilvl w:val="0"/>
+          <w:numId w:val="40"/>
+        </w:numPr>
+        <w:spacing w:before="100" w:beforeAutospacing="1" w:after="100" w:afterAutospacing="1" w:line="240" w:lineRule="auto"/>
+        <w:rPr>
+          <w:rFonts w:ascii="Times New Roman" w:eastAsia="Times New Roman" w:hAnsi="Times New Roman" w:cs="Times New Roman"/>
+          <w:sz w:val="24"/>
+          <w:szCs w:val="24"/>
+        </w:rPr>
+      </w:pPr>
+      <w:r>
+        <w:rPr>
+          <w:rFonts w:ascii="Times New Roman" w:eastAsia="Times New Roman" w:hAnsi="Times New Roman" w:cs="Times New Roman"/>
+          <w:sz w:val="24"/>
+          <w:szCs w:val="24"/>
+        </w:rPr>
+        <w:t xml:space="preserve">Teach you how to </w:t>
+      </w:r>
+      <w:r>
+        <w:rPr>
+          <w:rFonts w:ascii="Times New Roman" w:eastAsia="Times New Roman" w:hAnsi="Times New Roman" w:cs="Times New Roman"/>
+          <w:b/>
+          <w:bCs/>
+          <w:sz w:val="24"/>
+          <w:szCs w:val="24"/>
+        </w:rPr>
+        <w:t>add your first few products</w:t>
+      </w:r>
+      <w:r>
+        <w:rPr>
+          <w:rFonts w:ascii="Times New Roman" w:eastAsia="Times New Roman" w:hAnsi="Times New Roman" w:cs="Times New Roman"/>
+          <w:sz w:val="24"/>
+          <w:szCs w:val="24"/>
+        </w:rPr>
+        <w:t xml:space="preserve"> by duplicating your HTML card blocks.</w:t>
+      </w:r>
+    </w:p>
+    <w:p>
+      <w:pPr>
+        <w:numPr>
+          <w:ilvl w:val="0"/>
+          <w:numId w:val="40"/>
+        </w:numPr>
+        <w:spacing w:before="100" w:beforeAutospacing="1" w:after="100" w:afterAutospacing="1" w:line="240" w:lineRule="auto"/>
+        <w:rPr>
+          <w:rFonts w:ascii="Times New Roman" w:eastAsia="Times New Roman" w:hAnsi="Times New Roman" w:cs="Times New Roman"/>
+          <w:sz w:val="24"/>
+          <w:szCs w:val="24"/>
+        </w:rPr>
+      </w:pPr>
+      <w:r>
+        <w:rPr>
+          <w:rFonts w:ascii="Times New Roman" w:eastAsia="Times New Roman" w:hAnsi="Times New Roman" w:cs="Times New Roman"/>
+          <w:sz w:val="24"/>
+          <w:szCs w:val="24"/>
+        </w:rPr>
+        <w:t xml:space="preserve">Show you how to </w:t>
+      </w:r>
+      <w:r>
+        <w:rPr>
+          <w:rFonts w:ascii="Times New Roman" w:eastAsia="Times New Roman" w:hAnsi="Times New Roman" w:cs="Times New Roman"/>
+          <w:b/>
+          <w:bCs/>
+          <w:sz w:val="24"/>
+          <w:szCs w:val="24"/>
+        </w:rPr>
+        <w:t>customize the mobile status bar color</w:t>
+      </w:r>
+      <w:r>
+        <w:rPr>
+          <w:rFonts w:ascii="Times New Roman" w:eastAsia="Times New Roman" w:hAnsi="Times New Roman" w:cs="Times New Roman"/>
+          <w:sz w:val="24"/>
+          <w:szCs w:val="24"/>
+        </w:rPr>
+        <w:t xml:space="preserve"> inside your </w:t>
+      </w:r>
+      <w:proofErr w:type="spellStart"/>
+      <w:r>
+        <w:rPr>
+          <w:rFonts w:ascii="Courier New" w:eastAsia="Times New Roman" w:hAnsi="Courier New" w:cs="Courier New"/>
+          <w:sz w:val="20"/>
+          <w:szCs w:val="20"/>
+          <w:bdr w:val="single" w:sz="6" w:space="2" w:color="F4F6F7" w:frame="1"/>
+          <w:shd w:val="clear" w:color="auto" w:fill="F4F6F7"/>
+        </w:rPr>
+        <w:t>manifest.json</w:t>
+      </w:r>
+      <w:proofErr w:type="spellEnd"/>
+      <w:r>
+        <w:rPr>
+          <w:rFonts w:ascii="Times New Roman" w:eastAsia="Times New Roman" w:hAnsi="Times New Roman" w:cs="Times New Roman"/>
+          <w:sz w:val="24"/>
+          <w:szCs w:val="24"/>
+        </w:rPr>
+        <w:t xml:space="preserve"> file so it seamlessly matches your signature brand look.</w:t>
+      </w:r>
+    </w:p>
+    <w:p>
+      <w:pPr>
+        <w:spacing w:after="0" w:line="240" w:lineRule="auto"/>
+        <w:rPr>
+          <w:rFonts w:ascii="Times New Roman" w:eastAsia="Times New Roman" w:hAnsi="Times New Roman" w:cs="Times New Roman"/>
+          <w:sz w:val="24"/>
+          <w:szCs w:val="24"/>
+        </w:rPr>
+      </w:pPr>
+      <w:r>
+        <w:rPr>
+          <w:rFonts w:ascii="Times New Roman" w:eastAsia="Times New Roman" w:hAnsi="Times New Roman" w:cs="Times New Roman"/>
+          <w:sz w:val="24"/>
+          <w:szCs w:val="24"/>
+        </w:rPr>
+        <w:br/>
+      </w:r>
+    </w:p>
+    <w:p>
+      <w:bookmarkStart w:id="0" w:name="_GoBack"/>
+      <w:bookmarkEnd w:id="0"/>
+    </w:p>
     <w:p/>
     <w:p/>
     <w:p/>
     <w:p/>
     <w:p/>
     <w:p/>
-    <w:p/>
     <w:p>
       <w:pPr>
         <w:pStyle w:val="Heading1"/>
@@ -30250,7 +33630,6 @@
           <w:sz w:val="63"/>
           <w:szCs w:val="63"/>
         </w:rPr>
-        <w:lastRenderedPageBreak/>
         <w:t xml:space="preserve">10 Best Affiliate Programs in Philippines for You </w:t>
       </w:r>
       <w:proofErr w:type="gramStart"/>
@@ -30870,7 +34249,6 @@
           <w:sz w:val="57"/>
           <w:szCs w:val="57"/>
         </w:rPr>
-        <w:lastRenderedPageBreak/>
         <w:t>Key Takeaways</w:t>
       </w:r>
     </w:p>
@@ -31076,6 +34454,7 @@
           <w:sz w:val="27"/>
           <w:szCs w:val="27"/>
         </w:rPr>
+        <w:lastRenderedPageBreak/>
         <w:drawing>
           <wp:inline distT="0" distB="0" distL="0" distR="0">
             <wp:extent cx="9525000" cy="3333750"/>
@@ -31292,7 +34671,6 @@
           <w:sz w:val="57"/>
           <w:szCs w:val="57"/>
         </w:rPr>
-        <w:lastRenderedPageBreak/>
         <w:t>Why Affiliate Marketing Is Growing Fast in the Philippines</w:t>
       </w:r>
     </w:p>
@@ -31472,6 +34850,7 @@
           <w:sz w:val="57"/>
           <w:szCs w:val="57"/>
         </w:rPr>
+        <w:lastRenderedPageBreak/>
         <w:t>10 Best Affiliate Programs in the Philippines</w:t>
       </w:r>
     </w:p>
@@ -31912,7 +35291,6 @@
           <w:sz w:val="42"/>
           <w:szCs w:val="42"/>
         </w:rPr>
-        <w:lastRenderedPageBreak/>
         <w:t>Best Content Angles</w:t>
       </w:r>
     </w:p>
@@ -32253,6 +35631,7 @@
           <w:sz w:val="42"/>
           <w:szCs w:val="42"/>
         </w:rPr>
+        <w:lastRenderedPageBreak/>
         <w:t>Best For</w:t>
       </w:r>
     </w:p>
@@ -32787,7 +36166,6 @@
           <w:sz w:val="42"/>
           <w:szCs w:val="42"/>
         </w:rPr>
-        <w:lastRenderedPageBreak/>
         <w:t xml:space="preserve">Why </w:t>
       </w:r>
       <w:proofErr w:type="spellStart"/>
@@ -33034,6 +36412,7 @@
           <w:sz w:val="27"/>
           <w:szCs w:val="27"/>
         </w:rPr>
+        <w:lastRenderedPageBreak/>
         <w:t>Health and wellness products also tend to perform well because consumers often make repeat purchases once they find products they trust and regularly use.</w:t>
       </w:r>
     </w:p>
@@ -33508,7 +36887,6 @@
           <w:sz w:val="48"/>
           <w:szCs w:val="48"/>
         </w:rPr>
-        <w:lastRenderedPageBreak/>
         <w:t>5. Sephora Affiliate Program</w:t>
       </w:r>
     </w:p>
@@ -33839,6 +37217,7 @@
           <w:sz w:val="27"/>
           <w:szCs w:val="27"/>
         </w:rPr>
+        <w:lastRenderedPageBreak/>
         <w:drawing>
           <wp:inline distT="0" distB="0" distL="0" distR="0">
             <wp:extent cx="9525000" cy="3333750"/>
@@ -34001,7 +37380,6 @@
           <w:sz w:val="42"/>
           <w:szCs w:val="42"/>
         </w:rPr>
-        <w:lastRenderedPageBreak/>
         <w:t>Best For</w:t>
       </w:r>
     </w:p>
@@ -34340,6 +37718,7 @@
           <w:sz w:val="48"/>
           <w:szCs w:val="48"/>
         </w:rPr>
+        <w:lastRenderedPageBreak/>
         <w:t xml:space="preserve">7. </w:t>
       </w:r>
       <w:proofErr w:type="spellStart"/>
@@ -34826,7 +38205,6 @@
           <w:sz w:val="42"/>
           <w:szCs w:val="42"/>
         </w:rPr>
-        <w:lastRenderedPageBreak/>
         <w:t>Best For</w:t>
       </w:r>
     </w:p>
@@ -35095,6 +38473,7 @@
           <w:sz w:val="42"/>
           <w:szCs w:val="42"/>
         </w:rPr>
+        <w:lastRenderedPageBreak/>
         <w:t>Content Ideas</w:t>
       </w:r>
     </w:p>
@@ -35660,7 +39039,6 @@
           <w:sz w:val="27"/>
           <w:szCs w:val="27"/>
         </w:rPr>
-        <w:lastRenderedPageBreak/>
         <w:t>Suitable for both casual and premium fashion content</w:t>
       </w:r>
     </w:p>
@@ -35857,6 +39235,7 @@
           <w:sz w:val="48"/>
           <w:szCs w:val="48"/>
         </w:rPr>
+        <w:lastRenderedPageBreak/>
         <w:t>10. PUMA Affiliate Program</w:t>
       </w:r>
     </w:p>
@@ -36536,7 +39915,6 @@
           <w:sz w:val="57"/>
           <w:szCs w:val="57"/>
         </w:rPr>
-        <w:lastRenderedPageBreak/>
         <w:t>High Commission Affiliate Programs for Philippine Audiences on Involve Asia</w:t>
       </w:r>
     </w:p>
@@ -36627,6 +40005,7 @@
           <w:sz w:val="27"/>
           <w:szCs w:val="27"/>
         </w:rPr>
+        <w:lastRenderedPageBreak/>
         <w:t xml:space="preserve">These programs can be especially useful for creators, bloggers, and niche </w:t>
       </w:r>
       <w:proofErr w:type="gramStart"/>
@@ -37347,7 +40726,6 @@
               <w:rPr>
                 <w:rStyle w:val="Strong"/>
               </w:rPr>
-              <w:lastRenderedPageBreak/>
               <w:t>XP-PEN</w:t>
             </w:r>
           </w:p>
@@ -37634,6 +41012,7 @@
               <w:rPr>
                 <w:rStyle w:val="Strong"/>
               </w:rPr>
+              <w:lastRenderedPageBreak/>
               <w:t>Photobook</w:t>
             </w:r>
             <w:proofErr w:type="spellEnd"/>
@@ -37718,10 +41097,7 @@
         <w:t>High Commission Affiliate Programs for Philippine Audiences on Involve Asia</w:t>
       </w:r>
     </w:p>
-    <w:p>
-      <w:bookmarkStart w:id="0" w:name="_GoBack"/>
-      <w:bookmarkEnd w:id="0"/>
-    </w:p>
+    <w:p/>
     <w:sectPr>
       <w:pgSz w:w="12240" w:h="15840"/>
       <w:pgMar w:top="1440" w:right="1440" w:bottom="1440" w:left="1440" w:header="720" w:footer="720" w:gutter="0"/>
@@ -40268,9 +43644,9 @@
     </w:lvl>
   </w:abstractNum>
   <w:abstractNum w:abstractNumId="17">
-    <w:nsid w:val="409A1FEB"/>
+    <w:nsid w:val="3CE85717"/>
     <w:multiLevelType w:val="multilevel"/>
-    <w:tmpl w:val="7FEC138E"/>
+    <w:tmpl w:val="9CCA785A"/>
     <w:lvl w:ilvl="0">
       <w:start w:val="1"/>
       <w:numFmt w:val="bullet"/>
@@ -40417,9 +43793,9 @@
     </w:lvl>
   </w:abstractNum>
   <w:abstractNum w:abstractNumId="18">
-    <w:nsid w:val="43253206"/>
+    <w:nsid w:val="409A1FEB"/>
     <w:multiLevelType w:val="multilevel"/>
-    <w:tmpl w:val="7C52D4DA"/>
+    <w:tmpl w:val="7FEC138E"/>
     <w:lvl w:ilvl="0">
       <w:start w:val="1"/>
       <w:numFmt w:val="bullet"/>
@@ -40566,9 +43942,9 @@
     </w:lvl>
   </w:abstractNum>
   <w:abstractNum w:abstractNumId="19">
-    <w:nsid w:val="4B6E0B23"/>
+    <w:nsid w:val="43253206"/>
     <w:multiLevelType w:val="multilevel"/>
-    <w:tmpl w:val="F6827120"/>
+    <w:tmpl w:val="7C52D4DA"/>
     <w:lvl w:ilvl="0">
       <w:start w:val="1"/>
       <w:numFmt w:val="bullet"/>
@@ -40715,122 +44091,9 @@
     </w:lvl>
   </w:abstractNum>
   <w:abstractNum w:abstractNumId="20">
-    <w:nsid w:val="4CA94683"/>
+    <w:nsid w:val="4B6E0B23"/>
     <w:multiLevelType w:val="multilevel"/>
-    <w:tmpl w:val="C23C19D4"/>
-    <w:lvl w:ilvl="0">
-      <w:start w:val="1"/>
-      <w:numFmt w:val="decimal"/>
-      <w:lvlText w:val="%1."/>
-      <w:lvlJc w:val="left"/>
-      <w:pPr>
-        <w:tabs>
-          <w:tab w:val="num" w:pos="720"/>
-        </w:tabs>
-        <w:ind w:left="720" w:hanging="360"/>
-      </w:pPr>
-    </w:lvl>
-    <w:lvl w:ilvl="1" w:tentative="1">
-      <w:start w:val="1"/>
-      <w:numFmt w:val="decimal"/>
-      <w:lvlText w:val="%2."/>
-      <w:lvlJc w:val="left"/>
-      <w:pPr>
-        <w:tabs>
-          <w:tab w:val="num" w:pos="1440"/>
-        </w:tabs>
-        <w:ind w:left="1440" w:hanging="360"/>
-      </w:pPr>
-    </w:lvl>
-    <w:lvl w:ilvl="2" w:tentative="1">
-      <w:start w:val="1"/>
-      <w:numFmt w:val="decimal"/>
-      <w:lvlText w:val="%3."/>
-      <w:lvlJc w:val="left"/>
-      <w:pPr>
-        <w:tabs>
-          <w:tab w:val="num" w:pos="2160"/>
-        </w:tabs>
-        <w:ind w:left="2160" w:hanging="360"/>
-      </w:pPr>
-    </w:lvl>
-    <w:lvl w:ilvl="3" w:tentative="1">
-      <w:start w:val="1"/>
-      <w:numFmt w:val="decimal"/>
-      <w:lvlText w:val="%4."/>
-      <w:lvlJc w:val="left"/>
-      <w:pPr>
-        <w:tabs>
-          <w:tab w:val="num" w:pos="2880"/>
-        </w:tabs>
-        <w:ind w:left="2880" w:hanging="360"/>
-      </w:pPr>
-    </w:lvl>
-    <w:lvl w:ilvl="4" w:tentative="1">
-      <w:start w:val="1"/>
-      <w:numFmt w:val="decimal"/>
-      <w:lvlText w:val="%5."/>
-      <w:lvlJc w:val="left"/>
-      <w:pPr>
-        <w:tabs>
-          <w:tab w:val="num" w:pos="3600"/>
-        </w:tabs>
-        <w:ind w:left="3600" w:hanging="360"/>
-      </w:pPr>
-    </w:lvl>
-    <w:lvl w:ilvl="5" w:tentative="1">
-      <w:start w:val="1"/>
-      <w:numFmt w:val="decimal"/>
-      <w:lvlText w:val="%6."/>
-      <w:lvlJc w:val="left"/>
-      <w:pPr>
-        <w:tabs>
-          <w:tab w:val="num" w:pos="4320"/>
-        </w:tabs>
-        <w:ind w:left="4320" w:hanging="360"/>
-      </w:pPr>
-    </w:lvl>
-    <w:lvl w:ilvl="6" w:tentative="1">
-      <w:start w:val="1"/>
-      <w:numFmt w:val="decimal"/>
-      <w:lvlText w:val="%7."/>
-      <w:lvlJc w:val="left"/>
-      <w:pPr>
-        <w:tabs>
-          <w:tab w:val="num" w:pos="5040"/>
-        </w:tabs>
-        <w:ind w:left="5040" w:hanging="360"/>
-      </w:pPr>
-    </w:lvl>
-    <w:lvl w:ilvl="7" w:tentative="1">
-      <w:start w:val="1"/>
-      <w:numFmt w:val="decimal"/>
-      <w:lvlText w:val="%8."/>
-      <w:lvlJc w:val="left"/>
-      <w:pPr>
-        <w:tabs>
-          <w:tab w:val="num" w:pos="5760"/>
-        </w:tabs>
-        <w:ind w:left="5760" w:hanging="360"/>
-      </w:pPr>
-    </w:lvl>
-    <w:lvl w:ilvl="8" w:tentative="1">
-      <w:start w:val="1"/>
-      <w:numFmt w:val="decimal"/>
-      <w:lvlText w:val="%9."/>
-      <w:lvlJc w:val="left"/>
-      <w:pPr>
-        <w:tabs>
-          <w:tab w:val="num" w:pos="6480"/>
-        </w:tabs>
-        <w:ind w:left="6480" w:hanging="360"/>
-      </w:pPr>
-    </w:lvl>
-  </w:abstractNum>
-  <w:abstractNum w:abstractNumId="21">
-    <w:nsid w:val="4F280412"/>
-    <w:multiLevelType w:val="multilevel"/>
-    <w:tmpl w:val="AFA62412"/>
+    <w:tmpl w:val="F6827120"/>
     <w:lvl w:ilvl="0">
       <w:start w:val="1"/>
       <w:numFmt w:val="bullet"/>
@@ -40976,10 +44239,123 @@
       </w:rPr>
     </w:lvl>
   </w:abstractNum>
+  <w:abstractNum w:abstractNumId="21">
+    <w:nsid w:val="4CA94683"/>
+    <w:multiLevelType w:val="multilevel"/>
+    <w:tmpl w:val="C23C19D4"/>
+    <w:lvl w:ilvl="0">
+      <w:start w:val="1"/>
+      <w:numFmt w:val="decimal"/>
+      <w:lvlText w:val="%1."/>
+      <w:lvlJc w:val="left"/>
+      <w:pPr>
+        <w:tabs>
+          <w:tab w:val="num" w:pos="720"/>
+        </w:tabs>
+        <w:ind w:left="720" w:hanging="360"/>
+      </w:pPr>
+    </w:lvl>
+    <w:lvl w:ilvl="1" w:tentative="1">
+      <w:start w:val="1"/>
+      <w:numFmt w:val="decimal"/>
+      <w:lvlText w:val="%2."/>
+      <w:lvlJc w:val="left"/>
+      <w:pPr>
+        <w:tabs>
+          <w:tab w:val="num" w:pos="1440"/>
+        </w:tabs>
+        <w:ind w:left="1440" w:hanging="360"/>
+      </w:pPr>
+    </w:lvl>
+    <w:lvl w:ilvl="2" w:tentative="1">
+      <w:start w:val="1"/>
+      <w:numFmt w:val="decimal"/>
+      <w:lvlText w:val="%3."/>
+      <w:lvlJc w:val="left"/>
+      <w:pPr>
+        <w:tabs>
+          <w:tab w:val="num" w:pos="2160"/>
+        </w:tabs>
+        <w:ind w:left="2160" w:hanging="360"/>
+      </w:pPr>
+    </w:lvl>
+    <w:lvl w:ilvl="3" w:tentative="1">
+      <w:start w:val="1"/>
+      <w:numFmt w:val="decimal"/>
+      <w:lvlText w:val="%4."/>
+      <w:lvlJc w:val="left"/>
+      <w:pPr>
+        <w:tabs>
+          <w:tab w:val="num" w:pos="2880"/>
+        </w:tabs>
+        <w:ind w:left="2880" w:hanging="360"/>
+      </w:pPr>
+    </w:lvl>
+    <w:lvl w:ilvl="4" w:tentative="1">
+      <w:start w:val="1"/>
+      <w:numFmt w:val="decimal"/>
+      <w:lvlText w:val="%5."/>
+      <w:lvlJc w:val="left"/>
+      <w:pPr>
+        <w:tabs>
+          <w:tab w:val="num" w:pos="3600"/>
+        </w:tabs>
+        <w:ind w:left="3600" w:hanging="360"/>
+      </w:pPr>
+    </w:lvl>
+    <w:lvl w:ilvl="5" w:tentative="1">
+      <w:start w:val="1"/>
+      <w:numFmt w:val="decimal"/>
+      <w:lvlText w:val="%6."/>
+      <w:lvlJc w:val="left"/>
+      <w:pPr>
+        <w:tabs>
+          <w:tab w:val="num" w:pos="4320"/>
+        </w:tabs>
+        <w:ind w:left="4320" w:hanging="360"/>
+      </w:pPr>
+    </w:lvl>
+    <w:lvl w:ilvl="6" w:tentative="1">
+      <w:start w:val="1"/>
+      <w:numFmt w:val="decimal"/>
+      <w:lvlText w:val="%7."/>
+      <w:lvlJc w:val="left"/>
+      <w:pPr>
+        <w:tabs>
+          <w:tab w:val="num" w:pos="5040"/>
+        </w:tabs>
+        <w:ind w:left="5040" w:hanging="360"/>
+      </w:pPr>
+    </w:lvl>
+    <w:lvl w:ilvl="7" w:tentative="1">
+      <w:start w:val="1"/>
+      <w:numFmt w:val="decimal"/>
+      <w:lvlText w:val="%8."/>
+      <w:lvlJc w:val="left"/>
+      <w:pPr>
+        <w:tabs>
+          <w:tab w:val="num" w:pos="5760"/>
+        </w:tabs>
+        <w:ind w:left="5760" w:hanging="360"/>
+      </w:pPr>
+    </w:lvl>
+    <w:lvl w:ilvl="8" w:tentative="1">
+      <w:start w:val="1"/>
+      <w:numFmt w:val="decimal"/>
+      <w:lvlText w:val="%9."/>
+      <w:lvlJc w:val="left"/>
+      <w:pPr>
+        <w:tabs>
+          <w:tab w:val="num" w:pos="6480"/>
+        </w:tabs>
+        <w:ind w:left="6480" w:hanging="360"/>
+      </w:pPr>
+    </w:lvl>
+  </w:abstractNum>
   <w:abstractNum w:abstractNumId="22">
-    <w:nsid w:val="531B769F"/>
+    <w:nsid w:val="4F280412"/>
     <w:multiLevelType w:val="multilevel"/>
-    <w:tmpl w:val="04B28BEE"/>
+    <w:tmpl w:val="AFA62412"/>
     <w:lvl w:ilvl="0">
       <w:start w:val="1"/>
       <w:numFmt w:val="bullet"/>
@@ -41126,9 +44502,9 @@
     </w:lvl>
   </w:abstractNum>
   <w:abstractNum w:abstractNumId="23">
-    <w:nsid w:val="53A539D0"/>
+    <w:nsid w:val="531B769F"/>
     <w:multiLevelType w:val="multilevel"/>
-    <w:tmpl w:val="509CFD16"/>
+    <w:tmpl w:val="04B28BEE"/>
     <w:lvl w:ilvl="0">
       <w:start w:val="1"/>
       <w:numFmt w:val="bullet"/>
@@ -41275,9 +44651,9 @@
     </w:lvl>
   </w:abstractNum>
   <w:abstractNum w:abstractNumId="24">
-    <w:nsid w:val="55015ADB"/>
+    <w:nsid w:val="53A539D0"/>
     <w:multiLevelType w:val="multilevel"/>
-    <w:tmpl w:val="740ED100"/>
+    <w:tmpl w:val="509CFD16"/>
     <w:lvl w:ilvl="0">
       <w:start w:val="1"/>
       <w:numFmt w:val="bullet"/>
@@ -41424,9 +44800,9 @@
     </w:lvl>
   </w:abstractNum>
   <w:abstractNum w:abstractNumId="25">
-    <w:nsid w:val="5A745677"/>
+    <w:nsid w:val="55015ADB"/>
     <w:multiLevelType w:val="multilevel"/>
-    <w:tmpl w:val="BE2631DA"/>
+    <w:tmpl w:val="740ED100"/>
     <w:lvl w:ilvl="0">
       <w:start w:val="1"/>
       <w:numFmt w:val="bullet"/>
@@ -41573,9 +44949,9 @@
     </w:lvl>
   </w:abstractNum>
   <w:abstractNum w:abstractNumId="26">
-    <w:nsid w:val="5F800C07"/>
+    <w:nsid w:val="5A745677"/>
     <w:multiLevelType w:val="multilevel"/>
-    <w:tmpl w:val="47026AD8"/>
+    <w:tmpl w:val="BE2631DA"/>
     <w:lvl w:ilvl="0">
       <w:start w:val="1"/>
       <w:numFmt w:val="bullet"/>
@@ -41722,9 +45098,9 @@
     </w:lvl>
   </w:abstractNum>
   <w:abstractNum w:abstractNumId="27">
-    <w:nsid w:val="67852514"/>
+    <w:nsid w:val="5F800C07"/>
     <w:multiLevelType w:val="multilevel"/>
-    <w:tmpl w:val="786EB3A2"/>
+    <w:tmpl w:val="47026AD8"/>
     <w:lvl w:ilvl="0">
       <w:start w:val="1"/>
       <w:numFmt w:val="bullet"/>
@@ -41871,9 +45247,9 @@
     </w:lvl>
   </w:abstractNum>
   <w:abstractNum w:abstractNumId="28">
-    <w:nsid w:val="6D650923"/>
+    <w:nsid w:val="67852514"/>
     <w:multiLevelType w:val="multilevel"/>
-    <w:tmpl w:val="8BB05B34"/>
+    <w:tmpl w:val="786EB3A2"/>
     <w:lvl w:ilvl="0">
       <w:start w:val="1"/>
       <w:numFmt w:val="bullet"/>
@@ -42020,9 +45396,9 @@
     </w:lvl>
   </w:abstractNum>
   <w:abstractNum w:abstractNumId="29">
-    <w:nsid w:val="6E297780"/>
+    <w:nsid w:val="6C8E6516"/>
     <w:multiLevelType w:val="multilevel"/>
-    <w:tmpl w:val="7690FE88"/>
+    <w:tmpl w:val="708ADE1A"/>
     <w:lvl w:ilvl="0">
       <w:start w:val="1"/>
       <w:numFmt w:val="bullet"/>
@@ -42169,122 +45545,9 @@
     </w:lvl>
   </w:abstractNum>
   <w:abstractNum w:abstractNumId="30">
-    <w:nsid w:val="6ECD03B6"/>
+    <w:nsid w:val="6D650923"/>
     <w:multiLevelType w:val="multilevel"/>
-    <w:tmpl w:val="3D32305C"/>
-    <w:lvl w:ilvl="0">
-      <w:start w:val="1"/>
-      <w:numFmt w:val="decimal"/>
-      <w:lvlText w:val="%1."/>
-      <w:lvlJc w:val="left"/>
-      <w:pPr>
-        <w:tabs>
-          <w:tab w:val="num" w:pos="720"/>
-        </w:tabs>
-        <w:ind w:left="720" w:hanging="360"/>
-      </w:pPr>
-    </w:lvl>
-    <w:lvl w:ilvl="1" w:tentative="1">
-      <w:start w:val="1"/>
-      <w:numFmt w:val="decimal"/>
-      <w:lvlText w:val="%2."/>
-      <w:lvlJc w:val="left"/>
-      <w:pPr>
-        <w:tabs>
-          <w:tab w:val="num" w:pos="1440"/>
-        </w:tabs>
-        <w:ind w:left="1440" w:hanging="360"/>
-      </w:pPr>
-    </w:lvl>
-    <w:lvl w:ilvl="2" w:tentative="1">
-      <w:start w:val="1"/>
-      <w:numFmt w:val="decimal"/>
-      <w:lvlText w:val="%3."/>
-      <w:lvlJc w:val="left"/>
-      <w:pPr>
-        <w:tabs>
-          <w:tab w:val="num" w:pos="2160"/>
-        </w:tabs>
-        <w:ind w:left="2160" w:hanging="360"/>
-      </w:pPr>
-    </w:lvl>
-    <w:lvl w:ilvl="3" w:tentative="1">
-      <w:start w:val="1"/>
-      <w:numFmt w:val="decimal"/>
-      <w:lvlText w:val="%4."/>
-      <w:lvlJc w:val="left"/>
-      <w:pPr>
-        <w:tabs>
-          <w:tab w:val="num" w:pos="2880"/>
-        </w:tabs>
-        <w:ind w:left="2880" w:hanging="360"/>
-      </w:pPr>
-    </w:lvl>
-    <w:lvl w:ilvl="4" w:tentative="1">
-      <w:start w:val="1"/>
-      <w:numFmt w:val="decimal"/>
-      <w:lvlText w:val="%5."/>
-      <w:lvlJc w:val="left"/>
-      <w:pPr>
-        <w:tabs>
-          <w:tab w:val="num" w:pos="3600"/>
-        </w:tabs>
-        <w:ind w:left="3600" w:hanging="360"/>
-      </w:pPr>
-    </w:lvl>
-    <w:lvl w:ilvl="5" w:tentative="1">
-      <w:start w:val="1"/>
-      <w:numFmt w:val="decimal"/>
-      <w:lvlText w:val="%6."/>
-      <w:lvlJc w:val="left"/>
-      <w:pPr>
-        <w:tabs>
-          <w:tab w:val="num" w:pos="4320"/>
-        </w:tabs>
-        <w:ind w:left="4320" w:hanging="360"/>
-      </w:pPr>
-    </w:lvl>
-    <w:lvl w:ilvl="6" w:tentative="1">
-      <w:start w:val="1"/>
-      <w:numFmt w:val="decimal"/>
-      <w:lvlText w:val="%7."/>
-      <w:lvlJc w:val="left"/>
-      <w:pPr>
-        <w:tabs>
-          <w:tab w:val="num" w:pos="5040"/>
-        </w:tabs>
-        <w:ind w:left="5040" w:hanging="360"/>
-      </w:pPr>
-    </w:lvl>
-    <w:lvl w:ilvl="7" w:tentative="1">
-      <w:start w:val="1"/>
-      <w:numFmt w:val="decimal"/>
-      <w:lvlText w:val="%8."/>
-      <w:lvlJc w:val="left"/>
-      <w:pPr>
-        <w:tabs>
-          <w:tab w:val="num" w:pos="5760"/>
-        </w:tabs>
-        <w:ind w:left="5760" w:hanging="360"/>
-      </w:pPr>
-    </w:lvl>
-    <w:lvl w:ilvl="8" w:tentative="1">
-      <w:start w:val="1"/>
-      <w:numFmt w:val="decimal"/>
-      <w:lvlText w:val="%9."/>
-      <w:lvlJc w:val="left"/>
-      <w:pPr>
-        <w:tabs>
-          <w:tab w:val="num" w:pos="6480"/>
-        </w:tabs>
-        <w:ind w:left="6480" w:hanging="360"/>
-      </w:pPr>
-    </w:lvl>
-  </w:abstractNum>
-  <w:abstractNum w:abstractNumId="31">
-    <w:nsid w:val="74274B7D"/>
-    <w:multiLevelType w:val="multilevel"/>
-    <w:tmpl w:val="5DB41948"/>
+    <w:tmpl w:val="8BB05B34"/>
     <w:lvl w:ilvl="0">
       <w:start w:val="1"/>
       <w:numFmt w:val="bullet"/>
@@ -42430,10 +45693,10 @@
       </w:rPr>
     </w:lvl>
   </w:abstractNum>
-  <w:abstractNum w:abstractNumId="32">
-    <w:nsid w:val="77123982"/>
+  <w:abstractNum w:abstractNumId="31">
+    <w:nsid w:val="6E297780"/>
     <w:multiLevelType w:val="multilevel"/>
-    <w:tmpl w:val="BB7AC51E"/>
+    <w:tmpl w:val="7690FE88"/>
     <w:lvl w:ilvl="0">
       <w:start w:val="1"/>
       <w:numFmt w:val="bullet"/>
@@ -42579,10 +45842,123 @@
       </w:rPr>
     </w:lvl>
   </w:abstractNum>
+  <w:abstractNum w:abstractNumId="32">
+    <w:nsid w:val="6ECD03B6"/>
+    <w:multiLevelType w:val="multilevel"/>
+    <w:tmpl w:val="3D32305C"/>
+    <w:lvl w:ilvl="0">
+      <w:start w:val="1"/>
+      <w:numFmt w:val="decimal"/>
+      <w:lvlText w:val="%1."/>
+      <w:lvlJc w:val="left"/>
+      <w:pPr>
+        <w:tabs>
+          <w:tab w:val="num" w:pos="720"/>
+        </w:tabs>
+        <w:ind w:left="720" w:hanging="360"/>
+      </w:pPr>
+    </w:lvl>
+    <w:lvl w:ilvl="1" w:tentative="1">
+      <w:start w:val="1"/>
+      <w:numFmt w:val="decimal"/>
+      <w:lvlText w:val="%2."/>
+      <w:lvlJc w:val="left"/>
+      <w:pPr>
+        <w:tabs>
+          <w:tab w:val="num" w:pos="1440"/>
+        </w:tabs>
+        <w:ind w:left="1440" w:hanging="360"/>
+      </w:pPr>
+    </w:lvl>
+    <w:lvl w:ilvl="2" w:tentative="1">
+      <w:start w:val="1"/>
+      <w:numFmt w:val="decimal"/>
+      <w:lvlText w:val="%3."/>
+      <w:lvlJc w:val="left"/>
+      <w:pPr>
+        <w:tabs>
+          <w:tab w:val="num" w:pos="2160"/>
+        </w:tabs>
+        <w:ind w:left="2160" w:hanging="360"/>
+      </w:pPr>
+    </w:lvl>
+    <w:lvl w:ilvl="3" w:tentative="1">
+      <w:start w:val="1"/>
+      <w:numFmt w:val="decimal"/>
+      <w:lvlText w:val="%4."/>
+      <w:lvlJc w:val="left"/>
+      <w:pPr>
+        <w:tabs>
+          <w:tab w:val="num" w:pos="2880"/>
+        </w:tabs>
+        <w:ind w:left="2880" w:hanging="360"/>
+      </w:pPr>
+    </w:lvl>
+    <w:lvl w:ilvl="4" w:tentative="1">
+      <w:start w:val="1"/>
+      <w:numFmt w:val="decimal"/>
+      <w:lvlText w:val="%5."/>
+      <w:lvlJc w:val="left"/>
+      <w:pPr>
+        <w:tabs>
+          <w:tab w:val="num" w:pos="3600"/>
+        </w:tabs>
+        <w:ind w:left="3600" w:hanging="360"/>
+      </w:pPr>
+    </w:lvl>
+    <w:lvl w:ilvl="5" w:tentative="1">
+      <w:start w:val="1"/>
+      <w:numFmt w:val="decimal"/>
+      <w:lvlText w:val="%6."/>
+      <w:lvlJc w:val="left"/>
+      <w:pPr>
+        <w:tabs>
+          <w:tab w:val="num" w:pos="4320"/>
+        </w:tabs>
+        <w:ind w:left="4320" w:hanging="360"/>
+      </w:pPr>
+    </w:lvl>
+    <w:lvl w:ilvl="6" w:tentative="1">
+      <w:start w:val="1"/>
+      <w:numFmt w:val="decimal"/>
+      <w:lvlText w:val="%7."/>
+      <w:lvlJc w:val="left"/>
+      <w:pPr>
+        <w:tabs>
+          <w:tab w:val="num" w:pos="5040"/>
+        </w:tabs>
+        <w:ind w:left="5040" w:hanging="360"/>
+      </w:pPr>
+    </w:lvl>
+    <w:lvl w:ilvl="7" w:tentative="1">
+      <w:start w:val="1"/>
+      <w:numFmt w:val="decimal"/>
+      <w:lvlText w:val="%8."/>
+      <w:lvlJc w:val="left"/>
+      <w:pPr>
+        <w:tabs>
+          <w:tab w:val="num" w:pos="5760"/>
+        </w:tabs>
+        <w:ind w:left="5760" w:hanging="360"/>
+      </w:pPr>
+    </w:lvl>
+    <w:lvl w:ilvl="8" w:tentative="1">
+      <w:start w:val="1"/>
+      <w:numFmt w:val="decimal"/>
+      <w:lvlText w:val="%9."/>
+      <w:lvlJc w:val="left"/>
+      <w:pPr>
+        <w:tabs>
+          <w:tab w:val="num" w:pos="6480"/>
+        </w:tabs>
+        <w:ind w:left="6480" w:hanging="360"/>
+      </w:pPr>
+    </w:lvl>
+  </w:abstractNum>
   <w:abstractNum w:abstractNumId="33">
-    <w:nsid w:val="794929E6"/>
+    <w:nsid w:val="74274B7D"/>
     <w:multiLevelType w:val="multilevel"/>
-    <w:tmpl w:val="08D41D24"/>
+    <w:tmpl w:val="5DB41948"/>
     <w:lvl w:ilvl="0">
       <w:start w:val="1"/>
       <w:numFmt w:val="bullet"/>
@@ -42729,9 +46105,9 @@
     </w:lvl>
   </w:abstractNum>
   <w:abstractNum w:abstractNumId="34">
-    <w:nsid w:val="7AB008E3"/>
+    <w:nsid w:val="77123982"/>
     <w:multiLevelType w:val="multilevel"/>
-    <w:tmpl w:val="55728BD0"/>
+    <w:tmpl w:val="BB7AC51E"/>
     <w:lvl w:ilvl="0">
       <w:start w:val="1"/>
       <w:numFmt w:val="bullet"/>
@@ -42878,9 +46254,9 @@
     </w:lvl>
   </w:abstractNum>
   <w:abstractNum w:abstractNumId="35">
-    <w:nsid w:val="7AEC0705"/>
+    <w:nsid w:val="794929E6"/>
     <w:multiLevelType w:val="multilevel"/>
-    <w:tmpl w:val="DD185AEE"/>
+    <w:tmpl w:val="08D41D24"/>
     <w:lvl w:ilvl="0">
       <w:start w:val="1"/>
       <w:numFmt w:val="bullet"/>
@@ -43027,122 +46403,9 @@
     </w:lvl>
   </w:abstractNum>
   <w:abstractNum w:abstractNumId="36">
-    <w:nsid w:val="7B507B1D"/>
+    <w:nsid w:val="7AB008E3"/>
     <w:multiLevelType w:val="multilevel"/>
-    <w:tmpl w:val="A2D4262C"/>
-    <w:lvl w:ilvl="0">
-      <w:start w:val="1"/>
-      <w:numFmt w:val="decimal"/>
-      <w:lvlText w:val="%1."/>
-      <w:lvlJc w:val="left"/>
-      <w:pPr>
-        <w:tabs>
-          <w:tab w:val="num" w:pos="720"/>
-        </w:tabs>
-        <w:ind w:left="720" w:hanging="360"/>
-      </w:pPr>
-    </w:lvl>
-    <w:lvl w:ilvl="1" w:tentative="1">
-      <w:start w:val="1"/>
-      <w:numFmt w:val="decimal"/>
-      <w:lvlText w:val="%2."/>
-      <w:lvlJc w:val="left"/>
-      <w:pPr>
-        <w:tabs>
-          <w:tab w:val="num" w:pos="1440"/>
-        </w:tabs>
-        <w:ind w:left="1440" w:hanging="360"/>
-      </w:pPr>
-    </w:lvl>
-    <w:lvl w:ilvl="2" w:tentative="1">
-      <w:start w:val="1"/>
-      <w:numFmt w:val="decimal"/>
-      <w:lvlText w:val="%3."/>
-      <w:lvlJc w:val="left"/>
-      <w:pPr>
-        <w:tabs>
-          <w:tab w:val="num" w:pos="2160"/>
-        </w:tabs>
-        <w:ind w:left="2160" w:hanging="360"/>
-      </w:pPr>
-    </w:lvl>
-    <w:lvl w:ilvl="3" w:tentative="1">
-      <w:start w:val="1"/>
-      <w:numFmt w:val="decimal"/>
-      <w:lvlText w:val="%4."/>
-      <w:lvlJc w:val="left"/>
-      <w:pPr>
-        <w:tabs>
-          <w:tab w:val="num" w:pos="2880"/>
-        </w:tabs>
-        <w:ind w:left="2880" w:hanging="360"/>
-      </w:pPr>
-    </w:lvl>
-    <w:lvl w:ilvl="4" w:tentative="1">
-      <w:start w:val="1"/>
-      <w:numFmt w:val="decimal"/>
-      <w:lvlText w:val="%5."/>
-      <w:lvlJc w:val="left"/>
-      <w:pPr>
-        <w:tabs>
-          <w:tab w:val="num" w:pos="3600"/>
-        </w:tabs>
-        <w:ind w:left="3600" w:hanging="360"/>
-      </w:pPr>
-    </w:lvl>
-    <w:lvl w:ilvl="5" w:tentative="1">
-      <w:start w:val="1"/>
-      <w:numFmt w:val="decimal"/>
-      <w:lvlText w:val="%6."/>
-      <w:lvlJc w:val="left"/>
-      <w:pPr>
-        <w:tabs>
-          <w:tab w:val="num" w:pos="4320"/>
-        </w:tabs>
-        <w:ind w:left="4320" w:hanging="360"/>
-      </w:pPr>
-    </w:lvl>
-    <w:lvl w:ilvl="6" w:tentative="1">
-      <w:start w:val="1"/>
-      <w:numFmt w:val="decimal"/>
-      <w:lvlText w:val="%7."/>
-      <w:lvlJc w:val="left"/>
-      <w:pPr>
-        <w:tabs>
-          <w:tab w:val="num" w:pos="5040"/>
-        </w:tabs>
-        <w:ind w:left="5040" w:hanging="360"/>
-      </w:pPr>
-    </w:lvl>
-    <w:lvl w:ilvl="7" w:tentative="1">
-      <w:start w:val="1"/>
-      <w:numFmt w:val="decimal"/>
-      <w:lvlText w:val="%8."/>
-      <w:lvlJc w:val="left"/>
-      <w:pPr>
-        <w:tabs>
-          <w:tab w:val="num" w:pos="5760"/>
-        </w:tabs>
-        <w:ind w:left="5760" w:hanging="360"/>
-      </w:pPr>
-    </w:lvl>
-    <w:lvl w:ilvl="8" w:tentative="1">
-      <w:start w:val="1"/>
-      <w:numFmt w:val="decimal"/>
-      <w:lvlText w:val="%9."/>
-      <w:lvlJc w:val="left"/>
-      <w:pPr>
-        <w:tabs>
-          <w:tab w:val="num" w:pos="6480"/>
-        </w:tabs>
-        <w:ind w:left="6480" w:hanging="360"/>
-      </w:pPr>
-    </w:lvl>
-  </w:abstractNum>
-  <w:abstractNum w:abstractNumId="37">
-    <w:nsid w:val="7BDF7A23"/>
-    <w:multiLevelType w:val="multilevel"/>
-    <w:tmpl w:val="D4BCD180"/>
+    <w:tmpl w:val="55728BD0"/>
     <w:lvl w:ilvl="0">
       <w:start w:val="1"/>
       <w:numFmt w:val="bullet"/>
@@ -43288,23 +46551,434 @@
       </w:rPr>
     </w:lvl>
   </w:abstractNum>
+  <w:abstractNum w:abstractNumId="37">
+    <w:nsid w:val="7AEC0705"/>
+    <w:multiLevelType w:val="multilevel"/>
+    <w:tmpl w:val="DD185AEE"/>
+    <w:lvl w:ilvl="0">
+      <w:start w:val="1"/>
+      <w:numFmt w:val="bullet"/>
+      <w:lvlText w:val=""/>
+      <w:lvlJc w:val="left"/>
+      <w:pPr>
+        <w:tabs>
+          <w:tab w:val="num" w:pos="720"/>
+        </w:tabs>
+        <w:ind w:left="720" w:hanging="360"/>
+      </w:pPr>
+      <w:rPr>
+        <w:rFonts w:ascii="Symbol" w:hAnsi="Symbol" w:hint="default"/>
+        <w:sz w:val="20"/>
+      </w:rPr>
+    </w:lvl>
+    <w:lvl w:ilvl="1" w:tentative="1">
+      <w:start w:val="1"/>
+      <w:numFmt w:val="bullet"/>
+      <w:lvlText w:val="o"/>
+      <w:lvlJc w:val="left"/>
+      <w:pPr>
+        <w:tabs>
+          <w:tab w:val="num" w:pos="1440"/>
+        </w:tabs>
+        <w:ind w:left="1440" w:hanging="360"/>
+      </w:pPr>
+      <w:rPr>
+        <w:rFonts w:ascii="Courier New" w:hAnsi="Courier New" w:hint="default"/>
+        <w:sz w:val="20"/>
+      </w:rPr>
+    </w:lvl>
+    <w:lvl w:ilvl="2" w:tentative="1">
+      <w:start w:val="1"/>
+      <w:numFmt w:val="bullet"/>
+      <w:lvlText w:val=""/>
+      <w:lvlJc w:val="left"/>
+      <w:pPr>
+        <w:tabs>
+          <w:tab w:val="num" w:pos="2160"/>
+        </w:tabs>
+        <w:ind w:left="2160" w:hanging="360"/>
+      </w:pPr>
+      <w:rPr>
+        <w:rFonts w:ascii="Wingdings" w:hAnsi="Wingdings" w:hint="default"/>
+        <w:sz w:val="20"/>
+      </w:rPr>
+    </w:lvl>
+    <w:lvl w:ilvl="3" w:tentative="1">
+      <w:start w:val="1"/>
+      <w:numFmt w:val="bullet"/>
+      <w:lvlText w:val=""/>
+      <w:lvlJc w:val="left"/>
+      <w:pPr>
+        <w:tabs>
+          <w:tab w:val="num" w:pos="2880"/>
+        </w:tabs>
+        <w:ind w:left="2880" w:hanging="360"/>
+      </w:pPr>
+      <w:rPr>
+        <w:rFonts w:ascii="Wingdings" w:hAnsi="Wingdings" w:hint="default"/>
+        <w:sz w:val="20"/>
+      </w:rPr>
+    </w:lvl>
+    <w:lvl w:ilvl="4" w:tentative="1">
+      <w:start w:val="1"/>
+      <w:numFmt w:val="bullet"/>
+      <w:lvlText w:val=""/>
+      <w:lvlJc w:val="left"/>
+      <w:pPr>
+        <w:tabs>
+          <w:tab w:val="num" w:pos="3600"/>
+        </w:tabs>
+        <w:ind w:left="3600" w:hanging="360"/>
+      </w:pPr>
+      <w:rPr>
+        <w:rFonts w:ascii="Wingdings" w:hAnsi="Wingdings" w:hint="default"/>
+        <w:sz w:val="20"/>
+      </w:rPr>
+    </w:lvl>
+    <w:lvl w:ilvl="5" w:tentative="1">
+      <w:start w:val="1"/>
+      <w:numFmt w:val="bullet"/>
+      <w:lvlText w:val=""/>
+      <w:lvlJc w:val="left"/>
+      <w:pPr>
+        <w:tabs>
+          <w:tab w:val="num" w:pos="4320"/>
+        </w:tabs>
+        <w:ind w:left="4320" w:hanging="360"/>
+      </w:pPr>
+      <w:rPr>
+        <w:rFonts w:ascii="Wingdings" w:hAnsi="Wingdings" w:hint="default"/>
+        <w:sz w:val="20"/>
+      </w:rPr>
+    </w:lvl>
+    <w:lvl w:ilvl="6" w:tentative="1">
+      <w:start w:val="1"/>
+      <w:numFmt w:val="bullet"/>
+      <w:lvlText w:val=""/>
+      <w:lvlJc w:val="left"/>
+      <w:pPr>
+        <w:tabs>
+          <w:tab w:val="num" w:pos="5040"/>
+        </w:tabs>
+        <w:ind w:left="5040" w:hanging="360"/>
+      </w:pPr>
+      <w:rPr>
+        <w:rFonts w:ascii="Wingdings" w:hAnsi="Wingdings" w:hint="default"/>
+        <w:sz w:val="20"/>
+      </w:rPr>
+    </w:lvl>
+    <w:lvl w:ilvl="7" w:tentative="1">
+      <w:start w:val="1"/>
+      <w:numFmt w:val="bullet"/>
+      <w:lvlText w:val=""/>
+      <w:lvlJc w:val="left"/>
+      <w:pPr>
+        <w:tabs>
+          <w:tab w:val="num" w:pos="5760"/>
+        </w:tabs>
+        <w:ind w:left="5760" w:hanging="360"/>
+      </w:pPr>
+      <w:rPr>
+        <w:rFonts w:ascii="Wingdings" w:hAnsi="Wingdings" w:hint="default"/>
+        <w:sz w:val="20"/>
+      </w:rPr>
+    </w:lvl>
+    <w:lvl w:ilvl="8" w:tentative="1">
+      <w:start w:val="1"/>
+      <w:numFmt w:val="bullet"/>
+      <w:lvlText w:val=""/>
+      <w:lvlJc w:val="left"/>
+      <w:pPr>
+        <w:tabs>
+          <w:tab w:val="num" w:pos="6480"/>
+        </w:tabs>
+        <w:ind w:left="6480" w:hanging="360"/>
+      </w:pPr>
+      <w:rPr>
+        <w:rFonts w:ascii="Wingdings" w:hAnsi="Wingdings" w:hint="default"/>
+        <w:sz w:val="20"/>
+      </w:rPr>
+    </w:lvl>
+  </w:abstractNum>
+  <w:abstractNum w:abstractNumId="38">
+    <w:nsid w:val="7B507B1D"/>
+    <w:multiLevelType w:val="multilevel"/>
+    <w:tmpl w:val="A2D4262C"/>
+    <w:lvl w:ilvl="0">
+      <w:start w:val="1"/>
+      <w:numFmt w:val="decimal"/>
+      <w:lvlText w:val="%1."/>
+      <w:lvlJc w:val="left"/>
+      <w:pPr>
+        <w:tabs>
+          <w:tab w:val="num" w:pos="720"/>
+        </w:tabs>
+        <w:ind w:left="720" w:hanging="360"/>
+      </w:pPr>
+    </w:lvl>
+    <w:lvl w:ilvl="1" w:tentative="1">
+      <w:start w:val="1"/>
+      <w:numFmt w:val="decimal"/>
+      <w:lvlText w:val="%2."/>
+      <w:lvlJc w:val="left"/>
+      <w:pPr>
+        <w:tabs>
+          <w:tab w:val="num" w:pos="1440"/>
+        </w:tabs>
+        <w:ind w:left="1440" w:hanging="360"/>
+      </w:pPr>
+    </w:lvl>
+    <w:lvl w:ilvl="2" w:tentative="1">
+      <w:start w:val="1"/>
+      <w:numFmt w:val="decimal"/>
+      <w:lvlText w:val="%3."/>
+      <w:lvlJc w:val="left"/>
+      <w:pPr>
+        <w:tabs>
+          <w:tab w:val="num" w:pos="2160"/>
+        </w:tabs>
+        <w:ind w:left="2160" w:hanging="360"/>
+      </w:pPr>
+    </w:lvl>
+    <w:lvl w:ilvl="3" w:tentative="1">
+      <w:start w:val="1"/>
+      <w:numFmt w:val="decimal"/>
+      <w:lvlText w:val="%4."/>
+      <w:lvlJc w:val="left"/>
+      <w:pPr>
+        <w:tabs>
+          <w:tab w:val="num" w:pos="2880"/>
+        </w:tabs>
+        <w:ind w:left="2880" w:hanging="360"/>
+      </w:pPr>
+    </w:lvl>
+    <w:lvl w:ilvl="4" w:tentative="1">
+      <w:start w:val="1"/>
+      <w:numFmt w:val="decimal"/>
+      <w:lvlText w:val="%5."/>
+      <w:lvlJc w:val="left"/>
+      <w:pPr>
+        <w:tabs>
+          <w:tab w:val="num" w:pos="3600"/>
+        </w:tabs>
+        <w:ind w:left="3600" w:hanging="360"/>
+      </w:pPr>
+    </w:lvl>
+    <w:lvl w:ilvl="5" w:tentative="1">
+      <w:start w:val="1"/>
+      <w:numFmt w:val="decimal"/>
+      <w:lvlText w:val="%6."/>
+      <w:lvlJc w:val="left"/>
+      <w:pPr>
+        <w:tabs>
+          <w:tab w:val="num" w:pos="4320"/>
+        </w:tabs>
+        <w:ind w:left="4320" w:hanging="360"/>
+      </w:pPr>
+    </w:lvl>
+    <w:lvl w:ilvl="6" w:tentative="1">
+      <w:start w:val="1"/>
+      <w:numFmt w:val="decimal"/>
+      <w:lvlText w:val="%7."/>
+      <w:lvlJc w:val="left"/>
+      <w:pPr>
+        <w:tabs>
+          <w:tab w:val="num" w:pos="5040"/>
+        </w:tabs>
+        <w:ind w:left="5040" w:hanging="360"/>
+      </w:pPr>
+    </w:lvl>
+    <w:lvl w:ilvl="7" w:tentative="1">
+      <w:start w:val="1"/>
+      <w:numFmt w:val="decimal"/>
+      <w:lvlText w:val="%8."/>
+      <w:lvlJc w:val="left"/>
+      <w:pPr>
+        <w:tabs>
+          <w:tab w:val="num" w:pos="5760"/>
+        </w:tabs>
+        <w:ind w:left="5760" w:hanging="360"/>
+      </w:pPr>
+    </w:lvl>
+    <w:lvl w:ilvl="8" w:tentative="1">
+      <w:start w:val="1"/>
+      <w:numFmt w:val="decimal"/>
+      <w:lvlText w:val="%9."/>
+      <w:lvlJc w:val="left"/>
+      <w:pPr>
+        <w:tabs>
+          <w:tab w:val="num" w:pos="6480"/>
+        </w:tabs>
+        <w:ind w:left="6480" w:hanging="360"/>
+      </w:pPr>
+    </w:lvl>
+  </w:abstractNum>
+  <w:abstractNum w:abstractNumId="39">
+    <w:nsid w:val="7BDF7A23"/>
+    <w:multiLevelType w:val="multilevel"/>
+    <w:tmpl w:val="D4BCD180"/>
+    <w:lvl w:ilvl="0">
+      <w:start w:val="1"/>
+      <w:numFmt w:val="bullet"/>
+      <w:lvlText w:val=""/>
+      <w:lvlJc w:val="left"/>
+      <w:pPr>
+        <w:tabs>
+          <w:tab w:val="num" w:pos="720"/>
+        </w:tabs>
+        <w:ind w:left="720" w:hanging="360"/>
+      </w:pPr>
+      <w:rPr>
+        <w:rFonts w:ascii="Symbol" w:hAnsi="Symbol" w:hint="default"/>
+        <w:sz w:val="20"/>
+      </w:rPr>
+    </w:lvl>
+    <w:lvl w:ilvl="1" w:tentative="1">
+      <w:start w:val="1"/>
+      <w:numFmt w:val="bullet"/>
+      <w:lvlText w:val="o"/>
+      <w:lvlJc w:val="left"/>
+      <w:pPr>
+        <w:tabs>
+          <w:tab w:val="num" w:pos="1440"/>
+        </w:tabs>
+        <w:ind w:left="1440" w:hanging="360"/>
+      </w:pPr>
+      <w:rPr>
+        <w:rFonts w:ascii="Courier New" w:hAnsi="Courier New" w:hint="default"/>
+        <w:sz w:val="20"/>
+      </w:rPr>
+    </w:lvl>
+    <w:lvl w:ilvl="2" w:tentative="1">
+      <w:start w:val="1"/>
+      <w:numFmt w:val="bullet"/>
+      <w:lvlText w:val=""/>
+      <w:lvlJc w:val="left"/>
+      <w:pPr>
+        <w:tabs>
+          <w:tab w:val="num" w:pos="2160"/>
+        </w:tabs>
+        <w:ind w:left="2160" w:hanging="360"/>
+      </w:pPr>
+      <w:rPr>
+        <w:rFonts w:ascii="Wingdings" w:hAnsi="Wingdings" w:hint="default"/>
+        <w:sz w:val="20"/>
+      </w:rPr>
+    </w:lvl>
+    <w:lvl w:ilvl="3" w:tentative="1">
+      <w:start w:val="1"/>
+      <w:numFmt w:val="bullet"/>
+      <w:lvlText w:val=""/>
+      <w:lvlJc w:val="left"/>
+      <w:pPr>
+        <w:tabs>
+          <w:tab w:val="num" w:pos="2880"/>
+        </w:tabs>
+        <w:ind w:left="2880" w:hanging="360"/>
+      </w:pPr>
+      <w:rPr>
+        <w:rFonts w:ascii="Wingdings" w:hAnsi="Wingdings" w:hint="default"/>
+        <w:sz w:val="20"/>
+      </w:rPr>
+    </w:lvl>
+    <w:lvl w:ilvl="4" w:tentative="1">
+      <w:start w:val="1"/>
+      <w:numFmt w:val="bullet"/>
+      <w:lvlText w:val=""/>
+      <w:lvlJc w:val="left"/>
+      <w:pPr>
+        <w:tabs>
+          <w:tab w:val="num" w:pos="3600"/>
+        </w:tabs>
+        <w:ind w:left="3600" w:hanging="360"/>
+      </w:pPr>
+      <w:rPr>
+        <w:rFonts w:ascii="Wingdings" w:hAnsi="Wingdings" w:hint="default"/>
+        <w:sz w:val="20"/>
+      </w:rPr>
+    </w:lvl>
+    <w:lvl w:ilvl="5" w:tentative="1">
+      <w:start w:val="1"/>
+      <w:numFmt w:val="bullet"/>
+      <w:lvlText w:val=""/>
+      <w:lvlJc w:val="left"/>
+      <w:pPr>
+        <w:tabs>
+          <w:tab w:val="num" w:pos="4320"/>
+        </w:tabs>
+        <w:ind w:left="4320" w:hanging="360"/>
+      </w:pPr>
+      <w:rPr>
+        <w:rFonts w:ascii="Wingdings" w:hAnsi="Wingdings" w:hint="default"/>
+        <w:sz w:val="20"/>
+      </w:rPr>
+    </w:lvl>
+    <w:lvl w:ilvl="6" w:tentative="1">
+      <w:start w:val="1"/>
+      <w:numFmt w:val="bullet"/>
+      <w:lvlText w:val=""/>
+      <w:lvlJc w:val="left"/>
+      <w:pPr>
+        <w:tabs>
+          <w:tab w:val="num" w:pos="5040"/>
+        </w:tabs>
+        <w:ind w:left="5040" w:hanging="360"/>
+      </w:pPr>
+      <w:rPr>
+        <w:rFonts w:ascii="Wingdings" w:hAnsi="Wingdings" w:hint="default"/>
+        <w:sz w:val="20"/>
+      </w:rPr>
+    </w:lvl>
+    <w:lvl w:ilvl="7" w:tentative="1">
+      <w:start w:val="1"/>
+      <w:numFmt w:val="bullet"/>
+      <w:lvlText w:val=""/>
+      <w:lvlJc w:val="left"/>
+      <w:pPr>
+        <w:tabs>
+          <w:tab w:val="num" w:pos="5760"/>
+        </w:tabs>
+        <w:ind w:left="5760" w:hanging="360"/>
+      </w:pPr>
+      <w:rPr>
+        <w:rFonts w:ascii="Wingdings" w:hAnsi="Wingdings" w:hint="default"/>
+        <w:sz w:val="20"/>
+      </w:rPr>
+    </w:lvl>
+    <w:lvl w:ilvl="8" w:tentative="1">
+      <w:start w:val="1"/>
+      <w:numFmt w:val="bullet"/>
+      <w:lvlText w:val=""/>
+      <w:lvlJc w:val="left"/>
+      <w:pPr>
+        <w:tabs>
+          <w:tab w:val="num" w:pos="6480"/>
+        </w:tabs>
+        <w:ind w:left="6480" w:hanging="360"/>
+      </w:pPr>
+      <w:rPr>
+        <w:rFonts w:ascii="Wingdings" w:hAnsi="Wingdings" w:hint="default"/>
+        <w:sz w:val="20"/>
+      </w:rPr>
+    </w:lvl>
+  </w:abstractNum>
   <w:num w:numId="1">
-    <w:abstractNumId w:val="33"/>
+    <w:abstractNumId w:val="35"/>
   </w:num>
   <w:num w:numId="2">
     <w:abstractNumId w:val="6"/>
   </w:num>
   <w:num w:numId="3">
-    <w:abstractNumId w:val="29"/>
+    <w:abstractNumId w:val="31"/>
   </w:num>
   <w:num w:numId="4">
-    <w:abstractNumId w:val="22"/>
+    <w:abstractNumId w:val="23"/>
   </w:num>
   <w:num w:numId="5">
-    <w:abstractNumId w:val="30"/>
+    <w:abstractNumId w:val="32"/>
   </w:num>
   <w:num w:numId="6">
-    <w:abstractNumId w:val="21"/>
+    <w:abstractNumId w:val="22"/>
   </w:num>
   <w:num w:numId="7">
     <w:abstractNumId w:val="5"/>
@@ -43319,19 +46993,19 @@
     <w:abstractNumId w:val="9"/>
   </w:num>
   <w:num w:numId="11">
-    <w:abstractNumId w:val="36"/>
+    <w:abstractNumId w:val="38"/>
   </w:num>
   <w:num w:numId="12">
-    <w:abstractNumId w:val="32"/>
+    <w:abstractNumId w:val="34"/>
   </w:num>
   <w:num w:numId="13">
-    <w:abstractNumId w:val="20"/>
+    <w:abstractNumId w:val="21"/>
   </w:num>
   <w:num w:numId="14">
     <w:abstractNumId w:val="3"/>
   </w:num>
   <w:num w:numId="15">
-    <w:abstractNumId w:val="24"/>
+    <w:abstractNumId w:val="25"/>
   </w:num>
   <w:num w:numId="16">
     <w:abstractNumId w:val="16"/>
@@ -43340,13 +47014,13 @@
     <w:abstractNumId w:val="7"/>
   </w:num>
   <w:num w:numId="18">
-    <w:abstractNumId w:val="25"/>
+    <w:abstractNumId w:val="26"/>
   </w:num>
   <w:num w:numId="19">
-    <w:abstractNumId w:val="27"/>
+    <w:abstractNumId w:val="28"/>
   </w:num>
   <w:num w:numId="20">
-    <w:abstractNumId w:val="34"/>
+    <w:abstractNumId w:val="36"/>
   </w:num>
   <w:num w:numId="21">
     <w:abstractNumId w:val="0"/>
@@ -43355,7 +47029,7 @@
     <w:abstractNumId w:val="10"/>
   </w:num>
   <w:num w:numId="23">
-    <w:abstractNumId w:val="26"/>
+    <w:abstractNumId w:val="27"/>
   </w:num>
   <w:num w:numId="24">
     <w:abstractNumId w:val="13"/>
@@ -43364,43 +47038,49 @@
     <w:abstractNumId w:val="15"/>
   </w:num>
   <w:num w:numId="26">
-    <w:abstractNumId w:val="31"/>
+    <w:abstractNumId w:val="33"/>
   </w:num>
   <w:num w:numId="27">
     <w:abstractNumId w:val="12"/>
   </w:num>
   <w:num w:numId="28">
-    <w:abstractNumId w:val="17"/>
+    <w:abstractNumId w:val="18"/>
   </w:num>
   <w:num w:numId="29">
-    <w:abstractNumId w:val="18"/>
+    <w:abstractNumId w:val="19"/>
   </w:num>
   <w:num w:numId="30">
     <w:abstractNumId w:val="8"/>
   </w:num>
   <w:num w:numId="31">
-    <w:abstractNumId w:val="37"/>
+    <w:abstractNumId w:val="39"/>
   </w:num>
   <w:num w:numId="32">
-    <w:abstractNumId w:val="19"/>
+    <w:abstractNumId w:val="20"/>
   </w:num>
   <w:num w:numId="33">
     <w:abstractNumId w:val="11"/>
   </w:num>
   <w:num w:numId="34">
-    <w:abstractNumId w:val="23"/>
+    <w:abstractNumId w:val="24"/>
   </w:num>
   <w:num w:numId="35">
-    <w:abstractNumId w:val="35"/>
+    <w:abstractNumId w:val="37"/>
   </w:num>
   <w:num w:numId="36">
-    <w:abstractNumId w:val="28"/>
+    <w:abstractNumId w:val="30"/>
   </w:num>
   <w:num w:numId="37">
     <w:abstractNumId w:val="14"/>
   </w:num>
   <w:num w:numId="38">
     <w:abstractNumId w:val="2"/>
+  </w:num>
+  <w:num w:numId="39">
+    <w:abstractNumId w:val="29"/>
+  </w:num>
+  <w:num w:numId="40">
+    <w:abstractNumId w:val="17"/>
   </w:num>
 </w:numbering>
 </file>

</xml_diff>